<commit_message>
Add project scope, methodology and architecture diagram
</commit_message>
<xml_diff>
--- a/CA1-Capstone-sba23349-Proposal.docx
+++ b/CA1-Capstone-sba23349-Proposal.docx
@@ -38,7 +38,7 @@
                     <pic:cNvPicPr preferRelativeResize="0"/>
                   </pic:nvPicPr>
                   <pic:blipFill>
-                    <a:blip r:embed="rId5"/>
+                    <a:blip r:embed="rId8"/>
                     <a:srcRect/>
                     <a:stretch>
                       <a:fillRect/>
@@ -223,7 +223,23 @@
       </w:r>
     </w:p>
     <w:p>
-      <w:r>
+      <w:pPr>
+        <w:rPr>
+          <w:b/>
+          <w:bCs/>
+          <w:color w:val="156082" w:themeColor="accent1"/>
+          <w:sz w:val="48"/>
+          <w:szCs w:val="48"/>
+        </w:rPr>
+      </w:pPr>
+      <w:r>
+        <w:rPr>
+          <w:b/>
+          <w:bCs/>
+          <w:color w:val="156082" w:themeColor="accent1"/>
+          <w:sz w:val="48"/>
+          <w:szCs w:val="48"/>
+        </w:rPr>
         <w:t>Predicting Airline Departure Delays Using Machine Learning: Supporting Airline Operational Planning</w:t>
       </w:r>
     </w:p>
@@ -255,14 +271,27 @@
             <w:hideMark/>
           </w:tcPr>
           <w:p>
-            <w:r>
-              <w:t>Student Full Name</w:t>
-            </w:r>
-            <w:r>
-              <w:t>:</w:t>
+            <w:pPr>
+              <w:rPr>
+                <w:b/>
+                <w:bCs/>
+              </w:rPr>
+            </w:pPr>
+            <w:r>
+              <w:rPr>
+                <w:b/>
+                <w:bCs/>
+                <w:color w:val="156082" w:themeColor="accent1"/>
+              </w:rPr>
+              <w:t>Student Full Name:</w:t>
             </w:r>
             <w:ins w:id="0" w:author="Ana Claudia de Proenca" w:date="2026-10-09T16:51:00Z" w16du:dateUtc="2026-10-09T15:51:00Z">
               <w:r>
+                <w:rPr>
+                  <w:b/>
+                  <w:bCs/>
+                  <w:color w:val="156082" w:themeColor="accent1"/>
+                </w:rPr>
                 <w:t xml:space="preserve"> </w:t>
               </w:r>
             </w:ins>
@@ -279,7 +308,18 @@
             </w:tcBorders>
           </w:tcPr>
           <w:p>
-            <w:r>
+            <w:pPr>
+              <w:rPr>
+                <w:i/>
+                <w:iCs/>
+              </w:rPr>
+            </w:pPr>
+            <w:r>
+              <w:rPr>
+                <w:i/>
+                <w:iCs/>
+                <w:color w:val="156082" w:themeColor="accent1"/>
+              </w:rPr>
               <w:t>Ana Claudia de Proenca</w:t>
             </w:r>
           </w:p>
@@ -298,11 +338,19 @@
             <w:hideMark/>
           </w:tcPr>
           <w:p>
-            <w:r>
-              <w:t>Student Number</w:t>
-            </w:r>
-            <w:r>
-              <w:t>:</w:t>
+            <w:pPr>
+              <w:rPr>
+                <w:b/>
+                <w:bCs/>
+              </w:rPr>
+            </w:pPr>
+            <w:r>
+              <w:rPr>
+                <w:b/>
+                <w:bCs/>
+                <w:color w:val="156082" w:themeColor="accent1"/>
+              </w:rPr>
+              <w:t>Student Number:</w:t>
             </w:r>
           </w:p>
         </w:tc>
@@ -318,6 +366,11 @@
           </w:tcPr>
           <w:p>
             <w:r>
+              <w:rPr>
+                <w:i/>
+                <w:iCs/>
+                <w:color w:val="156082" w:themeColor="accent1"/>
+              </w:rPr>
               <w:t>Sba23349</w:t>
             </w:r>
           </w:p>
@@ -339,11 +392,19 @@
             <w:hideMark/>
           </w:tcPr>
           <w:p>
-            <w:r>
-              <w:t>Module Title</w:t>
-            </w:r>
-            <w:r>
-              <w:t>:</w:t>
+            <w:pPr>
+              <w:rPr>
+                <w:b/>
+                <w:bCs/>
+              </w:rPr>
+            </w:pPr>
+            <w:r>
+              <w:rPr>
+                <w:b/>
+                <w:bCs/>
+                <w:color w:val="156082" w:themeColor="accent1"/>
+              </w:rPr>
+              <w:t>Module Title:</w:t>
             </w:r>
           </w:p>
         </w:tc>
@@ -359,16 +420,23 @@
           </w:tcPr>
           <w:p>
             <w:r>
-              <w:t>Strategic Thinking</w:t>
+              <w:rPr>
+                <w:i/>
+                <w:iCs/>
+                <w:color w:val="156082" w:themeColor="accent1"/>
+              </w:rPr>
+              <w:t xml:space="preserve">Strategic Thinking  - </w:t>
+            </w:r>
+            <w:r>
+              <w:rPr>
+                <w:i/>
+                <w:iCs/>
+                <w:color w:val="156082" w:themeColor="accent1"/>
+              </w:rPr>
+              <w:t>HDSDAB Sep26 PT SB</w:t>
             </w:r>
             <w:r>
               <w:t xml:space="preserve"> </w:t>
-            </w:r>
-            <w:r>
-              <w:t xml:space="preserve"> - </w:t>
-            </w:r>
-            <w:r>
-              <w:t xml:space="preserve">HDSDAB Sep26 PT SB </w:t>
             </w:r>
             <w:r>
               <w:t xml:space="preserve"> </w:t>
@@ -390,10 +458,12 @@
           </w:tcPr>
           <w:p>
             <w:r>
-              <w:t>Assessment Title</w:t>
-            </w:r>
-            <w:r>
-              <w:t>:</w:t>
+              <w:rPr>
+                <w:b/>
+                <w:bCs/>
+                <w:color w:val="156082" w:themeColor="accent1"/>
+              </w:rPr>
+              <w:t>Assessment Title:</w:t>
             </w:r>
           </w:p>
         </w:tc>
@@ -409,6 +479,11 @@
           </w:tcPr>
           <w:p>
             <w:r>
+              <w:rPr>
+                <w:i/>
+                <w:iCs/>
+                <w:color w:val="156082" w:themeColor="accent1"/>
+              </w:rPr>
               <w:t>CA 1 – Capstone Project Proposal</w:t>
             </w:r>
           </w:p>
@@ -428,10 +503,12 @@
           </w:tcPr>
           <w:p>
             <w:r>
-              <w:t>Lecturer/Supervisor</w:t>
-            </w:r>
-            <w:r>
-              <w:t>:</w:t>
+              <w:rPr>
+                <w:b/>
+                <w:bCs/>
+                <w:color w:val="156082" w:themeColor="accent1"/>
+              </w:rPr>
+              <w:t>Lecturer/Supervisor:</w:t>
             </w:r>
           </w:p>
         </w:tc>
@@ -447,6 +524,11 @@
           </w:tcPr>
           <w:p>
             <w:r>
+              <w:rPr>
+                <w:i/>
+                <w:iCs/>
+                <w:color w:val="156082" w:themeColor="accent1"/>
+              </w:rPr>
               <w:t>Taufique Ahmed</w:t>
             </w:r>
           </w:p>
@@ -466,10 +548,12 @@
           </w:tcPr>
           <w:p>
             <w:r>
-              <w:t>Assessment Due Date</w:t>
-            </w:r>
-            <w:r>
-              <w:t>:</w:t>
+              <w:rPr>
+                <w:b/>
+                <w:bCs/>
+                <w:color w:val="156082" w:themeColor="accent1"/>
+              </w:rPr>
+              <w:t>Assessment Due Date:</w:t>
             </w:r>
           </w:p>
         </w:tc>
@@ -485,6 +569,11 @@
           </w:tcPr>
           <w:p>
             <w:r>
+              <w:rPr>
+                <w:i/>
+                <w:iCs/>
+                <w:color w:val="156082" w:themeColor="accent1"/>
+              </w:rPr>
               <w:t>25th October 2026</w:t>
             </w:r>
           </w:p>
@@ -504,10 +593,12 @@
           </w:tcPr>
           <w:p>
             <w:r>
-              <w:t>Date of Submission</w:t>
-            </w:r>
-            <w:r>
-              <w:t>:</w:t>
+              <w:rPr>
+                <w:b/>
+                <w:bCs/>
+                <w:color w:val="156082" w:themeColor="accent1"/>
+              </w:rPr>
+              <w:t>Date of Submission:</w:t>
             </w:r>
           </w:p>
         </w:tc>
@@ -523,6 +614,11 @@
           </w:tcPr>
           <w:p>
             <w:r>
+              <w:rPr>
+                <w:i/>
+                <w:iCs/>
+                <w:color w:val="156082" w:themeColor="accent1"/>
+              </w:rPr>
               <w:t>25th October 2026</w:t>
             </w:r>
           </w:p>
@@ -542,10 +638,12 @@
           </w:tcPr>
           <w:p>
             <w:r>
-              <w:t>GitHub link</w:t>
-            </w:r>
-            <w:r>
-              <w:t>:</w:t>
+              <w:rPr>
+                <w:b/>
+                <w:bCs/>
+                <w:color w:val="156082" w:themeColor="accent1"/>
+              </w:rPr>
+              <w:t>GitHub link:</w:t>
             </w:r>
             <w:r>
               <w:t xml:space="preserve"> </w:t>
@@ -563,38 +661,238 @@
             </w:tcBorders>
           </w:tcPr>
           <w:p>
-            <w:r>
-              <w:fldChar w:fldCharType="begin"/>
-            </w:r>
-            <w:r>
-              <w:instrText>HYPERLINK "</w:instrText>
-            </w:r>
-            <w:r>
-              <w:instrText>https://github.com/sba23349-spec/capstone_sba23349.git</w:instrText>
-            </w:r>
-            <w:r>
-              <w:instrText>"</w:instrText>
-            </w:r>
-            <w:r>
-              <w:fldChar w:fldCharType="separate"/>
-            </w:r>
-            <w:r>
-              <w:rPr>
-                <w:rStyle w:val="Hyperlink"/>
-                <w:i/>
-                <w:iCs/>
-                <w:sz w:val="32"/>
-                <w:szCs w:val="32"/>
-              </w:rPr>
-              <w:t>https://github.com/sba23349-spec/capstone_sba23349.git</w:t>
-            </w:r>
-            <w:r>
-              <w:fldChar w:fldCharType="end"/>
-            </w:r>
+            <w:hyperlink r:id="rId9" w:history="1">
+              <w:r>
+                <w:rPr>
+                  <w:rStyle w:val="Hyperlink"/>
+                  <w:i/>
+                  <w:iCs/>
+                  <w:sz w:val="32"/>
+                  <w:szCs w:val="32"/>
+                </w:rPr>
+                <w:t>https://github.com/sba23349-spec/capstone_sba23349.git</w:t>
+              </w:r>
+            </w:hyperlink>
           </w:p>
         </w:tc>
       </w:tr>
     </w:tbl>
+    <w:p>
+      <w:r>
+        <w:rPr>
+          <w:noProof/>
+        </w:rPr>
+        <mc:AlternateContent>
+          <mc:Choice Requires="wps">
+            <w:drawing>
+              <wp:anchor distT="0" distB="0" distL="114300" distR="114300" simplePos="0" relativeHeight="251664384" behindDoc="0" locked="0" layoutInCell="1" allowOverlap="1" wp14:anchorId="70ED5CD5" wp14:editId="17C143A2">
+                <wp:simplePos x="0" y="0"/>
+                <wp:positionH relativeFrom="margin">
+                  <wp:posOffset>-99374</wp:posOffset>
+                </wp:positionH>
+                <wp:positionV relativeFrom="paragraph">
+                  <wp:posOffset>338757</wp:posOffset>
+                </wp:positionV>
+                <wp:extent cx="6476877" cy="3041218"/>
+                <wp:effectExtent l="12700" t="12700" r="13335" b="6985"/>
+                <wp:wrapNone/>
+                <wp:docPr id="1728545880" name="Casella di testo 1"/>
+                <wp:cNvGraphicFramePr/>
+                <a:graphic xmlns:a="http://schemas.openxmlformats.org/drawingml/2006/main">
+                  <a:graphicData uri="http://schemas.microsoft.com/office/word/2010/wordprocessingShape">
+                    <wps:wsp>
+                      <wps:cNvSpPr txBox="1"/>
+                      <wps:spPr>
+                        <a:xfrm>
+                          <a:off x="0" y="0"/>
+                          <a:ext cx="6476877" cy="3041218"/>
+                        </a:xfrm>
+                        <a:prstGeom prst="rect">
+                          <a:avLst/>
+                        </a:prstGeom>
+                        <a:solidFill>
+                          <a:schemeClr val="lt1"/>
+                        </a:solidFill>
+                        <a:ln w="28575">
+                          <a:solidFill>
+                            <a:schemeClr val="accent1"/>
+                          </a:solidFill>
+                        </a:ln>
+                        <a:effectLst/>
+                      </wps:spPr>
+                      <wps:txbx>
+                        <w:txbxContent>
+                          <w:p>
+                            <w:pPr>
+                              <w:rPr>
+                                <w:b/>
+                                <w:bCs/>
+                                <w:color w:val="156082" w:themeColor="accent1"/>
+                                <w:sz w:val="32"/>
+                                <w:szCs w:val="32"/>
+                              </w:rPr>
+                            </w:pPr>
+                            <w:r>
+                              <w:rPr>
+                                <w:b/>
+                                <w:bCs/>
+                                <w:color w:val="156082" w:themeColor="accent1"/>
+                                <w:sz w:val="32"/>
+                                <w:szCs w:val="32"/>
+                              </w:rPr>
+                              <w:t>Declaration</w:t>
+                            </w:r>
+                          </w:p>
+                          <w:p>
+                            <w:pPr>
+                              <w:rPr>
+                                <w:sz w:val="28"/>
+                                <w:szCs w:val="28"/>
+                              </w:rPr>
+                            </w:pPr>
+                            <w:r>
+                              <w:rPr>
+                                <w:sz w:val="28"/>
+                                <w:szCs w:val="28"/>
+                              </w:rPr>
+                              <w:t xml:space="preserve">By submitting this assessment, I confirm that I have read the CCT policy on academic misconduct and understand the implications of submitting work that is not my own or does not appropriately reference material taken from a third party or other source. </w:t>
+                            </w:r>
+                          </w:p>
+                          <w:p>
+                            <w:pPr>
+                              <w:rPr>
+                                <w:sz w:val="28"/>
+                                <w:szCs w:val="28"/>
+                              </w:rPr>
+                            </w:pPr>
+                            <w:r>
+                              <w:rPr>
+                                <w:sz w:val="28"/>
+                                <w:szCs w:val="28"/>
+                              </w:rPr>
+                              <w:t>I declare it to be my own work and that all material from third parties has been appropriately referenced.</w:t>
+                            </w:r>
+                          </w:p>
+                          <w:p>
+                            <w:pPr>
+                              <w:rPr>
+                                <w:sz w:val="28"/>
+                                <w:szCs w:val="28"/>
+                              </w:rPr>
+                            </w:pPr>
+                            <w:r>
+                              <w:rPr>
+                                <w:sz w:val="28"/>
+                                <w:szCs w:val="28"/>
+                              </w:rPr>
+                              <w:t xml:space="preserve"> I further confirm that this work has not previously been submitted for assessment by myself or someone else in CCT College Dublin or any other higher education institution.</w:t>
+                            </w:r>
+                          </w:p>
+                        </w:txbxContent>
+                      </wps:txbx>
+                      <wps:bodyPr rot="0" spcFirstLastPara="0" vertOverflow="clip" horzOverflow="clip" vert="horz" wrap="square" lIns="91440" tIns="45720" rIns="91440" bIns="45720" numCol="1" spcCol="0" rtlCol="0" fromWordArt="0" anchor="t" anchorCtr="0" forceAA="0" compatLnSpc="1">
+                        <a:prstTxWarp prst="textNoShape">
+                          <a:avLst/>
+                        </a:prstTxWarp>
+                        <a:noAutofit/>
+                      </wps:bodyPr>
+                    </wps:wsp>
+                  </a:graphicData>
+                </a:graphic>
+                <wp14:sizeRelH relativeFrom="margin">
+                  <wp14:pctWidth>0</wp14:pctWidth>
+                </wp14:sizeRelH>
+                <wp14:sizeRelV relativeFrom="margin">
+                  <wp14:pctHeight>0</wp14:pctHeight>
+                </wp14:sizeRelV>
+              </wp:anchor>
+            </w:drawing>
+          </mc:Choice>
+          <mc:Fallback>
+            <w:pict>
+              <v:shapetype w14:anchorId="70ED5CD5" id="_x0000_t202" coordsize="21600,21600" o:spt="202" path="m,l,21600r21600,l21600,xe">
+                <v:stroke joinstyle="miter"/>
+                <v:path gradientshapeok="t" o:connecttype="rect"/>
+              </v:shapetype>
+              <v:shape id="Casella di testo 1" o:spid="_x0000_s1031" type="#_x0000_t202" style="position:absolute;left:0;text-align:left;margin-left:-7.8pt;margin-top:26.65pt;width:510pt;height:239.45pt;z-index:251664384;visibility:visible;mso-wrap-style:square;mso-width-percent:0;mso-height-percent:0;mso-wrap-distance-left:9pt;mso-wrap-distance-top:0;mso-wrap-distance-right:9pt;mso-wrap-distance-bottom:0;mso-position-horizontal:absolute;mso-position-horizontal-relative:margin;mso-position-vertical:absolute;mso-position-vertical-relative:text;mso-width-percent:0;mso-height-percent:0;mso-width-relative:margin;mso-height-relative:margin;v-text-anchor:top" o:gfxdata="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" fillcolor="white [3201]" strokecolor="#156082 [3204]" strokeweight="2.25pt">
+                <v:textbox>
+                  <w:txbxContent>
+                    <w:p>
+                      <w:pPr>
+                        <w:rPr>
+                          <w:b/>
+                          <w:bCs/>
+                          <w:color w:val="156082" w:themeColor="accent1"/>
+                          <w:sz w:val="32"/>
+                          <w:szCs w:val="32"/>
+                        </w:rPr>
+                      </w:pPr>
+                      <w:r>
+                        <w:rPr>
+                          <w:b/>
+                          <w:bCs/>
+                          <w:color w:val="156082" w:themeColor="accent1"/>
+                          <w:sz w:val="32"/>
+                          <w:szCs w:val="32"/>
+                        </w:rPr>
+                        <w:t>Declaration</w:t>
+                      </w:r>
+                    </w:p>
+                    <w:p>
+                      <w:pPr>
+                        <w:rPr>
+                          <w:sz w:val="28"/>
+                          <w:szCs w:val="28"/>
+                        </w:rPr>
+                      </w:pPr>
+                      <w:r>
+                        <w:rPr>
+                          <w:sz w:val="28"/>
+                          <w:szCs w:val="28"/>
+                        </w:rPr>
+                        <w:t xml:space="preserve">By submitting this assessment, I confirm that I have read the CCT policy on academic misconduct and understand the implications of submitting work that is not my own or does not appropriately reference material taken from a third party or other source. </w:t>
+                      </w:r>
+                    </w:p>
+                    <w:p>
+                      <w:pPr>
+                        <w:rPr>
+                          <w:sz w:val="28"/>
+                          <w:szCs w:val="28"/>
+                        </w:rPr>
+                      </w:pPr>
+                      <w:r>
+                        <w:rPr>
+                          <w:sz w:val="28"/>
+                          <w:szCs w:val="28"/>
+                        </w:rPr>
+                        <w:t>I declare it to be my own work and that all material from third parties has been appropriately referenced.</w:t>
+                      </w:r>
+                    </w:p>
+                    <w:p>
+                      <w:pPr>
+                        <w:rPr>
+                          <w:sz w:val="28"/>
+                          <w:szCs w:val="28"/>
+                        </w:rPr>
+                      </w:pPr>
+                      <w:r>
+                        <w:rPr>
+                          <w:sz w:val="28"/>
+                          <w:szCs w:val="28"/>
+                        </w:rPr>
+                        <w:t xml:space="preserve"> I further confirm that this work has not previously been submitted for assessment by myself or someone else in CCT College Dublin or any other higher education institution.</w:t>
+                      </w:r>
+                    </w:p>
+                  </w:txbxContent>
+                </v:textbox>
+                <w10:wrap anchorx="margin"/>
+              </v:shape>
+            </w:pict>
+          </mc:Fallback>
+        </mc:AlternateContent>
+      </w:r>
+    </w:p>
+    <w:p/>
     <w:p>
       <w:r>
         <w:t>Use of AI Tools</w:t>
@@ -634,7 +932,7 @@
         <mc:AlternateContent>
           <mc:Choice Requires="wps">
             <w:drawing>
-              <wp:anchor distT="0" distB="0" distL="114300" distR="114300" simplePos="0" relativeHeight="251662336" behindDoc="0" locked="0" layoutInCell="1" hidden="0" allowOverlap="1" wp14:anchorId="3C694E60" wp14:editId="102322C8">
+              <wp:anchor distT="0" distB="0" distL="114300" distR="114300" simplePos="0" relativeHeight="251662336" behindDoc="0" locked="0" layoutInCell="1" hidden="0" allowOverlap="1" wp14:anchorId="3C694E60" wp14:editId="063A81FB">
                 <wp:simplePos x="0" y="0"/>
                 <wp:positionH relativeFrom="margin">
                   <wp:posOffset>6985</wp:posOffset>
@@ -707,7 +1005,7 @@
           </mc:Choice>
           <mc:Fallback>
             <w:pict>
-              <v:rect w14:anchorId="3C694E60" id="Rectangle 1728545882" o:spid="_x0000_s1031" style="position:absolute;left:0;text-align:left;margin-left:.55pt;margin-top:415.45pt;width:456.75pt;height:226.5pt;z-index:251662336;visibility:visible;mso-wrap-style:square;mso-wrap-distance-left:9pt;mso-wrap-distance-top:0;mso-wrap-distance-right:9pt;mso-wrap-distance-bottom:0;mso-position-horizontal:absolute;mso-position-horizontal-relative:margin;mso-position-vertical:absolute;mso-position-vertical-relative:text;v-text-anchor:top" o:gfxdata="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" fillcolor="white [3201]" strokecolor="#156082 [3204]" strokeweight="2.25pt">
+              <v:rect w14:anchorId="3C694E60" id="Rectangle 1728545882" o:spid="_x0000_s1032" style="position:absolute;left:0;text-align:left;margin-left:.55pt;margin-top:415.45pt;width:456.75pt;height:226.5pt;z-index:251662336;visibility:visible;mso-wrap-style:square;mso-wrap-distance-left:9pt;mso-wrap-distance-top:0;mso-wrap-distance-right:9pt;mso-wrap-distance-bottom:0;mso-position-horizontal:absolute;mso-position-horizontal-relative:margin;mso-position-vertical:absolute;mso-position-vertical-relative:text;v-text-anchor:top" o:gfxdata="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" fillcolor="white [3201]" strokecolor="#156082 [3204]" strokeweight="2.25pt">
                 <v:stroke startarrowwidth="narrow" startarrowlength="short" endarrowwidth="narrow" endarrowlength="short" joinstyle="round"/>
                 <v:textbox inset="2.53958mm,1.2694mm,2.53958mm,1.2694mm">
                   <w:txbxContent>
@@ -740,17 +1038,27 @@
         </mc:AlternateContent>
       </w:r>
       <w:r>
-        <w:t xml:space="preserve">I have not used any AI tools or technologies in the preparation of this </w:t>
-      </w:r>
-      <w:proofErr w:type="spellStart"/>
-      <w:r>
-        <w:t>assessmen</w:t>
-      </w:r>
-      <w:proofErr w:type="spellEnd"/>
+        <w:t>I have not used any AI tools or technologies in the preparation of this assessmen</w:t>
+      </w:r>
+      <w:r>
+        <w:t>t</w:t>
+      </w:r>
     </w:p>
     <w:p/>
     <w:p>
-      <w:r>
+      <w:pPr>
+        <w:rPr>
+          <w:color w:val="156082" w:themeColor="accent1"/>
+          <w:sz w:val="32"/>
+          <w:szCs w:val="32"/>
+        </w:rPr>
+      </w:pPr>
+      <w:r>
+        <w:rPr>
+          <w:color w:val="156082" w:themeColor="accent1"/>
+          <w:sz w:val="32"/>
+          <w:szCs w:val="32"/>
+        </w:rPr>
         <w:t>Contents</w:t>
       </w:r>
     </w:p>
@@ -783,12 +1091,11 @@
           <w:r>
             <w:fldChar w:fldCharType="separate"/>
           </w:r>
-          <w:hyperlink w:anchor="_Toc242474426" w:history="1">
+          <w:hyperlink w:anchor="_Toc242640897" w:history="1">
             <w:r>
               <w:rPr>
                 <w:rStyle w:val="Hyperlink"/>
                 <w:noProof/>
-                <w:color w:val="156082" w:themeColor="accent1"/>
               </w:rPr>
               <w:t>Introduction</w:t>
             </w:r>
@@ -811,7 +1118,7 @@
                 <w:noProof/>
                 <w:webHidden/>
               </w:rPr>
-              <w:instrText xml:space="preserve"> PAGEREF _Toc242474426 \h </w:instrText>
+              <w:instrText xml:space="preserve"> PAGEREF _Toc242640897 \h </w:instrText>
             </w:r>
             <w:r>
               <w:rPr>
@@ -853,12 +1160,11 @@
               <w14:ligatures w14:val="standardContextual"/>
             </w:rPr>
           </w:pPr>
-          <w:hyperlink w:anchor="_Toc242474427" w:history="1">
+          <w:hyperlink w:anchor="_Toc242640898" w:history="1">
             <w:r>
               <w:rPr>
                 <w:rStyle w:val="Hyperlink"/>
                 <w:noProof/>
-                <w:color w:val="156082" w:themeColor="accent1"/>
               </w:rPr>
               <w:t>Problem Definition</w:t>
             </w:r>
@@ -881,7 +1187,7 @@
                 <w:noProof/>
                 <w:webHidden/>
               </w:rPr>
-              <w:instrText xml:space="preserve"> PAGEREF _Toc242474427 \h </w:instrText>
+              <w:instrText xml:space="preserve"> PAGEREF _Toc242640898 \h </w:instrText>
             </w:r>
             <w:r>
               <w:rPr>
@@ -923,12 +1229,11 @@
               <w14:ligatures w14:val="standardContextual"/>
             </w:rPr>
           </w:pPr>
-          <w:hyperlink w:anchor="_Toc242474428" w:history="1">
+          <w:hyperlink w:anchor="_Toc242640899" w:history="1">
             <w:r>
               <w:rPr>
                 <w:rStyle w:val="Hyperlink"/>
                 <w:noProof/>
-                <w:color w:val="156082" w:themeColor="accent1"/>
               </w:rPr>
               <w:t>Aim and Objectives</w:t>
             </w:r>
@@ -951,7 +1256,7 @@
                 <w:noProof/>
                 <w:webHidden/>
               </w:rPr>
-              <w:instrText xml:space="preserve"> PAGEREF _Toc242474428 \h </w:instrText>
+              <w:instrText xml:space="preserve"> PAGEREF _Toc242640899 \h </w:instrText>
             </w:r>
             <w:r>
               <w:rPr>
@@ -971,7 +1276,155 @@
                 <w:noProof/>
                 <w:webHidden/>
               </w:rPr>
-              <w:t>1</w:t>
+              <w:t>2</w:t>
+            </w:r>
+            <w:r>
+              <w:rPr>
+                <w:noProof/>
+                <w:webHidden/>
+              </w:rPr>
+              <w:fldChar w:fldCharType="end"/>
+            </w:r>
+          </w:hyperlink>
+        </w:p>
+        <w:p>
+          <w:pPr>
+            <w:pStyle w:val="TOC3"/>
+            <w:tabs>
+              <w:tab w:val="right" w:leader="dot" w:pos="9016"/>
+            </w:tabs>
+            <w:rPr>
+              <w:rFonts w:asciiTheme="minorHAnsi" w:eastAsiaTheme="minorEastAsia" w:hAnsiTheme="minorHAnsi" w:cstheme="minorBidi"/>
+              <w:noProof/>
+              <w:kern w:val="2"/>
+              <w:lang w:val="en-GB" w:eastAsia="en-GB"/>
+              <w14:ligatures w14:val="standardContextual"/>
+            </w:rPr>
+          </w:pPr>
+          <w:hyperlink w:anchor="_Toc242640900" w:history="1">
+            <w:r>
+              <w:rPr>
+                <w:rStyle w:val="Hyperlink"/>
+                <w:b/>
+                <w:bCs/>
+                <w:noProof/>
+              </w:rPr>
+              <w:t>Aim</w:t>
+            </w:r>
+            <w:r>
+              <w:rPr>
+                <w:noProof/>
+                <w:webHidden/>
+              </w:rPr>
+              <w:tab/>
+            </w:r>
+            <w:r>
+              <w:rPr>
+                <w:noProof/>
+                <w:webHidden/>
+              </w:rPr>
+              <w:fldChar w:fldCharType="begin"/>
+            </w:r>
+            <w:r>
+              <w:rPr>
+                <w:noProof/>
+                <w:webHidden/>
+              </w:rPr>
+              <w:instrText xml:space="preserve"> PAGEREF _Toc242640900 \h </w:instrText>
+            </w:r>
+            <w:r>
+              <w:rPr>
+                <w:noProof/>
+                <w:webHidden/>
+              </w:rPr>
+            </w:r>
+            <w:r>
+              <w:rPr>
+                <w:noProof/>
+                <w:webHidden/>
+              </w:rPr>
+              <w:fldChar w:fldCharType="separate"/>
+            </w:r>
+            <w:r>
+              <w:rPr>
+                <w:noProof/>
+                <w:webHidden/>
+              </w:rPr>
+              <w:t>2</w:t>
+            </w:r>
+            <w:r>
+              <w:rPr>
+                <w:noProof/>
+                <w:webHidden/>
+              </w:rPr>
+              <w:fldChar w:fldCharType="end"/>
+            </w:r>
+          </w:hyperlink>
+        </w:p>
+        <w:p>
+          <w:pPr>
+            <w:pStyle w:val="TOC3"/>
+            <w:tabs>
+              <w:tab w:val="right" w:leader="dot" w:pos="9016"/>
+            </w:tabs>
+            <w:rPr>
+              <w:rFonts w:asciiTheme="minorHAnsi" w:eastAsiaTheme="minorEastAsia" w:hAnsiTheme="minorHAnsi" w:cstheme="minorBidi"/>
+              <w:noProof/>
+              <w:kern w:val="2"/>
+              <w:lang w:val="en-GB" w:eastAsia="en-GB"/>
+              <w14:ligatures w14:val="standardContextual"/>
+            </w:rPr>
+          </w:pPr>
+          <w:hyperlink w:anchor="_Toc242640901" w:history="1">
+            <w:r>
+              <w:rPr>
+                <w:rStyle w:val="Hyperlink"/>
+                <w:b/>
+                <w:bCs/>
+                <w:noProof/>
+              </w:rPr>
+              <w:t>Objectives</w:t>
+            </w:r>
+            <w:r>
+              <w:rPr>
+                <w:noProof/>
+                <w:webHidden/>
+              </w:rPr>
+              <w:tab/>
+            </w:r>
+            <w:r>
+              <w:rPr>
+                <w:noProof/>
+                <w:webHidden/>
+              </w:rPr>
+              <w:fldChar w:fldCharType="begin"/>
+            </w:r>
+            <w:r>
+              <w:rPr>
+                <w:noProof/>
+                <w:webHidden/>
+              </w:rPr>
+              <w:instrText xml:space="preserve"> PAGEREF _Toc242640901 \h </w:instrText>
+            </w:r>
+            <w:r>
+              <w:rPr>
+                <w:noProof/>
+                <w:webHidden/>
+              </w:rPr>
+            </w:r>
+            <w:r>
+              <w:rPr>
+                <w:noProof/>
+                <w:webHidden/>
+              </w:rPr>
+              <w:fldChar w:fldCharType="separate"/>
+            </w:r>
+            <w:r>
+              <w:rPr>
+                <w:noProof/>
+                <w:webHidden/>
+              </w:rPr>
+              <w:t>2</w:t>
             </w:r>
             <w:r>
               <w:rPr>
@@ -993,14 +1446,13 @@
               <w14:ligatures w14:val="standardContextual"/>
             </w:rPr>
           </w:pPr>
-          <w:hyperlink w:anchor="_Toc242474429" w:history="1">
+          <w:hyperlink w:anchor="_Toc242640902" w:history="1">
             <w:r>
               <w:rPr>
                 <w:rStyle w:val="Hyperlink"/>
                 <w:noProof/>
-                <w:color w:val="156082" w:themeColor="accent1"/>
-              </w:rPr>
-              <w:t>References</w:t>
+              </w:rPr>
+              <w:t>Scope</w:t>
             </w:r>
             <w:r>
               <w:rPr>
@@ -1021,7 +1473,7 @@
                 <w:noProof/>
                 <w:webHidden/>
               </w:rPr>
-              <w:instrText xml:space="preserve"> PAGEREF _Toc242474429 \h </w:instrText>
+              <w:instrText xml:space="preserve"> PAGEREF _Toc242640902 \h </w:instrText>
             </w:r>
             <w:r>
               <w:rPr>
@@ -1063,12 +1515,223 @@
               <w14:ligatures w14:val="standardContextual"/>
             </w:rPr>
           </w:pPr>
-          <w:hyperlink w:anchor="_Toc242474430" w:history="1">
+          <w:hyperlink w:anchor="_Toc242640903" w:history="1">
             <w:r>
               <w:rPr>
                 <w:rStyle w:val="Hyperlink"/>
                 <w:noProof/>
-                <w:color w:val="156082" w:themeColor="accent1"/>
+              </w:rPr>
+              <w:t>Methodology</w:t>
+            </w:r>
+            <w:r>
+              <w:rPr>
+                <w:noProof/>
+                <w:webHidden/>
+              </w:rPr>
+              <w:tab/>
+            </w:r>
+            <w:r>
+              <w:rPr>
+                <w:noProof/>
+                <w:webHidden/>
+              </w:rPr>
+              <w:fldChar w:fldCharType="begin"/>
+            </w:r>
+            <w:r>
+              <w:rPr>
+                <w:noProof/>
+                <w:webHidden/>
+              </w:rPr>
+              <w:instrText xml:space="preserve"> PAGEREF _Toc242640903 \h </w:instrText>
+            </w:r>
+            <w:r>
+              <w:rPr>
+                <w:noProof/>
+                <w:webHidden/>
+              </w:rPr>
+            </w:r>
+            <w:r>
+              <w:rPr>
+                <w:noProof/>
+                <w:webHidden/>
+              </w:rPr>
+              <w:fldChar w:fldCharType="separate"/>
+            </w:r>
+            <w:r>
+              <w:rPr>
+                <w:noProof/>
+                <w:webHidden/>
+              </w:rPr>
+              <w:t>3</w:t>
+            </w:r>
+            <w:r>
+              <w:rPr>
+                <w:noProof/>
+                <w:webHidden/>
+              </w:rPr>
+              <w:fldChar w:fldCharType="end"/>
+            </w:r>
+          </w:hyperlink>
+        </w:p>
+        <w:p>
+          <w:pPr>
+            <w:pStyle w:val="TOC3"/>
+            <w:tabs>
+              <w:tab w:val="right" w:leader="dot" w:pos="9016"/>
+            </w:tabs>
+            <w:rPr>
+              <w:rFonts w:asciiTheme="minorHAnsi" w:eastAsiaTheme="minorEastAsia" w:hAnsiTheme="minorHAnsi" w:cstheme="minorBidi"/>
+              <w:noProof/>
+              <w:kern w:val="2"/>
+              <w:lang w:val="en-GB" w:eastAsia="en-GB"/>
+              <w14:ligatures w14:val="standardContextual"/>
+            </w:rPr>
+          </w:pPr>
+          <w:hyperlink w:anchor="_Toc242640904" w:history="1">
+            <w:r>
+              <w:rPr>
+                <w:rStyle w:val="Hyperlink"/>
+                <w:b/>
+                <w:bCs/>
+                <w:noProof/>
+              </w:rPr>
+              <w:t>High-Level Architecture Diagram</w:t>
+            </w:r>
+            <w:r>
+              <w:rPr>
+                <w:noProof/>
+                <w:webHidden/>
+              </w:rPr>
+              <w:tab/>
+            </w:r>
+            <w:r>
+              <w:rPr>
+                <w:noProof/>
+                <w:webHidden/>
+              </w:rPr>
+              <w:fldChar w:fldCharType="begin"/>
+            </w:r>
+            <w:r>
+              <w:rPr>
+                <w:noProof/>
+                <w:webHidden/>
+              </w:rPr>
+              <w:instrText xml:space="preserve"> PAGEREF _Toc242640904 \h </w:instrText>
+            </w:r>
+            <w:r>
+              <w:rPr>
+                <w:noProof/>
+                <w:webHidden/>
+              </w:rPr>
+            </w:r>
+            <w:r>
+              <w:rPr>
+                <w:noProof/>
+                <w:webHidden/>
+              </w:rPr>
+              <w:fldChar w:fldCharType="separate"/>
+            </w:r>
+            <w:r>
+              <w:rPr>
+                <w:noProof/>
+                <w:webHidden/>
+              </w:rPr>
+              <w:t>4</w:t>
+            </w:r>
+            <w:r>
+              <w:rPr>
+                <w:noProof/>
+                <w:webHidden/>
+              </w:rPr>
+              <w:fldChar w:fldCharType="end"/>
+            </w:r>
+          </w:hyperlink>
+        </w:p>
+        <w:p>
+          <w:pPr>
+            <w:pStyle w:val="TOC1"/>
+            <w:rPr>
+              <w:rFonts w:asciiTheme="minorHAnsi" w:eastAsiaTheme="minorEastAsia" w:hAnsiTheme="minorHAnsi" w:cstheme="minorBidi"/>
+              <w:noProof/>
+              <w:kern w:val="2"/>
+              <w:lang w:val="en-GB" w:eastAsia="en-GB"/>
+              <w14:ligatures w14:val="standardContextual"/>
+            </w:rPr>
+          </w:pPr>
+          <w:hyperlink w:anchor="_Toc242640905" w:history="1">
+            <w:r>
+              <w:rPr>
+                <w:rStyle w:val="Hyperlink"/>
+                <w:noProof/>
+              </w:rPr>
+              <w:t>References</w:t>
+            </w:r>
+            <w:r>
+              <w:rPr>
+                <w:noProof/>
+                <w:webHidden/>
+              </w:rPr>
+              <w:tab/>
+            </w:r>
+            <w:r>
+              <w:rPr>
+                <w:noProof/>
+                <w:webHidden/>
+              </w:rPr>
+              <w:fldChar w:fldCharType="begin"/>
+            </w:r>
+            <w:r>
+              <w:rPr>
+                <w:noProof/>
+                <w:webHidden/>
+              </w:rPr>
+              <w:instrText xml:space="preserve"> PAGEREF _Toc242640905 \h </w:instrText>
+            </w:r>
+            <w:r>
+              <w:rPr>
+                <w:noProof/>
+                <w:webHidden/>
+              </w:rPr>
+            </w:r>
+            <w:r>
+              <w:rPr>
+                <w:noProof/>
+                <w:webHidden/>
+              </w:rPr>
+              <w:fldChar w:fldCharType="separate"/>
+            </w:r>
+            <w:r>
+              <w:rPr>
+                <w:noProof/>
+                <w:webHidden/>
+              </w:rPr>
+              <w:t>6</w:t>
+            </w:r>
+            <w:r>
+              <w:rPr>
+                <w:noProof/>
+                <w:webHidden/>
+              </w:rPr>
+              <w:fldChar w:fldCharType="end"/>
+            </w:r>
+          </w:hyperlink>
+        </w:p>
+        <w:p>
+          <w:pPr>
+            <w:pStyle w:val="TOC1"/>
+            <w:rPr>
+              <w:rFonts w:asciiTheme="minorHAnsi" w:eastAsiaTheme="minorEastAsia" w:hAnsiTheme="minorHAnsi" w:cstheme="minorBidi"/>
+              <w:noProof/>
+              <w:kern w:val="2"/>
+              <w:lang w:val="en-GB" w:eastAsia="en-GB"/>
+              <w14:ligatures w14:val="standardContextual"/>
+            </w:rPr>
+          </w:pPr>
+          <w:hyperlink w:anchor="_Toc242640906" w:history="1">
+            <w:r>
+              <w:rPr>
+                <w:rStyle w:val="Hyperlink"/>
+                <w:noProof/>
               </w:rPr>
               <w:t>Appendix</w:t>
             </w:r>
@@ -1091,7 +1754,7 @@
                 <w:noProof/>
                 <w:webHidden/>
               </w:rPr>
-              <w:instrText xml:space="preserve"> PAGEREF _Toc242474430 \h </w:instrText>
+              <w:instrText xml:space="preserve"> PAGEREF _Toc242640906 \h </w:instrText>
             </w:r>
             <w:r>
               <w:rPr>
@@ -1111,7 +1774,7 @@
                 <w:noProof/>
                 <w:webHidden/>
               </w:rPr>
-              <w:t>4</w:t>
+              <w:t>7</w:t>
             </w:r>
             <w:r>
               <w:rPr>
@@ -1135,7 +1798,7 @@
     <w:p>
       <w:pPr>
         <w:sectPr>
-          <w:footerReference w:type="default" r:id="rId6"/>
+          <w:footerReference w:type="default" r:id="rId10"/>
           <w:pgSz w:w="11906" w:h="16838"/>
           <w:pgMar w:top="1440" w:right="1440" w:bottom="1440" w:left="1440" w:header="708" w:footer="708" w:gutter="0"/>
           <w:cols w:space="720"/>
@@ -1146,7 +1809,7 @@
       <w:pPr>
         <w:pStyle w:val="Heading1"/>
       </w:pPr>
-      <w:bookmarkStart w:id="1" w:name="_Toc242474426"/>
+      <w:bookmarkStart w:id="1" w:name="_Toc242640897"/>
       <w:r>
         <w:lastRenderedPageBreak/>
         <w:t>Introduction</w:t>
@@ -1166,13 +1829,7 @@
         <w:rPr>
           <w:color w:val="000000"/>
         </w:rPr>
-        <w:t>(Bts.gov, 2018)</w:t>
-      </w:r>
-      <w:r>
-        <w:rPr>
-          <w:color w:val="000000"/>
-        </w:rPr>
-        <w:t xml:space="preserve"> </w:t>
+        <w:t xml:space="preserve">(Bts.gov, 2018) </w:t>
       </w:r>
       <w:r>
         <w:t>and contains over 1.2 million flight records. Using this dataset, the project will investigate whether machine learning models can predict departure delays of 15 minutes or more based on information available before departure.</w:t>
@@ -1188,7 +1845,7 @@
       <w:pPr>
         <w:pStyle w:val="Heading1"/>
       </w:pPr>
-      <w:bookmarkStart w:id="2" w:name="_Toc242474427"/>
+      <w:bookmarkStart w:id="2" w:name="_Toc242640898"/>
       <w:r>
         <w:t>Problem Definition</w:t>
       </w:r>
@@ -1237,7 +1894,7 @@
       <w:pPr>
         <w:pStyle w:val="Heading1"/>
       </w:pPr>
-      <w:bookmarkStart w:id="3" w:name="_Toc242474428"/>
+      <w:bookmarkStart w:id="3" w:name="_Toc242640899"/>
       <w:r>
         <w:t>Aim and Objectives</w:t>
       </w:r>
@@ -1245,12 +1902,13 @@
     </w:p>
     <w:p>
       <w:pPr>
+        <w:pStyle w:val="Heading3"/>
         <w:rPr>
           <w:rFonts w:ascii="Times New Roman" w:eastAsia="Times New Roman" w:hAnsi="Times New Roman" w:cs="Times New Roman"/>
-          <w:color w:val="156082" w:themeColor="accent1"/>
           <w:lang w:val="en-GB" w:eastAsia="en-GB"/>
         </w:rPr>
       </w:pPr>
+      <w:bookmarkStart w:id="4" w:name="_Toc242640900"/>
       <w:r>
         <w:rPr>
           <w:rStyle w:val="Strong"/>
@@ -1258,6 +1916,7 @@
         </w:rPr>
         <w:t>Aim</w:t>
       </w:r>
+      <w:bookmarkEnd w:id="4"/>
     </w:p>
     <w:p>
       <w:r>
@@ -1266,10 +1925,9 @@
     </w:p>
     <w:p>
       <w:pPr>
-        <w:rPr>
-          <w:color w:val="156082" w:themeColor="accent1"/>
-        </w:rPr>
-      </w:pPr>
+        <w:pStyle w:val="Heading3"/>
+      </w:pPr>
+      <w:bookmarkStart w:id="5" w:name="_Toc242640901"/>
       <w:r>
         <w:rPr>
           <w:rStyle w:val="Strong"/>
@@ -1277,28 +1935,68 @@
         </w:rPr>
         <w:t>Objectives</w:t>
       </w:r>
-    </w:p>
-    <w:p>
+      <w:bookmarkEnd w:id="5"/>
+    </w:p>
+    <w:p>
+      <w:pPr>
+        <w:pStyle w:val="ListParagraph"/>
+        <w:numPr>
+          <w:ilvl w:val="0"/>
+          <w:numId w:val="10"/>
+        </w:numPr>
+      </w:pPr>
       <w:r>
         <w:t>Explore the flight data to see if delays are more common at certain airports, with particular airlines, or at different times of the day and year.</w:t>
       </w:r>
     </w:p>
     <w:p>
+      <w:pPr>
+        <w:pStyle w:val="ListParagraph"/>
+        <w:numPr>
+          <w:ilvl w:val="0"/>
+          <w:numId w:val="10"/>
+        </w:numPr>
+      </w:pPr>
       <w:r>
         <w:t>Put together the 12 monthly CSV files, check for missing or incorrect information and prepare the data for analysis.</w:t>
       </w:r>
     </w:p>
     <w:p>
+      <w:pPr>
+        <w:pStyle w:val="ListParagraph"/>
+        <w:numPr>
+          <w:ilvl w:val="0"/>
+          <w:numId w:val="10"/>
+        </w:numPr>
+      </w:pPr>
       <w:r>
         <w:t>Train different machine learning models, such as Logistic Regression, Decision Tree and Random Forest, to predict flight delays.</w:t>
       </w:r>
     </w:p>
     <w:p>
-      <w:r>
-        <w:t>Test the models using later months of 2024 and compare their results with a basic prediction method to see if machine learning performs better.</w:t>
-      </w:r>
-    </w:p>
-    <w:p>
+      <w:pPr>
+        <w:pStyle w:val="ListParagraph"/>
+        <w:numPr>
+          <w:ilvl w:val="0"/>
+          <w:numId w:val="10"/>
+        </w:numPr>
+        <w:rPr>
+          <w:rFonts w:ascii="Times New Roman" w:eastAsia="Times New Roman" w:hAnsi="Times New Roman" w:cs="Times New Roman"/>
+          <w:lang w:val="en-GB" w:eastAsia="en-GB"/>
+        </w:rPr>
+      </w:pPr>
+      <w:r>
+        <w:t>Test and improve the models by adjusting their hyperparameters, and compare their results with a basic prediction method to see if machine learning performs better.</w:t>
+      </w:r>
+    </w:p>
+    <w:p>
+      <w:pPr>
+        <w:pStyle w:val="ListParagraph"/>
+        <w:numPr>
+          <w:ilvl w:val="0"/>
+          <w:numId w:val="10"/>
+        </w:numPr>
+      </w:pPr>
       <w:r>
         <w:t>Look at which flight details are most useful for making predictions and explain how this information might help airlines prepare for possible delays.</w:t>
       </w:r>
@@ -1308,12 +2006,332 @@
       <w:pPr>
         <w:pStyle w:val="Heading1"/>
       </w:pPr>
-      <w:bookmarkStart w:id="4" w:name="_Toc242474429"/>
+      <w:bookmarkStart w:id="6" w:name="_Toc242631585"/>
+      <w:bookmarkStart w:id="7" w:name="_Toc242640902"/>
       <w:r>
         <w:lastRenderedPageBreak/>
+        <w:t>Scope</w:t>
+      </w:r>
+      <w:bookmarkEnd w:id="6"/>
+      <w:bookmarkEnd w:id="7"/>
+    </w:p>
+    <w:p>
+      <w:r>
+        <w:t xml:space="preserve">For this project, we will use flight data from California airports between January and December 2024. We will look at flights departing from California, even if their destination is in another state. The data comes from the US Bureau of Transportation Statistics </w:t>
+      </w:r>
+      <w:r>
+        <w:rPr>
+          <w:color w:val="000000"/>
+        </w:rPr>
+        <w:t>(Bts.gov, 2018)</w:t>
+      </w:r>
+      <w:r>
+        <w:t>.</w:t>
+      </w:r>
+    </w:p>
+    <w:p>
+      <w:pPr>
+        <w:rPr>
+          <w:rFonts w:ascii="Times New Roman" w:eastAsia="Times New Roman" w:hAnsi="Times New Roman" w:cs="Times New Roman"/>
+          <w:lang w:val="en-GB" w:eastAsia="en-GB"/>
+        </w:rPr>
+      </w:pPr>
+      <w:r>
+        <w:t>The main focus of this project is to predict whether a flight will depart 15 minutes or more after its scheduled time. The prediction will be based on information available before departure, such as the airline, airport, date and scheduled departure time.</w:t>
+      </w:r>
+    </w:p>
+    <w:p>
+      <w:r>
+        <w:t>We will not include cancelled flights when training the models, as these flights do not have an actual departure time. However, we will still check how many flights were cancelled during the year. We will also avoid using information that would only be known after the flight has departed, because the idea is to make predictions before departure.</w:t>
+      </w:r>
+    </w:p>
+    <w:p>
+      <w:r>
+        <w:t>There are also some things that this project will not cover. We will not try to predict exactly how many minutes a flight will be delayed or whether it will arrive late. We will not use live weather data or real-time flight information. Our results will only represent the flights included in the California dataset from 2024.</w:t>
+      </w:r>
+    </w:p>
+    <w:p/>
+    <w:p>
+      <w:pPr>
+        <w:pStyle w:val="Heading1"/>
+        <w:rPr>
+          <w:rFonts w:ascii="Times New Roman" w:eastAsia="Times New Roman" w:hAnsi="Times New Roman" w:cs="Times New Roman"/>
+          <w:lang w:val="en-GB" w:eastAsia="en-GB"/>
+        </w:rPr>
+      </w:pPr>
+      <w:bookmarkStart w:id="8" w:name="_Toc242640903"/>
+      <w:r>
+        <w:t>Methodology</w:t>
+      </w:r>
+      <w:bookmarkEnd w:id="8"/>
+    </w:p>
+    <w:p>
+      <w:r>
+        <w:t>I plan to use the CRISP-DM methodology to guide my project, as it covers the main stages of a data analytics project, including understanding the problem, preparing the data, building models and evaluating the results.</w:t>
+      </w:r>
+    </w:p>
+    <w:p>
+      <w:r>
+        <w:t xml:space="preserve">I have already downloaded the 12 monthly CSV files from the BTS website, with a total </w:t>
+      </w:r>
+      <w:r>
+        <w:t>over</w:t>
+      </w:r>
+      <w:r>
+        <w:t xml:space="preserve"> 1</w:t>
+      </w:r>
+      <w:r>
+        <w:t xml:space="preserve"> million</w:t>
+      </w:r>
+      <w:r>
+        <w:t xml:space="preserve"> records. I will use Python and Pandas to combine them into one dataset and check for missing values, duplicates and other possible problems. Cancelled flights will be excluded from the modelling data, as the aim is to predict whether a flight departs at least 15 minutes late.</w:t>
+      </w:r>
+    </w:p>
+    <w:p>
+      <w:r>
+        <w:lastRenderedPageBreak/>
+        <w:t>I also want to explore the data before training any models. For example, I would like to see whether some airports, airlines or times of the day have more delayed flights. I will use graphs to help understand these patterns and decide which variables could be useful for prediction.</w:t>
+      </w:r>
+    </w:p>
+    <w:p>
+      <w:r>
+        <w:t>For the machine learning part, I plan to compare Logistic Regression, Decision Tree and Random Forest to see which performs better. I will randomly divide the dataset into training and testing sets, keeping a similar proportion of delayed and non-delayed flights in both groups. I will only include information available before departure, because the aim is to predict a possible delay rather than explain one that has already happened.</w:t>
+      </w:r>
+    </w:p>
+    <w:p>
+      <w:pPr>
+        <w:rPr>
+          <w:rFonts w:ascii="Times New Roman" w:eastAsia="Times New Roman" w:hAnsi="Times New Roman" w:cs="Times New Roman"/>
+          <w:lang w:val="en-GB" w:eastAsia="en-GB"/>
+        </w:rPr>
+      </w:pPr>
+      <w:r>
+        <w:t>I will also try different hyperparameter settings to see if I can improve the models' performance without overfitting.</w:t>
+      </w:r>
+    </w:p>
+    <w:p>
+      <w:r>
+        <w:t>I will compare the models against a simple baseline prediction and evaluate them using Precision, Recall, F1-score and a Confusion Matrix. I will also check whether the number of delayed and non-delayed flights is balanced, as this could affect the results. The final step will be to discuss which model performs best and whether its predictions could be useful for airline operational planning.</w:t>
+      </w:r>
+    </w:p>
+    <w:p/>
+    <w:p>
+      <w:pPr>
+        <w:pStyle w:val="Heading3"/>
+      </w:pPr>
+      <w:bookmarkStart w:id="9" w:name="_Toc242640904"/>
+      <w:r>
+        <w:rPr>
+          <w:rStyle w:val="Strong"/>
+          <w:color w:val="156082" w:themeColor="accent1"/>
+        </w:rPr>
+        <w:t>High-Level Architecture</w:t>
+      </w:r>
+      <w:r>
+        <w:rPr>
+          <w:rStyle w:val="Strong"/>
+          <w:color w:val="156082" w:themeColor="accent1"/>
+        </w:rPr>
+        <w:t xml:space="preserve"> Diagram</w:t>
+      </w:r>
+      <w:bookmarkEnd w:id="9"/>
+    </w:p>
+    <w:p>
+      <w:r>
+        <w:t>The project will follow a workflow that starts with the BTS flight data and ends with the evaluation of the machine learning models. I will use Python to combine and clean the CSV files before exploring the data to understand the patterns in flight delays.</w:t>
+      </w:r>
+    </w:p>
+    <w:p>
+      <w:r>
+        <w:t>The dataset will then be divided into training and testing sets. The training data will be used to build the classification models, while the testing data will be used to check their performance. I will compare the models with a simple baseline and discuss whether the results could help airlines with their operational planning.</w:t>
+      </w:r>
+    </w:p>
+    <w:p>
+      <w:r>
+        <w:t>Figure 1 shows the proposed workflow and how the different stages are connected.</w:t>
+      </w:r>
+    </w:p>
+    <w:p>
+      <w:pPr>
+        <w:keepNext/>
+        <w:jc w:val="center"/>
+      </w:pPr>
+      <w:r>
+        <w:rPr>
+          <w:noProof/>
+          <w14:ligatures w14:val="standardContextual"/>
+        </w:rPr>
+        <w:lastRenderedPageBreak/>
+        <w:drawing>
+          <wp:inline distT="0" distB="0" distL="0" distR="0" wp14:anchorId="7BE11C2A" wp14:editId="45B1C50A">
+            <wp:extent cx="5524500" cy="7112000"/>
+            <wp:effectExtent l="0" t="0" r="0" b="0"/>
+            <wp:docPr id="1972640283" name="Picture 5"/>
+            <wp:cNvGraphicFramePr>
+              <a:graphicFrameLocks xmlns:a="http://schemas.openxmlformats.org/drawingml/2006/main" noChangeAspect="1"/>
+            </wp:cNvGraphicFramePr>
+            <a:graphic xmlns:a="http://schemas.openxmlformats.org/drawingml/2006/main">
+              <a:graphicData uri="http://schemas.openxmlformats.org/drawingml/2006/picture">
+                <pic:pic xmlns:pic="http://schemas.openxmlformats.org/drawingml/2006/picture">
+                  <pic:nvPicPr>
+                    <pic:cNvPr id="1972640283" name="Picture 5"/>
+                    <pic:cNvPicPr/>
+                  </pic:nvPicPr>
+                  <pic:blipFill>
+                    <a:blip r:embed="rId11">
+                      <a:extLst>
+                        <a:ext uri="{28A0092B-C50C-407E-A947-70E740481C1C}">
+                          <a14:useLocalDpi xmlns:a14="http://schemas.microsoft.com/office/drawing/2010/main" val="0"/>
+                        </a:ext>
+                      </a:extLst>
+                    </a:blip>
+                    <a:stretch>
+                      <a:fillRect/>
+                    </a:stretch>
+                  </pic:blipFill>
+                  <pic:spPr>
+                    <a:xfrm>
+                      <a:off x="0" y="0"/>
+                      <a:ext cx="5524500" cy="7112000"/>
+                    </a:xfrm>
+                    <a:prstGeom prst="rect">
+                      <a:avLst/>
+                    </a:prstGeom>
+                  </pic:spPr>
+                </pic:pic>
+              </a:graphicData>
+            </a:graphic>
+          </wp:inline>
+        </w:drawing>
+      </w:r>
+    </w:p>
+    <w:p>
+      <w:pPr>
+        <w:pStyle w:val="Caption"/>
+        <w:jc w:val="center"/>
+      </w:pPr>
+      <w:r>
+        <w:t xml:space="preserve">Figure </w:t>
+      </w:r>
+      <w:r>
+        <w:fldChar w:fldCharType="begin"/>
+      </w:r>
+      <w:r>
+        <w:instrText xml:space="preserve"> SEQ Figure \* ARABIC </w:instrText>
+      </w:r>
+      <w:r>
+        <w:fldChar w:fldCharType="separate"/>
+      </w:r>
+      <w:r>
+        <w:rPr>
+          <w:noProof/>
+        </w:rPr>
+        <w:t>1</w:t>
+      </w:r>
+      <w:r>
+        <w:fldChar w:fldCharType="end"/>
+      </w:r>
+      <w:r>
+        <w:t xml:space="preserve">: </w:t>
+      </w:r>
+      <w:r>
+        <w:rPr>
+          <w:color w:val="000000"/>
+        </w:rPr>
+        <w:t>Proposed</w:t>
+      </w:r>
+      <w:r>
+        <w:rPr>
+          <w:rStyle w:val="apple-converted-space"/>
+          <w:color w:val="000000"/>
+        </w:rPr>
+        <w:t> </w:t>
+      </w:r>
+      <w:r>
+        <w:rPr>
+          <w:color w:val="000000"/>
+        </w:rPr>
+        <w:t>High-Level</w:t>
+      </w:r>
+      <w:r>
+        <w:rPr>
+          <w:rStyle w:val="apple-converted-space"/>
+          <w:color w:val="000000"/>
+        </w:rPr>
+        <w:t> </w:t>
+      </w:r>
+      <w:r>
+        <w:rPr>
+          <w:color w:val="000000"/>
+        </w:rPr>
+        <w:t>Architecture</w:t>
+      </w:r>
+      <w:r>
+        <w:rPr>
+          <w:rStyle w:val="apple-converted-space"/>
+          <w:color w:val="000000"/>
+        </w:rPr>
+        <w:t> </w:t>
+      </w:r>
+      <w:r>
+        <w:rPr>
+          <w:color w:val="000000"/>
+        </w:rPr>
+        <w:t>for</w:t>
+      </w:r>
+      <w:r>
+        <w:rPr>
+          <w:rStyle w:val="apple-converted-space"/>
+          <w:color w:val="000000"/>
+        </w:rPr>
+        <w:t> </w:t>
+      </w:r>
+      <w:r>
+        <w:rPr>
+          <w:color w:val="000000"/>
+        </w:rPr>
+        <w:t>Flight</w:t>
+      </w:r>
+      <w:r>
+        <w:rPr>
+          <w:rStyle w:val="apple-converted-space"/>
+          <w:color w:val="000000"/>
+        </w:rPr>
+        <w:t> </w:t>
+      </w:r>
+      <w:r>
+        <w:rPr>
+          <w:color w:val="000000"/>
+        </w:rPr>
+        <w:t>Delay</w:t>
+      </w:r>
+      <w:r>
+        <w:rPr>
+          <w:rStyle w:val="apple-converted-space"/>
+          <w:color w:val="000000"/>
+        </w:rPr>
+        <w:t> </w:t>
+      </w:r>
+      <w:r>
+        <w:rPr>
+          <w:color w:val="000000"/>
+        </w:rPr>
+        <w:t>Prediction.</w:t>
+      </w:r>
+    </w:p>
+    <w:p/>
+    <w:p/>
+    <w:p/>
+    <w:p/>
+    <w:p>
+      <w:pPr>
+        <w:pStyle w:val="Heading1"/>
+      </w:pPr>
+      <w:bookmarkStart w:id="10" w:name="_Toc242640905"/>
+      <w:r>
         <w:t>References</w:t>
       </w:r>
-      <w:bookmarkEnd w:id="4"/>
+      <w:bookmarkEnd w:id="10"/>
     </w:p>
     <w:p>
       <w:pPr>
@@ -1365,6 +2383,28 @@
       </w:r>
     </w:p>
     <w:p>
+      <w:r>
+        <w:t>www.eurocontrol.int. (n.d.).</w:t>
+      </w:r>
+      <w:r>
+        <w:rPr>
+          <w:rStyle w:val="apple-converted-space"/>
+          <w:color w:val="000000"/>
+        </w:rPr>
+        <w:t> </w:t>
+      </w:r>
+      <w:r>
+        <w:rPr>
+          <w:i/>
+          <w:iCs/>
+        </w:rPr>
+        <w:t>Delays – three questions and many answers</w:t>
+      </w:r>
+      <w:r>
+        <w:t>. [online] Available at: https://www.eurocontrol.int/news/delays-three-questions-and-many-answers [Accessed 9 Oct. 2026].</w:t>
+      </w:r>
+    </w:p>
+    <w:p>
       <w:pPr>
         <w:rPr>
           <w:rFonts w:eastAsia="Times New Roman"/>
@@ -1372,7 +2412,10 @@
         </w:rPr>
       </w:pPr>
       <w:r>
-        <w:t>www.eurocontrol.int. (n.d.).</w:t>
+        <w:rPr>
+          <w:color w:val="000000"/>
+        </w:rPr>
+        <w:t>diagrams.net</w:t>
       </w:r>
       <w:r>
         <w:rPr>
@@ -1383,13 +2426,160 @@
       </w:r>
       <w:r>
         <w:rPr>
-          <w:i/>
-          <w:iCs/>
-        </w:rPr>
-        <w:t>Delays – three questions and many answers</w:t>
-      </w:r>
-      <w:r>
-        <w:t>. [online] Available at: https://www.eurocontrol.int/news/delays-three-questions-and-many-answers [Accessed 9 Oct. 2026].</w:t>
+          <w:color w:val="000000"/>
+        </w:rPr>
+        <w:t>(n.d.)</w:t>
+      </w:r>
+      <w:r>
+        <w:rPr>
+          <w:rStyle w:val="apple-converted-space"/>
+          <w:rFonts w:ascii="-webkit-standard" w:hAnsi="-webkit-standard"/>
+          <w:color w:val="000000"/>
+          <w:sz w:val="27"/>
+          <w:szCs w:val="27"/>
+        </w:rPr>
+        <w:t> </w:t>
+      </w:r>
+      <w:r>
+        <w:rPr>
+          <w:color w:val="000000"/>
+        </w:rPr>
+        <w:t>diagrams.net:</w:t>
+      </w:r>
+      <w:r>
+        <w:rPr>
+          <w:rStyle w:val="apple-converted-space"/>
+          <w:color w:val="000000"/>
+        </w:rPr>
+        <w:t> </w:t>
+      </w:r>
+      <w:r>
+        <w:rPr>
+          <w:color w:val="000000"/>
+        </w:rPr>
+        <w:t>Online</w:t>
+      </w:r>
+      <w:r>
+        <w:rPr>
+          <w:rStyle w:val="apple-converted-space"/>
+          <w:color w:val="000000"/>
+        </w:rPr>
+        <w:t> </w:t>
+      </w:r>
+      <w:r>
+        <w:rPr>
+          <w:color w:val="000000"/>
+        </w:rPr>
+        <w:t>Diagram</w:t>
+      </w:r>
+      <w:r>
+        <w:rPr>
+          <w:rStyle w:val="apple-converted-space"/>
+          <w:color w:val="000000"/>
+        </w:rPr>
+        <w:t> </w:t>
+      </w:r>
+      <w:r>
+        <w:rPr>
+          <w:color w:val="000000"/>
+        </w:rPr>
+        <w:t>Software.</w:t>
+      </w:r>
+      <w:r>
+        <w:rPr>
+          <w:rStyle w:val="apple-converted-space"/>
+          <w:color w:val="000000"/>
+        </w:rPr>
+        <w:t> </w:t>
+      </w:r>
+      <w:r>
+        <w:rPr>
+          <w:color w:val="000000"/>
+        </w:rPr>
+        <w:t>Available</w:t>
+      </w:r>
+      <w:r>
+        <w:rPr>
+          <w:rStyle w:val="apple-converted-space"/>
+          <w:color w:val="000000"/>
+        </w:rPr>
+        <w:t> </w:t>
+      </w:r>
+      <w:r>
+        <w:rPr>
+          <w:color w:val="000000"/>
+        </w:rPr>
+        <w:t>at:</w:t>
+      </w:r>
+      <w:r>
+        <w:rPr>
+          <w:rStyle w:val="apple-converted-space"/>
+          <w:color w:val="000000"/>
+        </w:rPr>
+        <w:t> </w:t>
+      </w:r>
+      <w:hyperlink r:id="rId12" w:history="1">
+        <w:r>
+          <w:rPr>
+            <w:rStyle w:val="Hyperlink"/>
+          </w:rPr>
+          <w:t>https://app.diagrams.net/</w:t>
+        </w:r>
+      </w:hyperlink>
+      <w:r>
+        <w:rPr>
+          <w:rStyle w:val="apple-converted-space"/>
+          <w:rFonts w:ascii="-webkit-standard" w:hAnsi="-webkit-standard"/>
+          <w:color w:val="000000"/>
+          <w:sz w:val="27"/>
+          <w:szCs w:val="27"/>
+        </w:rPr>
+        <w:t> </w:t>
+      </w:r>
+      <w:r>
+        <w:rPr>
+          <w:color w:val="000000"/>
+        </w:rPr>
+        <w:t>(Accessed:</w:t>
+      </w:r>
+      <w:r>
+        <w:rPr>
+          <w:rStyle w:val="apple-converted-space"/>
+          <w:color w:val="000000"/>
+        </w:rPr>
+        <w:t> </w:t>
+      </w:r>
+      <w:r>
+        <w:rPr>
+          <w:color w:val="000000"/>
+        </w:rPr>
+        <w:t>10</w:t>
+      </w:r>
+      <w:r>
+        <w:rPr>
+          <w:rStyle w:val="apple-converted-space"/>
+          <w:color w:val="000000"/>
+        </w:rPr>
+        <w:t> </w:t>
+      </w:r>
+      <w:r>
+        <w:rPr>
+          <w:color w:val="000000"/>
+        </w:rPr>
+        <w:t>October</w:t>
+      </w:r>
+      <w:r>
+        <w:rPr>
+          <w:rStyle w:val="apple-converted-space"/>
+          <w:color w:val="000000"/>
+        </w:rPr>
+        <w:t> </w:t>
+      </w:r>
+      <w:r>
+        <w:rPr>
+          <w:color w:val="000000"/>
+        </w:rPr>
+        <w:t>2026).</w:t>
       </w:r>
     </w:p>
     <w:p>
@@ -1419,27 +2609,19 @@
     <w:p/>
     <w:p/>
     <w:p/>
-    <w:p/>
-    <w:p/>
-    <w:p/>
-    <w:p/>
-    <w:p/>
-    <w:p/>
-    <w:p/>
-    <w:p/>
     <w:p>
       <w:pPr>
         <w:pStyle w:val="Heading1"/>
       </w:pPr>
-      <w:bookmarkStart w:id="5" w:name="_heading=h.kfkjs3rwl2c1" w:colFirst="0" w:colLast="0"/>
-      <w:bookmarkStart w:id="6" w:name="_Toc242474430"/>
-      <w:bookmarkEnd w:id="5"/>
-      <w:r>
+      <w:bookmarkStart w:id="11" w:name="_heading=h.kfkjs3rwl2c1" w:colFirst="0" w:colLast="0"/>
+      <w:bookmarkStart w:id="12" w:name="_Toc242640906"/>
+      <w:bookmarkEnd w:id="11"/>
+      <w:r>
+        <w:lastRenderedPageBreak/>
         <w:t>Appendix</w:t>
       </w:r>
-      <w:bookmarkEnd w:id="6"/>
-    </w:p>
-    <w:p/>
+      <w:bookmarkEnd w:id="12"/>
+    </w:p>
     <w:p/>
     <w:p>
       <w:r>
@@ -1460,7 +2642,7 @@
     <w:p/>
     <w:p/>
     <w:sectPr>
-      <w:footerReference w:type="default" r:id="rId7"/>
+      <w:footerReference w:type="default" r:id="rId13"/>
       <w:pgSz w:w="11906" w:h="16838"/>
       <w:pgMar w:top="1440" w:right="1440" w:bottom="1440" w:left="1440" w:header="708" w:footer="708" w:gutter="0"/>
       <w:pgNumType w:start="1"/>
@@ -1468,6 +2650,31 @@
     </w:sectPr>
   </w:body>
 </w:document>
+</file>
+
+<file path=word/endnotes.xml><?xml version="1.0" encoding="utf-8"?>
+<w:endnotes xmlns:wpc="http://schemas.microsoft.com/office/word/2010/wordprocessingCanvas" xmlns:cx="http://schemas.microsoft.com/office/drawing/2014/chartex" xmlns:cx1="http://schemas.microsoft.com/office/drawing/2015/9/8/chartex" xmlns:cx2="http://schemas.microsoft.com/office/drawing/2015/10/21/chartex" xmlns:cx3="http://schemas.microsoft.com/office/drawing/2016/5/9/chartex" xmlns:cx4="http://schemas.microsoft.com/office/drawing/2016/5/10/chartex" xmlns:cx5="http://schemas.microsoft.com/office/drawing/2016/5/11/chartex" xmlns:cx6="http://schemas.microsoft.com/office/drawing/2016/5/12/chartex" xmlns:cx7="http://schemas.microsoft.com/office/drawing/2016/5/13/chartex" xmlns:cx8="http://schemas.microsoft.com/office/drawing/2016/5/14/chartex" xmlns:mc="http://schemas.openxmlformats.org/markup-compatibility/2006" xmlns:m="http://schemas.openxmlformats.org/officeDocument/2006/math" xmlns:aink="http://schemas.microsoft.com/office/drawing/2016/ink" xmlns:am3d="http://schemas.microsoft.com/office/drawing/2017/model3d" xmlns:oel="http://schemas.microsoft.com/office/2019/extlst" xmlns:r="http://schemas.openxmlformats.org/officeDocument/2006/relationships" xmlns:wp14="http://schemas.microsoft.com/office/word/2010/wordprocessingDrawing" xmlns:wp="http://schemas.openxmlformats.org/drawingml/2006/wordprocessingDrawing" xmlns:wpg="http://schemas.microsoft.com/office/word/2010/wordprocessingGroup" xmlns:wpi="http://schemas.microsoft.com/office/word/2010/wordprocessingInk" xmlns:wps="http://schemas.microsoft.com/office/word/2010/wordprocessingShape" xmlns:o="urn:schemas-microsoft-com:office:office" xmlns:v="urn:schemas-microsoft-com:vml" xmlns:w10="urn:schemas-microsoft-com:office:word" xmlns:w="http://schemas.openxmlformats.org/wordprocessingml/2006/main" xmlns:w14="http://schemas.microsoft.com/office/word/2010/wordml" xmlns:w15="http://schemas.microsoft.com/office/word/2012/wordml" xmlns:w16cex="http://schemas.microsoft.com/office/word/2018/wordml/cex" xmlns:w16cid="http://schemas.microsoft.com/office/word/2016/wordml/cid" xmlns:w16="http://schemas.microsoft.com/office/word/2018/wordml" xmlns:w16sdtdh="http://schemas.microsoft.com/office/word/2020/wordml/sdtdatahash" xmlns:w16sdtfl="http://schemas.microsoft.com/office/word/2024/wordml/sdtformatlock" xmlns:w16se="http://schemas.microsoft.com/office/word/2015/wordml/symex" xmlns:w16du="http://schemas.microsoft.com/office/word/2023/wordml/word16du" xmlns:wne="http://schemas.microsoft.com/office/word/2006/wordml" mc:Ignorable="w14 w15 w16se w16cid w16 w16cex w16sdtdh w16sdtfl w16du wp14">
+  <w:endnote w:type="separator" w:id="-1">
+    <w:p>
+      <w:pPr>
+        <w:spacing w:after="0" w:line="240" w:lineRule="auto"/>
+      </w:pPr>
+      <w:r>
+        <w:separator/>
+      </w:r>
+    </w:p>
+  </w:endnote>
+  <w:endnote w:type="continuationSeparator" w:id="0">
+    <w:p>
+      <w:pPr>
+        <w:spacing w:after="0" w:line="240" w:lineRule="auto"/>
+      </w:pPr>
+      <w:r>
+        <w:continuationSeparator/>
+      </w:r>
+    </w:p>
+  </w:endnote>
+</w:endnotes>
 </file>
 
 <file path=word/footer1.xml><?xml version="1.0" encoding="utf-8"?>
@@ -1513,6 +2720,31 @@
 </w:ftr>
 </file>
 
+<file path=word/footnotes.xml><?xml version="1.0" encoding="utf-8"?>
+<w:footnotes xmlns:wpc="http://schemas.microsoft.com/office/word/2010/wordprocessingCanvas" xmlns:cx="http://schemas.microsoft.com/office/drawing/2014/chartex" xmlns:cx1="http://schemas.microsoft.com/office/drawing/2015/9/8/chartex" xmlns:cx2="http://schemas.microsoft.com/office/drawing/2015/10/21/chartex" xmlns:cx3="http://schemas.microsoft.com/office/drawing/2016/5/9/chartex" xmlns:cx4="http://schemas.microsoft.com/office/drawing/2016/5/10/chartex" xmlns:cx5="http://schemas.microsoft.com/office/drawing/2016/5/11/chartex" xmlns:cx6="http://schemas.microsoft.com/office/drawing/2016/5/12/chartex" xmlns:cx7="http://schemas.microsoft.com/office/drawing/2016/5/13/chartex" xmlns:cx8="http://schemas.microsoft.com/office/drawing/2016/5/14/chartex" xmlns:mc="http://schemas.openxmlformats.org/markup-compatibility/2006" xmlns:m="http://schemas.openxmlformats.org/officeDocument/2006/math" xmlns:aink="http://schemas.microsoft.com/office/drawing/2016/ink" xmlns:am3d="http://schemas.microsoft.com/office/drawing/2017/model3d" xmlns:oel="http://schemas.microsoft.com/office/2019/extlst" xmlns:r="http://schemas.openxmlformats.org/officeDocument/2006/relationships" xmlns:wp14="http://schemas.microsoft.com/office/word/2010/wordprocessingDrawing" xmlns:wp="http://schemas.openxmlformats.org/drawingml/2006/wordprocessingDrawing" xmlns:wpg="http://schemas.microsoft.com/office/word/2010/wordprocessingGroup" xmlns:wpi="http://schemas.microsoft.com/office/word/2010/wordprocessingInk" xmlns:wps="http://schemas.microsoft.com/office/word/2010/wordprocessingShape" xmlns:o="urn:schemas-microsoft-com:office:office" xmlns:v="urn:schemas-microsoft-com:vml" xmlns:w10="urn:schemas-microsoft-com:office:word" xmlns:w="http://schemas.openxmlformats.org/wordprocessingml/2006/main" xmlns:w14="http://schemas.microsoft.com/office/word/2010/wordml" xmlns:w15="http://schemas.microsoft.com/office/word/2012/wordml" xmlns:w16cex="http://schemas.microsoft.com/office/word/2018/wordml/cex" xmlns:w16cid="http://schemas.microsoft.com/office/word/2016/wordml/cid" xmlns:w16="http://schemas.microsoft.com/office/word/2018/wordml" xmlns:w16sdtdh="http://schemas.microsoft.com/office/word/2020/wordml/sdtdatahash" xmlns:w16sdtfl="http://schemas.microsoft.com/office/word/2024/wordml/sdtformatlock" xmlns:w16se="http://schemas.microsoft.com/office/word/2015/wordml/symex" xmlns:w16du="http://schemas.microsoft.com/office/word/2023/wordml/word16du" xmlns:wne="http://schemas.microsoft.com/office/word/2006/wordml" mc:Ignorable="w14 w15 w16se w16cid w16 w16cex w16sdtdh w16sdtfl w16du wp14">
+  <w:footnote w:type="separator" w:id="-1">
+    <w:p>
+      <w:pPr>
+        <w:spacing w:after="0" w:line="240" w:lineRule="auto"/>
+      </w:pPr>
+      <w:r>
+        <w:separator/>
+      </w:r>
+    </w:p>
+  </w:footnote>
+  <w:footnote w:type="continuationSeparator" w:id="0">
+    <w:p>
+      <w:pPr>
+        <w:spacing w:after="0" w:line="240" w:lineRule="auto"/>
+      </w:pPr>
+      <w:r>
+        <w:continuationSeparator/>
+      </w:r>
+    </w:p>
+  </w:footnote>
+</w:footnotes>
+</file>
+
 <file path=word/numbering.xml><?xml version="1.0" encoding="utf-8"?>
 <w:numbering xmlns:wpc="http://schemas.microsoft.com/office/word/2010/wordprocessingCanvas" xmlns:cx="http://schemas.microsoft.com/office/drawing/2014/chartex" xmlns:cx1="http://schemas.microsoft.com/office/drawing/2015/9/8/chartex" xmlns:cx2="http://schemas.microsoft.com/office/drawing/2015/10/21/chartex" xmlns:cx3="http://schemas.microsoft.com/office/drawing/2016/5/9/chartex" xmlns:cx4="http://schemas.microsoft.com/office/drawing/2016/5/10/chartex" xmlns:cx5="http://schemas.microsoft.com/office/drawing/2016/5/11/chartex" xmlns:cx6="http://schemas.microsoft.com/office/drawing/2016/5/12/chartex" xmlns:cx7="http://schemas.microsoft.com/office/drawing/2016/5/13/chartex" xmlns:cx8="http://schemas.microsoft.com/office/drawing/2016/5/14/chartex" xmlns:mc="http://schemas.openxmlformats.org/markup-compatibility/2006" xmlns:m="http://schemas.openxmlformats.org/officeDocument/2006/math" xmlns:aink="http://schemas.microsoft.com/office/drawing/2016/ink" xmlns:am3d="http://schemas.microsoft.com/office/drawing/2017/model3d" xmlns:oel="http://schemas.microsoft.com/office/2019/extlst" xmlns:r="http://schemas.openxmlformats.org/officeDocument/2006/relationships" xmlns:wp14="http://schemas.microsoft.com/office/word/2010/wordprocessingDrawing" xmlns:wp="http://schemas.openxmlformats.org/drawingml/2006/wordprocessingDrawing" xmlns:wpg="http://schemas.microsoft.com/office/word/2010/wordprocessingGroup" xmlns:wpi="http://schemas.microsoft.com/office/word/2010/wordprocessingInk" xmlns:wps="http://schemas.microsoft.com/office/word/2010/wordprocessingShape" xmlns:o="urn:schemas-microsoft-com:office:office" xmlns:v="urn:schemas-microsoft-com:vml" xmlns:w10="urn:schemas-microsoft-com:office:word" xmlns:w="http://schemas.openxmlformats.org/wordprocessingml/2006/main" xmlns:w14="http://schemas.microsoft.com/office/word/2010/wordml" xmlns:w15="http://schemas.microsoft.com/office/word/2012/wordml" xmlns:w16cex="http://schemas.microsoft.com/office/word/2018/wordml/cex" xmlns:w16cid="http://schemas.microsoft.com/office/word/2016/wordml/cid" xmlns:w16="http://schemas.microsoft.com/office/word/2018/wordml" xmlns:w16sdtdh="http://schemas.microsoft.com/office/word/2020/wordml/sdtdatahash" xmlns:w16sdtfl="http://schemas.microsoft.com/office/word/2024/wordml/sdtformatlock" xmlns:w16se="http://schemas.microsoft.com/office/word/2015/wordml/symex" xmlns:w16du="http://schemas.microsoft.com/office/word/2023/wordml/word16du" xmlns:wne="http://schemas.microsoft.com/office/word/2006/wordml" mc:Ignorable="w14 w15 w16se w16cid w16 w16cex w16sdtdh w16sdtfl w16du wp14">
   <w:abstractNum w:abstractNumId="0" w15:restartNumberingAfterBreak="0">
@@ -2170,6 +3402,119 @@
     </w:lvl>
   </w:abstractNum>
   <w:abstractNum w:abstractNumId="6" w15:restartNumberingAfterBreak="0">
+    <w:nsid w:val="5F9468A1"/>
+    <w:multiLevelType w:val="hybridMultilevel"/>
+    <w:tmpl w:val="99328A68"/>
+    <w:lvl w:ilvl="0" w:tplc="08090001">
+      <w:start w:val="1"/>
+      <w:numFmt w:val="bullet"/>
+      <w:lvlText w:val=""/>
+      <w:lvlJc w:val="left"/>
+      <w:pPr>
+        <w:ind w:left="720" w:hanging="360"/>
+      </w:pPr>
+      <w:rPr>
+        <w:rFonts w:ascii="Symbol" w:hAnsi="Symbol" w:hint="default"/>
+      </w:rPr>
+    </w:lvl>
+    <w:lvl w:ilvl="1" w:tplc="08090003" w:tentative="1">
+      <w:start w:val="1"/>
+      <w:numFmt w:val="bullet"/>
+      <w:lvlText w:val="o"/>
+      <w:lvlJc w:val="left"/>
+      <w:pPr>
+        <w:ind w:left="1440" w:hanging="360"/>
+      </w:pPr>
+      <w:rPr>
+        <w:rFonts w:ascii="Courier New" w:hAnsi="Courier New" w:cs="Courier New" w:hint="default"/>
+      </w:rPr>
+    </w:lvl>
+    <w:lvl w:ilvl="2" w:tplc="08090005" w:tentative="1">
+      <w:start w:val="1"/>
+      <w:numFmt w:val="bullet"/>
+      <w:lvlText w:val=""/>
+      <w:lvlJc w:val="left"/>
+      <w:pPr>
+        <w:ind w:left="2160" w:hanging="360"/>
+      </w:pPr>
+      <w:rPr>
+        <w:rFonts w:ascii="Wingdings" w:hAnsi="Wingdings" w:hint="default"/>
+      </w:rPr>
+    </w:lvl>
+    <w:lvl w:ilvl="3" w:tplc="08090001" w:tentative="1">
+      <w:start w:val="1"/>
+      <w:numFmt w:val="bullet"/>
+      <w:lvlText w:val=""/>
+      <w:lvlJc w:val="left"/>
+      <w:pPr>
+        <w:ind w:left="2880" w:hanging="360"/>
+      </w:pPr>
+      <w:rPr>
+        <w:rFonts w:ascii="Symbol" w:hAnsi="Symbol" w:hint="default"/>
+      </w:rPr>
+    </w:lvl>
+    <w:lvl w:ilvl="4" w:tplc="08090003" w:tentative="1">
+      <w:start w:val="1"/>
+      <w:numFmt w:val="bullet"/>
+      <w:lvlText w:val="o"/>
+      <w:lvlJc w:val="left"/>
+      <w:pPr>
+        <w:ind w:left="3600" w:hanging="360"/>
+      </w:pPr>
+      <w:rPr>
+        <w:rFonts w:ascii="Courier New" w:hAnsi="Courier New" w:cs="Courier New" w:hint="default"/>
+      </w:rPr>
+    </w:lvl>
+    <w:lvl w:ilvl="5" w:tplc="08090005" w:tentative="1">
+      <w:start w:val="1"/>
+      <w:numFmt w:val="bullet"/>
+      <w:lvlText w:val=""/>
+      <w:lvlJc w:val="left"/>
+      <w:pPr>
+        <w:ind w:left="4320" w:hanging="360"/>
+      </w:pPr>
+      <w:rPr>
+        <w:rFonts w:ascii="Wingdings" w:hAnsi="Wingdings" w:hint="default"/>
+      </w:rPr>
+    </w:lvl>
+    <w:lvl w:ilvl="6" w:tplc="08090001" w:tentative="1">
+      <w:start w:val="1"/>
+      <w:numFmt w:val="bullet"/>
+      <w:lvlText w:val=""/>
+      <w:lvlJc w:val="left"/>
+      <w:pPr>
+        <w:ind w:left="5040" w:hanging="360"/>
+      </w:pPr>
+      <w:rPr>
+        <w:rFonts w:ascii="Symbol" w:hAnsi="Symbol" w:hint="default"/>
+      </w:rPr>
+    </w:lvl>
+    <w:lvl w:ilvl="7" w:tplc="08090003" w:tentative="1">
+      <w:start w:val="1"/>
+      <w:numFmt w:val="bullet"/>
+      <w:lvlText w:val="o"/>
+      <w:lvlJc w:val="left"/>
+      <w:pPr>
+        <w:ind w:left="5760" w:hanging="360"/>
+      </w:pPr>
+      <w:rPr>
+        <w:rFonts w:ascii="Courier New" w:hAnsi="Courier New" w:cs="Courier New" w:hint="default"/>
+      </w:rPr>
+    </w:lvl>
+    <w:lvl w:ilvl="8" w:tplc="08090005" w:tentative="1">
+      <w:start w:val="1"/>
+      <w:numFmt w:val="bullet"/>
+      <w:lvlText w:val=""/>
+      <w:lvlJc w:val="left"/>
+      <w:pPr>
+        <w:ind w:left="6480" w:hanging="360"/>
+      </w:pPr>
+      <w:rPr>
+        <w:rFonts w:ascii="Wingdings" w:hAnsi="Wingdings" w:hint="default"/>
+      </w:rPr>
+    </w:lvl>
+  </w:abstractNum>
+  <w:abstractNum w:abstractNumId="7" w15:restartNumberingAfterBreak="0">
     <w:nsid w:val="675573C9"/>
     <w:multiLevelType w:val="multilevel"/>
     <w:tmpl w:val="57D27894"/>
@@ -2318,7 +3663,7 @@
       </w:rPr>
     </w:lvl>
   </w:abstractNum>
-  <w:abstractNum w:abstractNumId="7" w15:restartNumberingAfterBreak="0">
+  <w:abstractNum w:abstractNumId="8" w15:restartNumberingAfterBreak="0">
     <w:nsid w:val="6CBC2C08"/>
     <w:multiLevelType w:val="multilevel"/>
     <w:tmpl w:val="D76A7514"/>
@@ -2431,7 +3776,7 @@
       </w:pPr>
     </w:lvl>
   </w:abstractNum>
-  <w:abstractNum w:abstractNumId="8" w15:restartNumberingAfterBreak="0">
+  <w:abstractNum w:abstractNumId="9" w15:restartNumberingAfterBreak="0">
     <w:nsid w:val="7A490A53"/>
     <w:multiLevelType w:val="multilevel"/>
     <w:tmpl w:val="9EA23756"/>
@@ -2587,13 +3932,13 @@
     <w:abstractNumId w:val="2"/>
   </w:num>
   <w:num w:numId="3" w16cid:durableId="728696014">
-    <w:abstractNumId w:val="6"/>
+    <w:abstractNumId w:val="7"/>
   </w:num>
   <w:num w:numId="4" w16cid:durableId="1057824889">
     <w:abstractNumId w:val="1"/>
   </w:num>
   <w:num w:numId="5" w16cid:durableId="716047706">
-    <w:abstractNumId w:val="8"/>
+    <w:abstractNumId w:val="9"/>
   </w:num>
   <w:num w:numId="6" w16cid:durableId="720325003">
     <w:abstractNumId w:val="4"/>
@@ -2605,7 +3950,10 @@
     <w:abstractNumId w:val="5"/>
   </w:num>
   <w:num w:numId="9" w16cid:durableId="52000010">
-    <w:abstractNumId w:val="7"/>
+    <w:abstractNumId w:val="8"/>
+  </w:num>
+  <w:num w:numId="10" w16cid:durableId="227885826">
+    <w:abstractNumId w:val="6"/>
   </w:num>
 </w:numbering>
 </file>
@@ -3037,7 +4385,7 @@
     <w:link w:val="Heading1Char"/>
     <w:uiPriority w:val="9"/>
     <w:qFormat/>
-    <w:rsid w:val="003A6B43"/>
+    <w:rsid w:val="00E970D4"/>
     <w:pPr>
       <w:keepNext/>
       <w:keepLines/>
@@ -3046,6 +4394,8 @@
     </w:pPr>
     <w:rPr>
       <w:rFonts w:asciiTheme="majorHAnsi" w:eastAsiaTheme="majorEastAsia" w:hAnsiTheme="majorHAnsi" w:cstheme="majorBidi"/>
+      <w:b/>
+      <w:bCs/>
       <w:color w:val="0F4761" w:themeColor="accent1" w:themeShade="BF"/>
       <w:sz w:val="40"/>
       <w:szCs w:val="40"/>
@@ -3230,6 +4580,7 @@
   <w:style w:type="character" w:default="1" w:styleId="DefaultParagraphFont">
     <w:name w:val="Default Paragraph Font"/>
     <w:uiPriority w:val="1"/>
+    <w:semiHidden/>
     <w:unhideWhenUsed/>
   </w:style>
   <w:style w:type="table" w:default="1" w:styleId="TableNormal">
@@ -3258,9 +4609,11 @@
     <w:basedOn w:val="DefaultParagraphFont"/>
     <w:link w:val="Heading1"/>
     <w:uiPriority w:val="9"/>
-    <w:rsid w:val="003A6B43"/>
+    <w:rsid w:val="00E970D4"/>
     <w:rPr>
       <w:rFonts w:asciiTheme="majorHAnsi" w:eastAsiaTheme="majorEastAsia" w:hAnsiTheme="majorHAnsi" w:cstheme="majorBidi"/>
+      <w:b/>
+      <w:bCs/>
       <w:color w:val="0F4761" w:themeColor="accent1" w:themeShade="BF"/>
       <w:kern w:val="0"/>
       <w:sz w:val="40"/>
@@ -3637,6 +4990,63 @@
       <w:lang w:val="en-GB" w:eastAsia="en-GB"/>
     </w:rPr>
   </w:style>
+  <w:style w:type="paragraph" w:styleId="Caption">
+    <w:name w:val="caption"/>
+    <w:basedOn w:val="Normal"/>
+    <w:next w:val="Normal"/>
+    <w:uiPriority w:val="35"/>
+    <w:unhideWhenUsed/>
+    <w:qFormat/>
+    <w:rsid w:val="009D256D"/>
+    <w:pPr>
+      <w:spacing w:after="200" w:line="240" w:lineRule="auto"/>
+    </w:pPr>
+    <w:rPr>
+      <w:i/>
+      <w:iCs/>
+      <w:color w:val="0E2841" w:themeColor="text2"/>
+      <w:sz w:val="18"/>
+      <w:szCs w:val="18"/>
+    </w:rPr>
+  </w:style>
+  <w:style w:type="character" w:styleId="FollowedHyperlink">
+    <w:name w:val="FollowedHyperlink"/>
+    <w:basedOn w:val="DefaultParagraphFont"/>
+    <w:uiPriority w:val="99"/>
+    <w:semiHidden/>
+    <w:unhideWhenUsed/>
+    <w:rsid w:val="00E970D4"/>
+    <w:rPr>
+      <w:color w:val="96607D" w:themeColor="followedHyperlink"/>
+      <w:u w:val="single"/>
+    </w:rPr>
+  </w:style>
+  <w:style w:type="paragraph" w:styleId="TOC2">
+    <w:name w:val="toc 2"/>
+    <w:basedOn w:val="Normal"/>
+    <w:next w:val="Normal"/>
+    <w:autoRedefine/>
+    <w:uiPriority w:val="39"/>
+    <w:unhideWhenUsed/>
+    <w:rsid w:val="00E970D4"/>
+    <w:pPr>
+      <w:spacing w:after="100"/>
+      <w:ind w:left="240"/>
+    </w:pPr>
+  </w:style>
+  <w:style w:type="paragraph" w:styleId="TOC3">
+    <w:name w:val="toc 3"/>
+    <w:basedOn w:val="Normal"/>
+    <w:next w:val="Normal"/>
+    <w:autoRedefine/>
+    <w:uiPriority w:val="39"/>
+    <w:unhideWhenUsed/>
+    <w:rsid w:val="00E970D4"/>
+    <w:pPr>
+      <w:spacing w:after="100"/>
+      <w:ind w:left="480"/>
+    </w:pPr>
+  </w:style>
 </w:styles>
 </file>
 
@@ -3953,4 +5363,16 @@
     </a:ext>
   </a:extLst>
 </a:theme>
+</file>
+
+<file path=customXml/item1.xml><?xml version="1.0" encoding="utf-8"?>
+<b:Sources xmlns:b="http://schemas.openxmlformats.org/officeDocument/2006/bibliography" xmlns="http://schemas.openxmlformats.org/officeDocument/2006/bibliography" SelectedStyle="/APASixthEditionOfficeOnline.xsl" StyleName="APA" Version="6"/>
+</file>
+
+<file path=customXml/itemProps1.xml><?xml version="1.0" encoding="utf-8"?>
+<ds:datastoreItem xmlns:ds="http://schemas.openxmlformats.org/officeDocument/2006/customXml" ds:itemID="{F09FDD28-F4C9-3049-8647-E1BA1EECBD67}">
+  <ds:schemaRefs>
+    <ds:schemaRef ds:uri="http://schemas.openxmlformats.org/officeDocument/2006/bibliography"/>
+  </ds:schemaRefs>
+</ds:datastoreItem>
 </file>
</xml_diff>

<commit_message>
Add data sources and expected deliverables
</commit_message>
<xml_diff>
--- a/CA1-Capstone-sba23349-Proposal.docx
+++ b/CA1-Capstone-sba23349-Proposal.docx
@@ -2321,14 +2321,125 @@
     </w:p>
     <w:p/>
     <w:p/>
+    <w:p>
+      <w:pPr>
+        <w:pStyle w:val="Heading1"/>
+        <w:rPr>
+          <w:rFonts w:ascii="Times New Roman" w:eastAsia="Times New Roman" w:hAnsi="Times New Roman" w:cs="Times New Roman"/>
+          <w:lang w:val="en-GB" w:eastAsia="en-GB"/>
+        </w:rPr>
+      </w:pPr>
+      <w:r>
+        <w:lastRenderedPageBreak/>
+        <w:t>Data Sources</w:t>
+      </w:r>
+    </w:p>
+    <w:p>
+      <w:r>
+        <w:t>The dataset for this project comes from the US Bureau of Transportation Statistics (</w:t>
+      </w:r>
+      <w:r>
+        <w:rPr>
+          <w:color w:val="000000"/>
+        </w:rPr>
+        <w:t>Bts.gov, 2018</w:t>
+      </w:r>
+      <w:r>
+        <w:t>), through its official TranStats website. I downloaded 12 CSV files covering flights departing from California airports between January and December 2024, including flights travelling to other states. The files contain a total of 1,276,578 records before cleaning.</w:t>
+      </w:r>
+    </w:p>
+    <w:p>
+      <w:r>
+        <w:t>I initially considered using data from all US airports, but the dataset was too large for the scope of this project. I decided to focus on California because it has several major airports and still provides enough data to explore flight delays and train machine learning models.</w:t>
+      </w:r>
+    </w:p>
+    <w:p>
+      <w:r>
+        <w:t>The dataset contains information such as flight dates, airlines, departure and destination airports, scheduled departure times and flight distances. The target variable is</w:t>
+      </w:r>
+      <w:r>
+        <w:t xml:space="preserve"> the column</w:t>
+      </w:r>
+      <w:r>
+        <w:t xml:space="preserve"> DEP_DEL15, which indicates whether a flight departed 15 minutes or more after its scheduled time. These variables are relevant because they allow me to investigate whether information available before departure can help predict flight delays.</w:t>
+      </w:r>
+    </w:p>
+    <w:p>
+      <w:r>
+        <w:t>The data is available through BTS, an official US government source. I will document the source, access date and applicable conditions for using the dataset in my final report. The dataset contains flight-level operational records rather than individual passenger information, and I will keep the original files separately from the cleaned data.</w:t>
+      </w:r>
+    </w:p>
+    <w:p/>
+    <w:p>
+      <w:pPr>
+        <w:pStyle w:val="Heading1"/>
+        <w:rPr>
+          <w:rFonts w:ascii="Times New Roman" w:eastAsia="Times New Roman" w:hAnsi="Times New Roman" w:cs="Times New Roman"/>
+          <w:lang w:val="en-GB" w:eastAsia="en-GB"/>
+        </w:rPr>
+      </w:pPr>
+      <w:r>
+        <w:t>Expected Deliverables</w:t>
+      </w:r>
+    </w:p>
+    <w:p>
+      <w:pPr>
+        <w:rPr>
+          <w:rFonts w:ascii="Times New Roman" w:eastAsia="Times New Roman" w:hAnsi="Times New Roman" w:cs="Times New Roman"/>
+          <w:lang w:val="en-GB" w:eastAsia="en-GB"/>
+        </w:rPr>
+      </w:pPr>
+      <w:r>
+        <w:t>By the end of Semester 2, I expect to have a cleaned dataset and Python notebooks showing how I prepared and analysed the data. I will also create graphs to explore flight delays and see if there are any patterns related to airlines, airports or departure times.</w:t>
+      </w:r>
+    </w:p>
+    <w:p>
+      <w:r>
+        <w:t>I plan to build three machine learning models: Logistic Regression, Decision Tree and Random Forest. I will compare their results with a simple baseline model and try different hyperparameters to see if I can improve their performance. I will use Precision, Recall, F1-score and Confusion Matrices to evaluate the models.</w:t>
+      </w:r>
+    </w:p>
+    <w:p>
+      <w:r>
+        <w:lastRenderedPageBreak/>
+        <w:t>I will also explain which model performed best, its limitations and how the results could help airlines with their planning. If I have enough time, I may create a simple dashboard to show the main findings.</w:t>
+      </w:r>
+    </w:p>
+    <w:p>
+      <w:r>
+        <w:t>The project code, notebooks and documentation will be available in my GitHub repository</w:t>
+      </w:r>
+      <w:r>
+        <w:t xml:space="preserve"> described in the cover page</w:t>
+      </w:r>
+      <w:r>
+        <w:t>.</w:t>
+      </w:r>
+    </w:p>
     <w:p/>
     <w:p/>
+    <w:p/>
+    <w:p/>
+    <w:p/>
+    <w:p/>
+    <w:p/>
+    <w:p/>
+    <w:p/>
+    <w:p/>
+    <w:p/>
+    <w:p/>
+    <w:p/>
+    <w:p/>
+    <w:p/>
+    <w:p/>
+    <w:p/>
+    <w:p/>
     <w:p>
       <w:pPr>
         <w:pStyle w:val="Heading1"/>
       </w:pPr>
       <w:bookmarkStart w:id="10" w:name="_Toc242640905"/>
       <w:r>
+        <w:lastRenderedPageBreak/>
         <w:t>References</w:t>
       </w:r>
       <w:bookmarkEnd w:id="10"/>
@@ -2351,18 +2462,8 @@
           <w:iCs/>
           <w:lang w:val="en-GB" w:eastAsia="en-GB"/>
         </w:rPr>
-        <w:t xml:space="preserve">OST_R | BTS | </w:t>
-      </w:r>
-      <w:proofErr w:type="spellStart"/>
-      <w:r>
-        <w:rPr>
-          <w:i/>
-          <w:iCs/>
-          <w:lang w:val="en-GB" w:eastAsia="en-GB"/>
-        </w:rPr>
-        <w:t>Transtats</w:t>
-      </w:r>
-      <w:proofErr w:type="spellEnd"/>
+        <w:t>OST_R | BTS | Transtats</w:t>
+      </w:r>
       <w:r>
         <w:rPr>
           <w:lang w:val="en-GB" w:eastAsia="en-GB"/>

</xml_diff>

<commit_message>
Add project timeline and Gantt chart
</commit_message>
<xml_diff>
--- a/CA1-Capstone-sba23349-Proposal.docx
+++ b/CA1-Capstone-sba23349-Proposal.docx
@@ -1091,7 +1091,7 @@
           <w:r>
             <w:fldChar w:fldCharType="separate"/>
           </w:r>
-          <w:hyperlink w:anchor="_Toc242640897" w:history="1">
+          <w:hyperlink w:anchor="_Toc242906210" w:history="1">
             <w:r>
               <w:rPr>
                 <w:rStyle w:val="Hyperlink"/>
@@ -1118,7 +1118,7 @@
                 <w:noProof/>
                 <w:webHidden/>
               </w:rPr>
-              <w:instrText xml:space="preserve"> PAGEREF _Toc242640897 \h </w:instrText>
+              <w:instrText xml:space="preserve"> PAGEREF _Toc242906210 \h </w:instrText>
             </w:r>
             <w:r>
               <w:rPr>
@@ -1160,7 +1160,7 @@
               <w14:ligatures w14:val="standardContextual"/>
             </w:rPr>
           </w:pPr>
-          <w:hyperlink w:anchor="_Toc242640898" w:history="1">
+          <w:hyperlink w:anchor="_Toc242906211" w:history="1">
             <w:r>
               <w:rPr>
                 <w:rStyle w:val="Hyperlink"/>
@@ -1187,7 +1187,7 @@
                 <w:noProof/>
                 <w:webHidden/>
               </w:rPr>
-              <w:instrText xml:space="preserve"> PAGEREF _Toc242640898 \h </w:instrText>
+              <w:instrText xml:space="preserve"> PAGEREF _Toc242906211 \h </w:instrText>
             </w:r>
             <w:r>
               <w:rPr>
@@ -1229,7 +1229,7 @@
               <w14:ligatures w14:val="standardContextual"/>
             </w:rPr>
           </w:pPr>
-          <w:hyperlink w:anchor="_Toc242640899" w:history="1">
+          <w:hyperlink w:anchor="_Toc242906212" w:history="1">
             <w:r>
               <w:rPr>
                 <w:rStyle w:val="Hyperlink"/>
@@ -1256,7 +1256,7 @@
                 <w:noProof/>
                 <w:webHidden/>
               </w:rPr>
-              <w:instrText xml:space="preserve"> PAGEREF _Toc242640899 \h </w:instrText>
+              <w:instrText xml:space="preserve"> PAGEREF _Toc242906212 \h </w:instrText>
             </w:r>
             <w:r>
               <w:rPr>
@@ -1301,7 +1301,7 @@
               <w14:ligatures w14:val="standardContextual"/>
             </w:rPr>
           </w:pPr>
-          <w:hyperlink w:anchor="_Toc242640900" w:history="1">
+          <w:hyperlink w:anchor="_Toc242906213" w:history="1">
             <w:r>
               <w:rPr>
                 <w:rStyle w:val="Hyperlink"/>
@@ -1330,7 +1330,7 @@
                 <w:noProof/>
                 <w:webHidden/>
               </w:rPr>
-              <w:instrText xml:space="preserve"> PAGEREF _Toc242640900 \h </w:instrText>
+              <w:instrText xml:space="preserve"> PAGEREF _Toc242906213 \h </w:instrText>
             </w:r>
             <w:r>
               <w:rPr>
@@ -1375,7 +1375,7 @@
               <w14:ligatures w14:val="standardContextual"/>
             </w:rPr>
           </w:pPr>
-          <w:hyperlink w:anchor="_Toc242640901" w:history="1">
+          <w:hyperlink w:anchor="_Toc242906214" w:history="1">
             <w:r>
               <w:rPr>
                 <w:rStyle w:val="Hyperlink"/>
@@ -1404,7 +1404,7 @@
                 <w:noProof/>
                 <w:webHidden/>
               </w:rPr>
-              <w:instrText xml:space="preserve"> PAGEREF _Toc242640901 \h </w:instrText>
+              <w:instrText xml:space="preserve"> PAGEREF _Toc242906214 \h </w:instrText>
             </w:r>
             <w:r>
               <w:rPr>
@@ -1446,7 +1446,7 @@
               <w14:ligatures w14:val="standardContextual"/>
             </w:rPr>
           </w:pPr>
-          <w:hyperlink w:anchor="_Toc242640902" w:history="1">
+          <w:hyperlink w:anchor="_Toc242906215" w:history="1">
             <w:r>
               <w:rPr>
                 <w:rStyle w:val="Hyperlink"/>
@@ -1473,7 +1473,7 @@
                 <w:noProof/>
                 <w:webHidden/>
               </w:rPr>
-              <w:instrText xml:space="preserve"> PAGEREF _Toc242640902 \h </w:instrText>
+              <w:instrText xml:space="preserve"> PAGEREF _Toc242906215 \h </w:instrText>
             </w:r>
             <w:r>
               <w:rPr>
@@ -1515,7 +1515,7 @@
               <w14:ligatures w14:val="standardContextual"/>
             </w:rPr>
           </w:pPr>
-          <w:hyperlink w:anchor="_Toc242640903" w:history="1">
+          <w:hyperlink w:anchor="_Toc242906216" w:history="1">
             <w:r>
               <w:rPr>
                 <w:rStyle w:val="Hyperlink"/>
@@ -1542,7 +1542,7 @@
                 <w:noProof/>
                 <w:webHidden/>
               </w:rPr>
-              <w:instrText xml:space="preserve"> PAGEREF _Toc242640903 \h </w:instrText>
+              <w:instrText xml:space="preserve"> PAGEREF _Toc242906216 \h </w:instrText>
             </w:r>
             <w:r>
               <w:rPr>
@@ -1587,7 +1587,7 @@
               <w14:ligatures w14:val="standardContextual"/>
             </w:rPr>
           </w:pPr>
-          <w:hyperlink w:anchor="_Toc242640904" w:history="1">
+          <w:hyperlink w:anchor="_Toc242906217" w:history="1">
             <w:r>
               <w:rPr>
                 <w:rStyle w:val="Hyperlink"/>
@@ -1616,7 +1616,7 @@
                 <w:noProof/>
                 <w:webHidden/>
               </w:rPr>
-              <w:instrText xml:space="preserve"> PAGEREF _Toc242640904 \h </w:instrText>
+              <w:instrText xml:space="preserve"> PAGEREF _Toc242906217 \h </w:instrText>
             </w:r>
             <w:r>
               <w:rPr>
@@ -1658,13 +1658,13 @@
               <w14:ligatures w14:val="standardContextual"/>
             </w:rPr>
           </w:pPr>
-          <w:hyperlink w:anchor="_Toc242640905" w:history="1">
+          <w:hyperlink w:anchor="_Toc242906218" w:history="1">
             <w:r>
               <w:rPr>
                 <w:rStyle w:val="Hyperlink"/>
                 <w:noProof/>
               </w:rPr>
-              <w:t>References</w:t>
+              <w:t>Data Sources</w:t>
             </w:r>
             <w:r>
               <w:rPr>
@@ -1685,7 +1685,7 @@
                 <w:noProof/>
                 <w:webHidden/>
               </w:rPr>
-              <w:instrText xml:space="preserve"> PAGEREF _Toc242640905 \h </w:instrText>
+              <w:instrText xml:space="preserve"> PAGEREF _Toc242906218 \h </w:instrText>
             </w:r>
             <w:r>
               <w:rPr>
@@ -1727,12 +1727,219 @@
               <w14:ligatures w14:val="standardContextual"/>
             </w:rPr>
           </w:pPr>
-          <w:hyperlink w:anchor="_Toc242640906" w:history="1">
+          <w:hyperlink w:anchor="_Toc242906219" w:history="1">
             <w:r>
               <w:rPr>
                 <w:rStyle w:val="Hyperlink"/>
                 <w:noProof/>
               </w:rPr>
+              <w:t>Expected Deliverables</w:t>
+            </w:r>
+            <w:r>
+              <w:rPr>
+                <w:noProof/>
+                <w:webHidden/>
+              </w:rPr>
+              <w:tab/>
+            </w:r>
+            <w:r>
+              <w:rPr>
+                <w:noProof/>
+                <w:webHidden/>
+              </w:rPr>
+              <w:fldChar w:fldCharType="begin"/>
+            </w:r>
+            <w:r>
+              <w:rPr>
+                <w:noProof/>
+                <w:webHidden/>
+              </w:rPr>
+              <w:instrText xml:space="preserve"> PAGEREF _Toc242906219 \h </w:instrText>
+            </w:r>
+            <w:r>
+              <w:rPr>
+                <w:noProof/>
+                <w:webHidden/>
+              </w:rPr>
+            </w:r>
+            <w:r>
+              <w:rPr>
+                <w:noProof/>
+                <w:webHidden/>
+              </w:rPr>
+              <w:fldChar w:fldCharType="separate"/>
+            </w:r>
+            <w:r>
+              <w:rPr>
+                <w:noProof/>
+                <w:webHidden/>
+              </w:rPr>
+              <w:t>6</w:t>
+            </w:r>
+            <w:r>
+              <w:rPr>
+                <w:noProof/>
+                <w:webHidden/>
+              </w:rPr>
+              <w:fldChar w:fldCharType="end"/>
+            </w:r>
+          </w:hyperlink>
+        </w:p>
+        <w:p>
+          <w:pPr>
+            <w:pStyle w:val="TOC1"/>
+            <w:rPr>
+              <w:rFonts w:asciiTheme="minorHAnsi" w:eastAsiaTheme="minorEastAsia" w:hAnsiTheme="minorHAnsi" w:cstheme="minorBidi"/>
+              <w:noProof/>
+              <w:kern w:val="2"/>
+              <w:lang w:val="en-GB" w:eastAsia="en-GB"/>
+              <w14:ligatures w14:val="standardContextual"/>
+            </w:rPr>
+          </w:pPr>
+          <w:hyperlink w:anchor="_Toc242906220" w:history="1">
+            <w:r>
+              <w:rPr>
+                <w:rStyle w:val="Hyperlink"/>
+                <w:noProof/>
+              </w:rPr>
+              <w:t>Project Timeline</w:t>
+            </w:r>
+            <w:r>
+              <w:rPr>
+                <w:noProof/>
+                <w:webHidden/>
+              </w:rPr>
+              <w:tab/>
+            </w:r>
+            <w:r>
+              <w:rPr>
+                <w:noProof/>
+                <w:webHidden/>
+              </w:rPr>
+              <w:fldChar w:fldCharType="begin"/>
+            </w:r>
+            <w:r>
+              <w:rPr>
+                <w:noProof/>
+                <w:webHidden/>
+              </w:rPr>
+              <w:instrText xml:space="preserve"> PAGEREF _Toc242906220 \h </w:instrText>
+            </w:r>
+            <w:r>
+              <w:rPr>
+                <w:noProof/>
+                <w:webHidden/>
+              </w:rPr>
+            </w:r>
+            <w:r>
+              <w:rPr>
+                <w:noProof/>
+                <w:webHidden/>
+              </w:rPr>
+              <w:fldChar w:fldCharType="separate"/>
+            </w:r>
+            <w:r>
+              <w:rPr>
+                <w:noProof/>
+                <w:webHidden/>
+              </w:rPr>
+              <w:t>7</w:t>
+            </w:r>
+            <w:r>
+              <w:rPr>
+                <w:noProof/>
+                <w:webHidden/>
+              </w:rPr>
+              <w:fldChar w:fldCharType="end"/>
+            </w:r>
+          </w:hyperlink>
+        </w:p>
+        <w:p>
+          <w:pPr>
+            <w:pStyle w:val="TOC1"/>
+            <w:rPr>
+              <w:rFonts w:asciiTheme="minorHAnsi" w:eastAsiaTheme="minorEastAsia" w:hAnsiTheme="minorHAnsi" w:cstheme="minorBidi"/>
+              <w:noProof/>
+              <w:kern w:val="2"/>
+              <w:lang w:val="en-GB" w:eastAsia="en-GB"/>
+              <w14:ligatures w14:val="standardContextual"/>
+            </w:rPr>
+          </w:pPr>
+          <w:hyperlink w:anchor="_Toc242906221" w:history="1">
+            <w:r>
+              <w:rPr>
+                <w:rStyle w:val="Hyperlink"/>
+                <w:noProof/>
+              </w:rPr>
+              <w:t>References</w:t>
+            </w:r>
+            <w:r>
+              <w:rPr>
+                <w:noProof/>
+                <w:webHidden/>
+              </w:rPr>
+              <w:tab/>
+            </w:r>
+            <w:r>
+              <w:rPr>
+                <w:noProof/>
+                <w:webHidden/>
+              </w:rPr>
+              <w:fldChar w:fldCharType="begin"/>
+            </w:r>
+            <w:r>
+              <w:rPr>
+                <w:noProof/>
+                <w:webHidden/>
+              </w:rPr>
+              <w:instrText xml:space="preserve"> PAGEREF _Toc242906221 \h </w:instrText>
+            </w:r>
+            <w:r>
+              <w:rPr>
+                <w:noProof/>
+                <w:webHidden/>
+              </w:rPr>
+            </w:r>
+            <w:r>
+              <w:rPr>
+                <w:noProof/>
+                <w:webHidden/>
+              </w:rPr>
+              <w:fldChar w:fldCharType="separate"/>
+            </w:r>
+            <w:r>
+              <w:rPr>
+                <w:noProof/>
+                <w:webHidden/>
+              </w:rPr>
+              <w:t>8</w:t>
+            </w:r>
+            <w:r>
+              <w:rPr>
+                <w:noProof/>
+                <w:webHidden/>
+              </w:rPr>
+              <w:fldChar w:fldCharType="end"/>
+            </w:r>
+          </w:hyperlink>
+        </w:p>
+        <w:p>
+          <w:pPr>
+            <w:pStyle w:val="TOC1"/>
+            <w:rPr>
+              <w:rFonts w:asciiTheme="minorHAnsi" w:eastAsiaTheme="minorEastAsia" w:hAnsiTheme="minorHAnsi" w:cstheme="minorBidi"/>
+              <w:noProof/>
+              <w:kern w:val="2"/>
+              <w:lang w:val="en-GB" w:eastAsia="en-GB"/>
+              <w14:ligatures w14:val="standardContextual"/>
+            </w:rPr>
+          </w:pPr>
+          <w:hyperlink w:anchor="_Toc242906222" w:history="1">
+            <w:r>
+              <w:rPr>
+                <w:rStyle w:val="Hyperlink"/>
+                <w:noProof/>
+              </w:rPr>
               <w:t>Appendix</w:t>
             </w:r>
             <w:r>
@@ -1754,7 +1961,7 @@
                 <w:noProof/>
                 <w:webHidden/>
               </w:rPr>
-              <w:instrText xml:space="preserve"> PAGEREF _Toc242640906 \h </w:instrText>
+              <w:instrText xml:space="preserve"> PAGEREF _Toc242906222 \h </w:instrText>
             </w:r>
             <w:r>
               <w:rPr>
@@ -1774,7 +1981,7 @@
                 <w:noProof/>
                 <w:webHidden/>
               </w:rPr>
-              <w:t>7</w:t>
+              <w:t>9</w:t>
             </w:r>
             <w:r>
               <w:rPr>
@@ -1809,7 +2016,7 @@
       <w:pPr>
         <w:pStyle w:val="Heading1"/>
       </w:pPr>
-      <w:bookmarkStart w:id="1" w:name="_Toc242640897"/>
+      <w:bookmarkStart w:id="1" w:name="_Toc242906210"/>
       <w:r>
         <w:lastRenderedPageBreak/>
         <w:t>Introduction</w:t>
@@ -1845,7 +2052,7 @@
       <w:pPr>
         <w:pStyle w:val="Heading1"/>
       </w:pPr>
-      <w:bookmarkStart w:id="2" w:name="_Toc242640898"/>
+      <w:bookmarkStart w:id="2" w:name="_Toc242906211"/>
       <w:r>
         <w:t>Problem Definition</w:t>
       </w:r>
@@ -1894,7 +2101,7 @@
       <w:pPr>
         <w:pStyle w:val="Heading1"/>
       </w:pPr>
-      <w:bookmarkStart w:id="3" w:name="_Toc242640899"/>
+      <w:bookmarkStart w:id="3" w:name="_Toc242906212"/>
       <w:r>
         <w:t>Aim and Objectives</w:t>
       </w:r>
@@ -1908,7 +2115,7 @@
           <w:lang w:val="en-GB" w:eastAsia="en-GB"/>
         </w:rPr>
       </w:pPr>
-      <w:bookmarkStart w:id="4" w:name="_Toc242640900"/>
+      <w:bookmarkStart w:id="4" w:name="_Toc242906213"/>
       <w:r>
         <w:rPr>
           <w:rStyle w:val="Strong"/>
@@ -1927,7 +2134,7 @@
       <w:pPr>
         <w:pStyle w:val="Heading3"/>
       </w:pPr>
-      <w:bookmarkStart w:id="5" w:name="_Toc242640901"/>
+      <w:bookmarkStart w:id="5" w:name="_Toc242906214"/>
       <w:r>
         <w:rPr>
           <w:rStyle w:val="Strong"/>
@@ -2007,7 +2214,7 @@
         <w:pStyle w:val="Heading1"/>
       </w:pPr>
       <w:bookmarkStart w:id="6" w:name="_Toc242631585"/>
-      <w:bookmarkStart w:id="7" w:name="_Toc242640902"/>
+      <w:bookmarkStart w:id="7" w:name="_Toc242906215"/>
       <w:r>
         <w:lastRenderedPageBreak/>
         <w:t>Scope</w:t>
@@ -2059,7 +2266,7 @@
           <w:lang w:val="en-GB" w:eastAsia="en-GB"/>
         </w:rPr>
       </w:pPr>
-      <w:bookmarkStart w:id="8" w:name="_Toc242640903"/>
+      <w:bookmarkStart w:id="8" w:name="_Toc242906216"/>
       <w:r>
         <w:t>Methodology</w:t>
       </w:r>
@@ -2119,7 +2326,7 @@
       <w:pPr>
         <w:pStyle w:val="Heading3"/>
       </w:pPr>
-      <w:bookmarkStart w:id="9" w:name="_Toc242640904"/>
+      <w:bookmarkStart w:id="9" w:name="_Toc242906217"/>
       <w:r>
         <w:rPr>
           <w:rStyle w:val="Strong"/>
@@ -2329,10 +2536,12 @@
           <w:lang w:val="en-GB" w:eastAsia="en-GB"/>
         </w:rPr>
       </w:pPr>
+      <w:bookmarkStart w:id="10" w:name="_Toc242906218"/>
       <w:r>
         <w:lastRenderedPageBreak/>
         <w:t>Data Sources</w:t>
       </w:r>
+      <w:bookmarkEnd w:id="10"/>
     </w:p>
     <w:p>
       <w:r>
@@ -2378,9 +2587,11 @@
           <w:lang w:val="en-GB" w:eastAsia="en-GB"/>
         </w:rPr>
       </w:pPr>
+      <w:bookmarkStart w:id="11" w:name="_Toc242906219"/>
       <w:r>
         <w:t>Expected Deliverables</w:t>
       </w:r>
+      <w:bookmarkEnd w:id="11"/>
     </w:p>
     <w:p>
       <w:pPr>
@@ -2406,14 +2617,399 @@
     </w:p>
     <w:p>
       <w:r>
-        <w:t>The project code, notebooks and documentation will be available in my GitHub repository</w:t>
-      </w:r>
-      <w:r>
-        <w:t xml:space="preserve"> described in the cover page</w:t>
+        <w:t>The project code, notebooks and documentation will be available in my GitHub repository described in the cover page.</w:t>
+      </w:r>
+    </w:p>
+    <w:p/>
+    <w:p>
+      <w:pPr>
+        <w:pStyle w:val="Heading1"/>
+      </w:pPr>
+      <w:bookmarkStart w:id="12" w:name="_Toc242906220"/>
+      <w:r>
+        <w:t>Project Timeline</w:t>
+      </w:r>
+      <w:bookmarkEnd w:id="12"/>
+    </w:p>
+    <w:p>
+      <w:pPr>
+        <w:rPr>
+          <w:rFonts w:ascii="Times New Roman" w:eastAsia="Times New Roman" w:hAnsi="Times New Roman" w:cs="Times New Roman"/>
+          <w:lang w:val="en-GB" w:eastAsia="en-GB"/>
+        </w:rPr>
+      </w:pPr>
+      <w:r>
+        <w:t>I made a timeline</w:t>
+      </w:r>
+      <w:r>
+        <w:t xml:space="preserve"> (Figure 2) </w:t>
+      </w:r>
+      <w:r>
+        <w:t xml:space="preserve"> to show what I plan to do during my project, from October 2026 to May 2027. It shows the main steps and when I expect to finish them.</w:t>
+      </w:r>
+    </w:p>
+    <w:p>
+      <w:r>
+        <w:t>The dates might change depending on how the project goes</w:t>
       </w:r>
       <w:r>
         <w:t>.</w:t>
       </w:r>
+    </w:p>
+    <w:p/>
+    <w:p>
+      <w:pPr>
+        <w:keepNext/>
+      </w:pPr>
+      <w:r>
+        <w:drawing>
+          <wp:inline distT="0" distB="0" distL="0" distR="0" wp14:anchorId="47D36DB3" wp14:editId="7E14FD0D">
+            <wp:extent cx="6164580" cy="2605570"/>
+            <wp:effectExtent l="0" t="0" r="0" b="0"/>
+            <wp:docPr id="550001191" name="Picture 1"/>
+            <wp:cNvGraphicFramePr>
+              <a:graphicFrameLocks xmlns:a="http://schemas.openxmlformats.org/drawingml/2006/main" noChangeAspect="1"/>
+            </wp:cNvGraphicFramePr>
+            <a:graphic xmlns:a="http://schemas.openxmlformats.org/drawingml/2006/main">
+              <a:graphicData uri="http://schemas.openxmlformats.org/drawingml/2006/picture">
+                <pic:pic xmlns:pic="http://schemas.openxmlformats.org/drawingml/2006/picture">
+                  <pic:nvPicPr>
+                    <pic:cNvPr id="550001191" name=""/>
+                    <pic:cNvPicPr/>
+                  </pic:nvPicPr>
+                  <pic:blipFill>
+                    <a:blip r:embed="rId12"/>
+                    <a:stretch>
+                      <a:fillRect/>
+                    </a:stretch>
+                  </pic:blipFill>
+                  <pic:spPr>
+                    <a:xfrm>
+                      <a:off x="0" y="0"/>
+                      <a:ext cx="6173285" cy="2609249"/>
+                    </a:xfrm>
+                    <a:prstGeom prst="rect">
+                      <a:avLst/>
+                    </a:prstGeom>
+                  </pic:spPr>
+                </pic:pic>
+              </a:graphicData>
+            </a:graphic>
+          </wp:inline>
+        </w:drawing>
+      </w:r>
+    </w:p>
+    <w:p>
+      <w:pPr>
+        <w:pStyle w:val="Caption"/>
+        <w:jc w:val="center"/>
+      </w:pPr>
+      <w:r>
+        <w:t xml:space="preserve">Figure </w:t>
+      </w:r>
+      <w:r>
+        <w:fldChar w:fldCharType="begin"/>
+      </w:r>
+      <w:r>
+        <w:instrText xml:space="preserve"> SEQ Figure \* ARABIC </w:instrText>
+      </w:r>
+      <w:r>
+        <w:fldChar w:fldCharType="separate"/>
+      </w:r>
+      <w:r>
+        <w:rPr>
+          <w:noProof/>
+        </w:rPr>
+        <w:t>2</w:t>
+      </w:r>
+      <w:r>
+        <w:fldChar w:fldCharType="end"/>
+      </w:r>
+      <w:r>
+        <w:t xml:space="preserve"> - </w:t>
+      </w:r>
+      <w:r>
+        <w:t>Capstone Project Timeline (October 2026 – May 2027)</w:t>
+      </w:r>
+    </w:p>
+    <w:p>
+      <w:pPr>
+        <w:keepNext/>
+        <w:jc w:val="center"/>
+      </w:pPr>
+    </w:p>
+    <w:p>
+      <w:pPr>
+        <w:pStyle w:val="Caption"/>
+        <w:jc w:val="center"/>
+      </w:pPr>
+    </w:p>
+    <w:p/>
+    <w:p/>
+    <w:p/>
+    <w:p>
+      <w:pPr>
+        <w:pStyle w:val="Heading1"/>
+      </w:pPr>
+      <w:bookmarkStart w:id="13" w:name="_Toc242906221"/>
+      <w:r>
+        <w:lastRenderedPageBreak/>
+        <w:t>References</w:t>
+      </w:r>
+      <w:bookmarkEnd w:id="13"/>
+    </w:p>
+    <w:p>
+      <w:pPr>
+        <w:rPr>
+          <w:lang w:val="en-GB" w:eastAsia="en-GB"/>
+        </w:rPr>
+      </w:pPr>
+      <w:r>
+        <w:rPr>
+          <w:lang w:val="en-GB" w:eastAsia="en-GB"/>
+        </w:rPr>
+        <w:t>Bts.gov. (2018). </w:t>
+      </w:r>
+      <w:r>
+        <w:rPr>
+          <w:i/>
+          <w:iCs/>
+          <w:lang w:val="en-GB" w:eastAsia="en-GB"/>
+        </w:rPr>
+        <w:t>OST_R | BTS | Transtats</w:t>
+      </w:r>
+      <w:r>
+        <w:rPr>
+          <w:lang w:val="en-GB" w:eastAsia="en-GB"/>
+        </w:rPr>
+        <w:t xml:space="preserve">. [online] Available at: https://www.transtats.bts.gov [Accessed </w:t>
+      </w:r>
+      <w:r>
+        <w:rPr>
+          <w:lang w:val="en-GB" w:eastAsia="en-GB"/>
+        </w:rPr>
+        <w:t xml:space="preserve">05 </w:t>
+      </w:r>
+      <w:r>
+        <w:rPr>
+          <w:lang w:val="en-GB" w:eastAsia="en-GB"/>
+        </w:rPr>
+        <w:t>Oct. 2026].</w:t>
+      </w:r>
+    </w:p>
+    <w:p>
+      <w:r>
+        <w:t>www.eurocontrol.int. (n.d.).</w:t>
+      </w:r>
+      <w:r>
+        <w:rPr>
+          <w:rStyle w:val="apple-converted-space"/>
+          <w:color w:val="000000"/>
+        </w:rPr>
+        <w:t> </w:t>
+      </w:r>
+      <w:r>
+        <w:rPr>
+          <w:i/>
+          <w:iCs/>
+        </w:rPr>
+        <w:t>Delays – three questions and many answers</w:t>
+      </w:r>
+      <w:r>
+        <w:t>. [online] Available at: https://www.eurocontrol.int/news/delays-three-questions-and-many-answers [Accessed 9 Oct. 2026].</w:t>
+      </w:r>
+    </w:p>
+    <w:p>
+      <w:pPr>
+        <w:rPr>
+          <w:rFonts w:eastAsia="Times New Roman"/>
+          <w:lang w:val="en-GB" w:eastAsia="en-GB"/>
+        </w:rPr>
+      </w:pPr>
+      <w:r>
+        <w:rPr>
+          <w:color w:val="000000"/>
+        </w:rPr>
+        <w:t>diagrams.net</w:t>
+      </w:r>
+      <w:r>
+        <w:rPr>
+          <w:rStyle w:val="apple-converted-space"/>
+          <w:color w:val="000000"/>
+        </w:rPr>
+        <w:t> </w:t>
+      </w:r>
+      <w:r>
+        <w:rPr>
+          <w:color w:val="000000"/>
+        </w:rPr>
+        <w:t>(n.d.)</w:t>
+      </w:r>
+      <w:r>
+        <w:rPr>
+          <w:rStyle w:val="apple-converted-space"/>
+          <w:rFonts w:ascii="-webkit-standard" w:hAnsi="-webkit-standard"/>
+          <w:color w:val="000000"/>
+          <w:sz w:val="27"/>
+          <w:szCs w:val="27"/>
+        </w:rPr>
+        <w:t> </w:t>
+      </w:r>
+      <w:r>
+        <w:rPr>
+          <w:color w:val="000000"/>
+        </w:rPr>
+        <w:t>diagrams.net:</w:t>
+      </w:r>
+      <w:r>
+        <w:rPr>
+          <w:rStyle w:val="apple-converted-space"/>
+          <w:color w:val="000000"/>
+        </w:rPr>
+        <w:t> </w:t>
+      </w:r>
+      <w:r>
+        <w:rPr>
+          <w:color w:val="000000"/>
+        </w:rPr>
+        <w:t>Online</w:t>
+      </w:r>
+      <w:r>
+        <w:rPr>
+          <w:rStyle w:val="apple-converted-space"/>
+          <w:color w:val="000000"/>
+        </w:rPr>
+        <w:t> </w:t>
+      </w:r>
+      <w:r>
+        <w:rPr>
+          <w:color w:val="000000"/>
+        </w:rPr>
+        <w:t>Diagram</w:t>
+      </w:r>
+      <w:r>
+        <w:rPr>
+          <w:rStyle w:val="apple-converted-space"/>
+          <w:color w:val="000000"/>
+        </w:rPr>
+        <w:t> </w:t>
+      </w:r>
+      <w:r>
+        <w:rPr>
+          <w:color w:val="000000"/>
+        </w:rPr>
+        <w:t>Software.</w:t>
+      </w:r>
+      <w:r>
+        <w:rPr>
+          <w:rStyle w:val="apple-converted-space"/>
+          <w:color w:val="000000"/>
+        </w:rPr>
+        <w:t> </w:t>
+      </w:r>
+      <w:r>
+        <w:rPr>
+          <w:color w:val="000000"/>
+        </w:rPr>
+        <w:t>Available</w:t>
+      </w:r>
+      <w:r>
+        <w:rPr>
+          <w:rStyle w:val="apple-converted-space"/>
+          <w:color w:val="000000"/>
+        </w:rPr>
+        <w:t> </w:t>
+      </w:r>
+      <w:r>
+        <w:rPr>
+          <w:color w:val="000000"/>
+        </w:rPr>
+        <w:t>at:</w:t>
+      </w:r>
+      <w:r>
+        <w:rPr>
+          <w:rStyle w:val="apple-converted-space"/>
+          <w:color w:val="000000"/>
+        </w:rPr>
+        <w:t> </w:t>
+      </w:r>
+      <w:hyperlink r:id="rId13" w:history="1">
+        <w:r>
+          <w:rPr>
+            <w:rStyle w:val="Hyperlink"/>
+          </w:rPr>
+          <w:t>https://app.diagrams.net/</w:t>
+        </w:r>
+      </w:hyperlink>
+      <w:r>
+        <w:rPr>
+          <w:rStyle w:val="apple-converted-space"/>
+          <w:rFonts w:ascii="-webkit-standard" w:hAnsi="-webkit-standard"/>
+          <w:color w:val="000000"/>
+          <w:sz w:val="27"/>
+          <w:szCs w:val="27"/>
+        </w:rPr>
+        <w:t> </w:t>
+      </w:r>
+      <w:r>
+        <w:rPr>
+          <w:color w:val="000000"/>
+        </w:rPr>
+        <w:t>(Accessed:</w:t>
+      </w:r>
+      <w:r>
+        <w:rPr>
+          <w:rStyle w:val="apple-converted-space"/>
+          <w:color w:val="000000"/>
+        </w:rPr>
+        <w:t> </w:t>
+      </w:r>
+      <w:r>
+        <w:rPr>
+          <w:color w:val="000000"/>
+        </w:rPr>
+        <w:t>10</w:t>
+      </w:r>
+      <w:r>
+        <w:rPr>
+          <w:rStyle w:val="apple-converted-space"/>
+          <w:color w:val="000000"/>
+        </w:rPr>
+        <w:t> </w:t>
+      </w:r>
+      <w:r>
+        <w:rPr>
+          <w:color w:val="000000"/>
+        </w:rPr>
+        <w:t>October</w:t>
+      </w:r>
+      <w:r>
+        <w:rPr>
+          <w:rStyle w:val="apple-converted-space"/>
+          <w:color w:val="000000"/>
+        </w:rPr>
+        <w:t> </w:t>
+      </w:r>
+      <w:r>
+        <w:rPr>
+          <w:color w:val="000000"/>
+        </w:rPr>
+        <w:t>2026).</w:t>
+      </w:r>
+    </w:p>
+    <w:p>
+      <w:pPr>
+        <w:rPr>
+          <w:lang w:val="en-GB" w:eastAsia="en-GB"/>
+        </w:rPr>
+      </w:pPr>
+    </w:p>
+    <w:p>
+      <w:pPr>
+        <w:rPr>
+          <w:lang w:val="en-GB" w:eastAsia="en-GB"/>
+        </w:rPr>
+      </w:pPr>
     </w:p>
     <w:p/>
     <w:p/>
@@ -2428,300 +3024,18 @@
     <w:p/>
     <w:p/>
     <w:p/>
-    <w:p/>
-    <w:p/>
-    <w:p/>
-    <w:p/>
-    <w:p/>
     <w:p>
       <w:pPr>
         <w:pStyle w:val="Heading1"/>
       </w:pPr>
-      <w:bookmarkStart w:id="10" w:name="_Toc242640905"/>
-      <w:r>
-        <w:lastRenderedPageBreak/>
-        <w:t>References</w:t>
-      </w:r>
-      <w:bookmarkEnd w:id="10"/>
-    </w:p>
-    <w:p>
-      <w:pPr>
-        <w:rPr>
-          <w:lang w:val="en-GB" w:eastAsia="en-GB"/>
-        </w:rPr>
-      </w:pPr>
-      <w:r>
-        <w:rPr>
-          <w:lang w:val="en-GB" w:eastAsia="en-GB"/>
-        </w:rPr>
-        <w:t>Bts.gov. (2018). </w:t>
-      </w:r>
-      <w:r>
-        <w:rPr>
-          <w:i/>
-          <w:iCs/>
-          <w:lang w:val="en-GB" w:eastAsia="en-GB"/>
-        </w:rPr>
-        <w:t>OST_R | BTS | Transtats</w:t>
-      </w:r>
-      <w:r>
-        <w:rPr>
-          <w:lang w:val="en-GB" w:eastAsia="en-GB"/>
-        </w:rPr>
-        <w:t xml:space="preserve">. [online] Available at: https://www.transtats.bts.gov [Accessed </w:t>
-      </w:r>
-      <w:r>
-        <w:rPr>
-          <w:lang w:val="en-GB" w:eastAsia="en-GB"/>
-        </w:rPr>
-        <w:t xml:space="preserve">05 </w:t>
-      </w:r>
-      <w:r>
-        <w:rPr>
-          <w:lang w:val="en-GB" w:eastAsia="en-GB"/>
-        </w:rPr>
-        <w:t>Oct. 2026].</w:t>
-      </w:r>
-    </w:p>
-    <w:p>
-      <w:r>
-        <w:t>www.eurocontrol.int. (n.d.).</w:t>
-      </w:r>
-      <w:r>
-        <w:rPr>
-          <w:rStyle w:val="apple-converted-space"/>
-          <w:color w:val="000000"/>
-        </w:rPr>
-        <w:t> </w:t>
-      </w:r>
-      <w:r>
-        <w:rPr>
-          <w:i/>
-          <w:iCs/>
-        </w:rPr>
-        <w:t>Delays – three questions and many answers</w:t>
-      </w:r>
-      <w:r>
-        <w:t>. [online] Available at: https://www.eurocontrol.int/news/delays-three-questions-and-many-answers [Accessed 9 Oct. 2026].</w:t>
-      </w:r>
-    </w:p>
-    <w:p>
-      <w:pPr>
-        <w:rPr>
-          <w:rFonts w:eastAsia="Times New Roman"/>
-          <w:lang w:val="en-GB" w:eastAsia="en-GB"/>
-        </w:rPr>
-      </w:pPr>
-      <w:r>
-        <w:rPr>
-          <w:color w:val="000000"/>
-        </w:rPr>
-        <w:t>diagrams.net</w:t>
-      </w:r>
-      <w:r>
-        <w:rPr>
-          <w:rStyle w:val="apple-converted-space"/>
-          <w:color w:val="000000"/>
-        </w:rPr>
-        <w:t> </w:t>
-      </w:r>
-      <w:r>
-        <w:rPr>
-          <w:color w:val="000000"/>
-        </w:rPr>
-        <w:t>(n.d.)</w:t>
-      </w:r>
-      <w:r>
-        <w:rPr>
-          <w:rStyle w:val="apple-converted-space"/>
-          <w:rFonts w:ascii="-webkit-standard" w:hAnsi="-webkit-standard"/>
-          <w:color w:val="000000"/>
-          <w:sz w:val="27"/>
-          <w:szCs w:val="27"/>
-        </w:rPr>
-        <w:t> </w:t>
-      </w:r>
-      <w:r>
-        <w:rPr>
-          <w:color w:val="000000"/>
-        </w:rPr>
-        <w:t>diagrams.net:</w:t>
-      </w:r>
-      <w:r>
-        <w:rPr>
-          <w:rStyle w:val="apple-converted-space"/>
-          <w:color w:val="000000"/>
-        </w:rPr>
-        <w:t> </w:t>
-      </w:r>
-      <w:r>
-        <w:rPr>
-          <w:color w:val="000000"/>
-        </w:rPr>
-        <w:t>Online</w:t>
-      </w:r>
-      <w:r>
-        <w:rPr>
-          <w:rStyle w:val="apple-converted-space"/>
-          <w:color w:val="000000"/>
-        </w:rPr>
-        <w:t> </w:t>
-      </w:r>
-      <w:r>
-        <w:rPr>
-          <w:color w:val="000000"/>
-        </w:rPr>
-        <w:t>Diagram</w:t>
-      </w:r>
-      <w:r>
-        <w:rPr>
-          <w:rStyle w:val="apple-converted-space"/>
-          <w:color w:val="000000"/>
-        </w:rPr>
-        <w:t> </w:t>
-      </w:r>
-      <w:r>
-        <w:rPr>
-          <w:color w:val="000000"/>
-        </w:rPr>
-        <w:t>Software.</w:t>
-      </w:r>
-      <w:r>
-        <w:rPr>
-          <w:rStyle w:val="apple-converted-space"/>
-          <w:color w:val="000000"/>
-        </w:rPr>
-        <w:t> </w:t>
-      </w:r>
-      <w:r>
-        <w:rPr>
-          <w:color w:val="000000"/>
-        </w:rPr>
-        <w:t>Available</w:t>
-      </w:r>
-      <w:r>
-        <w:rPr>
-          <w:rStyle w:val="apple-converted-space"/>
-          <w:color w:val="000000"/>
-        </w:rPr>
-        <w:t> </w:t>
-      </w:r>
-      <w:r>
-        <w:rPr>
-          <w:color w:val="000000"/>
-        </w:rPr>
-        <w:t>at:</w:t>
-      </w:r>
-      <w:r>
-        <w:rPr>
-          <w:rStyle w:val="apple-converted-space"/>
-          <w:color w:val="000000"/>
-        </w:rPr>
-        <w:t> </w:t>
-      </w:r>
-      <w:hyperlink r:id="rId12" w:history="1">
-        <w:r>
-          <w:rPr>
-            <w:rStyle w:val="Hyperlink"/>
-          </w:rPr>
-          <w:t>https://app.diagrams.net/</w:t>
-        </w:r>
-      </w:hyperlink>
-      <w:r>
-        <w:rPr>
-          <w:rStyle w:val="apple-converted-space"/>
-          <w:rFonts w:ascii="-webkit-standard" w:hAnsi="-webkit-standard"/>
-          <w:color w:val="000000"/>
-          <w:sz w:val="27"/>
-          <w:szCs w:val="27"/>
-        </w:rPr>
-        <w:t> </w:t>
-      </w:r>
-      <w:r>
-        <w:rPr>
-          <w:color w:val="000000"/>
-        </w:rPr>
-        <w:t>(Accessed:</w:t>
-      </w:r>
-      <w:r>
-        <w:rPr>
-          <w:rStyle w:val="apple-converted-space"/>
-          <w:color w:val="000000"/>
-        </w:rPr>
-        <w:t> </w:t>
-      </w:r>
-      <w:r>
-        <w:rPr>
-          <w:color w:val="000000"/>
-        </w:rPr>
-        <w:t>10</w:t>
-      </w:r>
-      <w:r>
-        <w:rPr>
-          <w:rStyle w:val="apple-converted-space"/>
-          <w:color w:val="000000"/>
-        </w:rPr>
-        <w:t> </w:t>
-      </w:r>
-      <w:r>
-        <w:rPr>
-          <w:color w:val="000000"/>
-        </w:rPr>
-        <w:t>October</w:t>
-      </w:r>
-      <w:r>
-        <w:rPr>
-          <w:rStyle w:val="apple-converted-space"/>
-          <w:color w:val="000000"/>
-        </w:rPr>
-        <w:t> </w:t>
-      </w:r>
-      <w:r>
-        <w:rPr>
-          <w:color w:val="000000"/>
-        </w:rPr>
-        <w:t>2026).</w:t>
-      </w:r>
-    </w:p>
-    <w:p>
-      <w:pPr>
-        <w:rPr>
-          <w:lang w:val="en-GB" w:eastAsia="en-GB"/>
-        </w:rPr>
-      </w:pPr>
-    </w:p>
-    <w:p>
-      <w:pPr>
-        <w:rPr>
-          <w:lang w:val="en-GB" w:eastAsia="en-GB"/>
-        </w:rPr>
-      </w:pPr>
-    </w:p>
-    <w:p/>
-    <w:p/>
-    <w:p/>
-    <w:p/>
-    <w:p/>
-    <w:p/>
-    <w:p/>
-    <w:p/>
-    <w:p/>
-    <w:p/>
-    <w:p/>
-    <w:p/>
-    <w:p/>
-    <w:p>
-      <w:pPr>
-        <w:pStyle w:val="Heading1"/>
-      </w:pPr>
-      <w:bookmarkStart w:id="11" w:name="_heading=h.kfkjs3rwl2c1" w:colFirst="0" w:colLast="0"/>
-      <w:bookmarkStart w:id="12" w:name="_Toc242640906"/>
-      <w:bookmarkEnd w:id="11"/>
+      <w:bookmarkStart w:id="14" w:name="_heading=h.kfkjs3rwl2c1" w:colFirst="0" w:colLast="0"/>
+      <w:bookmarkStart w:id="15" w:name="_Toc242906222"/>
+      <w:bookmarkEnd w:id="14"/>
       <w:r>
         <w:lastRenderedPageBreak/>
         <w:t>Appendix</w:t>
       </w:r>
-      <w:bookmarkEnd w:id="12"/>
+      <w:bookmarkEnd w:id="15"/>
     </w:p>
     <w:p/>
     <w:p>
@@ -2743,7 +3057,7 @@
     <w:p/>
     <w:p/>
     <w:sectPr>
-      <w:footerReference w:type="default" r:id="rId13"/>
+      <w:footerReference w:type="default" r:id="rId14"/>
       <w:pgSz w:w="11906" w:h="16838"/>
       <w:pgMar w:top="1440" w:right="1440" w:bottom="1440" w:left="1440" w:header="708" w:footer="708" w:gutter="0"/>
       <w:pgNumType w:start="1"/>

</xml_diff>

<commit_message>
Add Ethics and Legal Considerations
</commit_message>
<xml_diff>
--- a/CA1-Capstone-sba23349-Proposal.docx
+++ b/CA1-Capstone-sba23349-Proposal.docx
@@ -1061,6 +1061,14 @@
         </w:rPr>
         <w:t>Contents</w:t>
       </w:r>
+      <w:r>
+        <w:rPr>
+          <w:color w:val="156082" w:themeColor="accent1"/>
+          <w:sz w:val="32"/>
+          <w:szCs w:val="32"/>
+        </w:rPr>
+        <w:t xml:space="preserve"> Table</w:t>
+      </w:r>
     </w:p>
     <w:sdt>
       <w:sdtPr>
@@ -1074,6 +1082,9 @@
         <w:p>
           <w:pPr>
             <w:pStyle w:val="TOC1"/>
+            <w:tabs>
+              <w:tab w:val="left" w:pos="480"/>
+            </w:tabs>
             <w:rPr>
               <w:rFonts w:asciiTheme="minorHAnsi" w:eastAsiaTheme="minorEastAsia" w:hAnsiTheme="minorHAnsi" w:cstheme="minorBidi"/>
               <w:noProof/>
@@ -1091,12 +1102,29 @@
           <w:r>
             <w:fldChar w:fldCharType="separate"/>
           </w:r>
-          <w:hyperlink w:anchor="_Toc242906210" w:history="1">
+          <w:hyperlink w:anchor="_Toc243658834" w:history="1">
             <w:r>
               <w:rPr>
                 <w:rStyle w:val="Hyperlink"/>
                 <w:noProof/>
               </w:rPr>
+              <w:t>1.</w:t>
+            </w:r>
+            <w:r>
+              <w:rPr>
+                <w:rFonts w:asciiTheme="minorHAnsi" w:eastAsiaTheme="minorEastAsia" w:hAnsiTheme="minorHAnsi" w:cstheme="minorBidi"/>
+                <w:noProof/>
+                <w:kern w:val="2"/>
+                <w:lang w:val="en-GB" w:eastAsia="en-GB"/>
+                <w14:ligatures w14:val="standardContextual"/>
+              </w:rPr>
+              <w:tab/>
+            </w:r>
+            <w:r>
+              <w:rPr>
+                <w:rStyle w:val="Hyperlink"/>
+                <w:noProof/>
+              </w:rPr>
               <w:t>Introduction</w:t>
             </w:r>
             <w:r>
@@ -1118,7 +1146,7 @@
                 <w:noProof/>
                 <w:webHidden/>
               </w:rPr>
-              <w:instrText xml:space="preserve"> PAGEREF _Toc242906210 \h </w:instrText>
+              <w:instrText xml:space="preserve"> PAGEREF _Toc243658834 \h </w:instrText>
             </w:r>
             <w:r>
               <w:rPr>
@@ -1152,6 +1180,9 @@
         <w:p>
           <w:pPr>
             <w:pStyle w:val="TOC1"/>
+            <w:tabs>
+              <w:tab w:val="left" w:pos="480"/>
+            </w:tabs>
             <w:rPr>
               <w:rFonts w:asciiTheme="minorHAnsi" w:eastAsiaTheme="minorEastAsia" w:hAnsiTheme="minorHAnsi" w:cstheme="minorBidi"/>
               <w:noProof/>
@@ -1160,12 +1191,29 @@
               <w14:ligatures w14:val="standardContextual"/>
             </w:rPr>
           </w:pPr>
-          <w:hyperlink w:anchor="_Toc242906211" w:history="1">
+          <w:hyperlink w:anchor="_Toc243658835" w:history="1">
             <w:r>
               <w:rPr>
                 <w:rStyle w:val="Hyperlink"/>
                 <w:noProof/>
               </w:rPr>
+              <w:t>2.</w:t>
+            </w:r>
+            <w:r>
+              <w:rPr>
+                <w:rFonts w:asciiTheme="minorHAnsi" w:eastAsiaTheme="minorEastAsia" w:hAnsiTheme="minorHAnsi" w:cstheme="minorBidi"/>
+                <w:noProof/>
+                <w:kern w:val="2"/>
+                <w:lang w:val="en-GB" w:eastAsia="en-GB"/>
+                <w14:ligatures w14:val="standardContextual"/>
+              </w:rPr>
+              <w:tab/>
+            </w:r>
+            <w:r>
+              <w:rPr>
+                <w:rStyle w:val="Hyperlink"/>
+                <w:noProof/>
+              </w:rPr>
               <w:t>Problem Definition</w:t>
             </w:r>
             <w:r>
@@ -1187,7 +1235,7 @@
                 <w:noProof/>
                 <w:webHidden/>
               </w:rPr>
-              <w:instrText xml:space="preserve"> PAGEREF _Toc242906211 \h </w:instrText>
+              <w:instrText xml:space="preserve"> PAGEREF _Toc243658835 \h </w:instrText>
             </w:r>
             <w:r>
               <w:rPr>
@@ -1221,6 +1269,9 @@
         <w:p>
           <w:pPr>
             <w:pStyle w:val="TOC1"/>
+            <w:tabs>
+              <w:tab w:val="left" w:pos="480"/>
+            </w:tabs>
             <w:rPr>
               <w:rFonts w:asciiTheme="minorHAnsi" w:eastAsiaTheme="minorEastAsia" w:hAnsiTheme="minorHAnsi" w:cstheme="minorBidi"/>
               <w:noProof/>
@@ -1229,12 +1280,29 @@
               <w14:ligatures w14:val="standardContextual"/>
             </w:rPr>
           </w:pPr>
-          <w:hyperlink w:anchor="_Toc242906212" w:history="1">
+          <w:hyperlink w:anchor="_Toc243658836" w:history="1">
             <w:r>
               <w:rPr>
                 <w:rStyle w:val="Hyperlink"/>
                 <w:noProof/>
               </w:rPr>
+              <w:t>3.</w:t>
+            </w:r>
+            <w:r>
+              <w:rPr>
+                <w:rFonts w:asciiTheme="minorHAnsi" w:eastAsiaTheme="minorEastAsia" w:hAnsiTheme="minorHAnsi" w:cstheme="minorBidi"/>
+                <w:noProof/>
+                <w:kern w:val="2"/>
+                <w:lang w:val="en-GB" w:eastAsia="en-GB"/>
+                <w14:ligatures w14:val="standardContextual"/>
+              </w:rPr>
+              <w:tab/>
+            </w:r>
+            <w:r>
+              <w:rPr>
+                <w:rStyle w:val="Hyperlink"/>
+                <w:noProof/>
+              </w:rPr>
               <w:t>Aim and Objectives</w:t>
             </w:r>
             <w:r>
@@ -1256,7 +1324,7 @@
                 <w:noProof/>
                 <w:webHidden/>
               </w:rPr>
-              <w:instrText xml:space="preserve"> PAGEREF _Toc242906212 \h </w:instrText>
+              <w:instrText xml:space="preserve"> PAGEREF _Toc243658836 \h </w:instrText>
             </w:r>
             <w:r>
               <w:rPr>
@@ -1301,12 +1369,10 @@
               <w14:ligatures w14:val="standardContextual"/>
             </w:rPr>
           </w:pPr>
-          <w:hyperlink w:anchor="_Toc242906213" w:history="1">
+          <w:hyperlink w:anchor="_Toc243658837" w:history="1">
             <w:r>
               <w:rPr>
                 <w:rStyle w:val="Hyperlink"/>
-                <w:b/>
-                <w:bCs/>
                 <w:noProof/>
               </w:rPr>
               <w:t>Aim</w:t>
@@ -1330,7 +1396,7 @@
                 <w:noProof/>
                 <w:webHidden/>
               </w:rPr>
-              <w:instrText xml:space="preserve"> PAGEREF _Toc242906213 \h </w:instrText>
+              <w:instrText xml:space="preserve"> PAGEREF _Toc243658837 \h </w:instrText>
             </w:r>
             <w:r>
               <w:rPr>
@@ -1375,12 +1441,10 @@
               <w14:ligatures w14:val="standardContextual"/>
             </w:rPr>
           </w:pPr>
-          <w:hyperlink w:anchor="_Toc242906214" w:history="1">
+          <w:hyperlink w:anchor="_Toc243658838" w:history="1">
             <w:r>
               <w:rPr>
                 <w:rStyle w:val="Hyperlink"/>
-                <w:b/>
-                <w:bCs/>
                 <w:noProof/>
               </w:rPr>
               <w:t>Objectives</w:t>
@@ -1404,7 +1468,7 @@
                 <w:noProof/>
                 <w:webHidden/>
               </w:rPr>
-              <w:instrText xml:space="preserve"> PAGEREF _Toc242906214 \h </w:instrText>
+              <w:instrText xml:space="preserve"> PAGEREF _Toc243658838 \h </w:instrText>
             </w:r>
             <w:r>
               <w:rPr>
@@ -1438,6 +1502,9 @@
         <w:p>
           <w:pPr>
             <w:pStyle w:val="TOC1"/>
+            <w:tabs>
+              <w:tab w:val="left" w:pos="480"/>
+            </w:tabs>
             <w:rPr>
               <w:rFonts w:asciiTheme="minorHAnsi" w:eastAsiaTheme="minorEastAsia" w:hAnsiTheme="minorHAnsi" w:cstheme="minorBidi"/>
               <w:noProof/>
@@ -1446,12 +1513,29 @@
               <w14:ligatures w14:val="standardContextual"/>
             </w:rPr>
           </w:pPr>
-          <w:hyperlink w:anchor="_Toc242906215" w:history="1">
+          <w:hyperlink w:anchor="_Toc243658839" w:history="1">
             <w:r>
               <w:rPr>
                 <w:rStyle w:val="Hyperlink"/>
                 <w:noProof/>
               </w:rPr>
+              <w:t>4.</w:t>
+            </w:r>
+            <w:r>
+              <w:rPr>
+                <w:rFonts w:asciiTheme="minorHAnsi" w:eastAsiaTheme="minorEastAsia" w:hAnsiTheme="minorHAnsi" w:cstheme="minorBidi"/>
+                <w:noProof/>
+                <w:kern w:val="2"/>
+                <w:lang w:val="en-GB" w:eastAsia="en-GB"/>
+                <w14:ligatures w14:val="standardContextual"/>
+              </w:rPr>
+              <w:tab/>
+            </w:r>
+            <w:r>
+              <w:rPr>
+                <w:rStyle w:val="Hyperlink"/>
+                <w:noProof/>
+              </w:rPr>
               <w:t>Scope</w:t>
             </w:r>
             <w:r>
@@ -1473,7 +1557,7 @@
                 <w:noProof/>
                 <w:webHidden/>
               </w:rPr>
-              <w:instrText xml:space="preserve"> PAGEREF _Toc242906215 \h </w:instrText>
+              <w:instrText xml:space="preserve"> PAGEREF _Toc243658839 \h </w:instrText>
             </w:r>
             <w:r>
               <w:rPr>
@@ -1507,6 +1591,9 @@
         <w:p>
           <w:pPr>
             <w:pStyle w:val="TOC1"/>
+            <w:tabs>
+              <w:tab w:val="left" w:pos="480"/>
+            </w:tabs>
             <w:rPr>
               <w:rFonts w:asciiTheme="minorHAnsi" w:eastAsiaTheme="minorEastAsia" w:hAnsiTheme="minorHAnsi" w:cstheme="minorBidi"/>
               <w:noProof/>
@@ -1515,10 +1602,29 @@
               <w14:ligatures w14:val="standardContextual"/>
             </w:rPr>
           </w:pPr>
-          <w:hyperlink w:anchor="_Toc242906216" w:history="1">
+          <w:hyperlink w:anchor="_Toc243658840" w:history="1">
             <w:r>
               <w:rPr>
                 <w:rStyle w:val="Hyperlink"/>
+                <w:rFonts w:ascii="Times New Roman" w:eastAsia="Times New Roman" w:hAnsi="Times New Roman" w:cs="Times New Roman"/>
+                <w:noProof/>
+                <w:lang w:val="en-GB" w:eastAsia="en-GB"/>
+              </w:rPr>
+              <w:t>5.</w:t>
+            </w:r>
+            <w:r>
+              <w:rPr>
+                <w:rFonts w:asciiTheme="minorHAnsi" w:eastAsiaTheme="minorEastAsia" w:hAnsiTheme="minorHAnsi" w:cstheme="minorBidi"/>
+                <w:noProof/>
+                <w:kern w:val="2"/>
+                <w:lang w:val="en-GB" w:eastAsia="en-GB"/>
+                <w14:ligatures w14:val="standardContextual"/>
+              </w:rPr>
+              <w:tab/>
+            </w:r>
+            <w:r>
+              <w:rPr>
+                <w:rStyle w:val="Hyperlink"/>
                 <w:noProof/>
               </w:rPr>
               <w:t>Methodology</w:t>
@@ -1542,7 +1648,7 @@
                 <w:noProof/>
                 <w:webHidden/>
               </w:rPr>
-              <w:instrText xml:space="preserve"> PAGEREF _Toc242906216 \h </w:instrText>
+              <w:instrText xml:space="preserve"> PAGEREF _Toc243658840 \h </w:instrText>
             </w:r>
             <w:r>
               <w:rPr>
@@ -1587,12 +1693,10 @@
               <w14:ligatures w14:val="standardContextual"/>
             </w:rPr>
           </w:pPr>
-          <w:hyperlink w:anchor="_Toc242906217" w:history="1">
+          <w:hyperlink w:anchor="_Toc243658841" w:history="1">
             <w:r>
               <w:rPr>
                 <w:rStyle w:val="Hyperlink"/>
-                <w:b/>
-                <w:bCs/>
                 <w:noProof/>
               </w:rPr>
               <w:t>High-Level Architecture Diagram</w:t>
@@ -1616,7 +1720,7 @@
                 <w:noProof/>
                 <w:webHidden/>
               </w:rPr>
-              <w:instrText xml:space="preserve"> PAGEREF _Toc242906217 \h </w:instrText>
+              <w:instrText xml:space="preserve"> PAGEREF _Toc243658841 \h </w:instrText>
             </w:r>
             <w:r>
               <w:rPr>
@@ -1637,6 +1741,366 @@
                 <w:webHidden/>
               </w:rPr>
               <w:t>4</w:t>
+            </w:r>
+            <w:r>
+              <w:rPr>
+                <w:noProof/>
+                <w:webHidden/>
+              </w:rPr>
+              <w:fldChar w:fldCharType="end"/>
+            </w:r>
+          </w:hyperlink>
+        </w:p>
+        <w:p>
+          <w:pPr>
+            <w:pStyle w:val="TOC1"/>
+            <w:tabs>
+              <w:tab w:val="left" w:pos="480"/>
+            </w:tabs>
+            <w:rPr>
+              <w:rFonts w:asciiTheme="minorHAnsi" w:eastAsiaTheme="minorEastAsia" w:hAnsiTheme="minorHAnsi" w:cstheme="minorBidi"/>
+              <w:noProof/>
+              <w:kern w:val="2"/>
+              <w:lang w:val="en-GB" w:eastAsia="en-GB"/>
+              <w14:ligatures w14:val="standardContextual"/>
+            </w:rPr>
+          </w:pPr>
+          <w:hyperlink w:anchor="_Toc243658842" w:history="1">
+            <w:r>
+              <w:rPr>
+                <w:rStyle w:val="Hyperlink"/>
+                <w:rFonts w:ascii="Times New Roman" w:eastAsia="Times New Roman" w:hAnsi="Times New Roman" w:cs="Times New Roman"/>
+                <w:noProof/>
+                <w:lang w:val="en-GB" w:eastAsia="en-GB"/>
+              </w:rPr>
+              <w:t>6.</w:t>
+            </w:r>
+            <w:r>
+              <w:rPr>
+                <w:rFonts w:asciiTheme="minorHAnsi" w:eastAsiaTheme="minorEastAsia" w:hAnsiTheme="minorHAnsi" w:cstheme="minorBidi"/>
+                <w:noProof/>
+                <w:kern w:val="2"/>
+                <w:lang w:val="en-GB" w:eastAsia="en-GB"/>
+                <w14:ligatures w14:val="standardContextual"/>
+              </w:rPr>
+              <w:tab/>
+            </w:r>
+            <w:r>
+              <w:rPr>
+                <w:rStyle w:val="Hyperlink"/>
+                <w:noProof/>
+              </w:rPr>
+              <w:t>Data Sources</w:t>
+            </w:r>
+            <w:r>
+              <w:rPr>
+                <w:noProof/>
+                <w:webHidden/>
+              </w:rPr>
+              <w:tab/>
+            </w:r>
+            <w:r>
+              <w:rPr>
+                <w:noProof/>
+                <w:webHidden/>
+              </w:rPr>
+              <w:fldChar w:fldCharType="begin"/>
+            </w:r>
+            <w:r>
+              <w:rPr>
+                <w:noProof/>
+                <w:webHidden/>
+              </w:rPr>
+              <w:instrText xml:space="preserve"> PAGEREF _Toc243658842 \h </w:instrText>
+            </w:r>
+            <w:r>
+              <w:rPr>
+                <w:noProof/>
+                <w:webHidden/>
+              </w:rPr>
+            </w:r>
+            <w:r>
+              <w:rPr>
+                <w:noProof/>
+                <w:webHidden/>
+              </w:rPr>
+              <w:fldChar w:fldCharType="separate"/>
+            </w:r>
+            <w:r>
+              <w:rPr>
+                <w:noProof/>
+                <w:webHidden/>
+              </w:rPr>
+              <w:t>6</w:t>
+            </w:r>
+            <w:r>
+              <w:rPr>
+                <w:noProof/>
+                <w:webHidden/>
+              </w:rPr>
+              <w:fldChar w:fldCharType="end"/>
+            </w:r>
+          </w:hyperlink>
+        </w:p>
+        <w:p>
+          <w:pPr>
+            <w:pStyle w:val="TOC1"/>
+            <w:tabs>
+              <w:tab w:val="left" w:pos="480"/>
+            </w:tabs>
+            <w:rPr>
+              <w:rFonts w:asciiTheme="minorHAnsi" w:eastAsiaTheme="minorEastAsia" w:hAnsiTheme="minorHAnsi" w:cstheme="minorBidi"/>
+              <w:noProof/>
+              <w:kern w:val="2"/>
+              <w:lang w:val="en-GB" w:eastAsia="en-GB"/>
+              <w14:ligatures w14:val="standardContextual"/>
+            </w:rPr>
+          </w:pPr>
+          <w:hyperlink w:anchor="_Toc243658843" w:history="1">
+            <w:r>
+              <w:rPr>
+                <w:rStyle w:val="Hyperlink"/>
+                <w:rFonts w:ascii="Times New Roman" w:eastAsia="Times New Roman" w:hAnsi="Times New Roman" w:cs="Times New Roman"/>
+                <w:noProof/>
+                <w:lang w:val="en-GB" w:eastAsia="en-GB"/>
+              </w:rPr>
+              <w:t>7.</w:t>
+            </w:r>
+            <w:r>
+              <w:rPr>
+                <w:rFonts w:asciiTheme="minorHAnsi" w:eastAsiaTheme="minorEastAsia" w:hAnsiTheme="minorHAnsi" w:cstheme="minorBidi"/>
+                <w:noProof/>
+                <w:kern w:val="2"/>
+                <w:lang w:val="en-GB" w:eastAsia="en-GB"/>
+                <w14:ligatures w14:val="standardContextual"/>
+              </w:rPr>
+              <w:tab/>
+            </w:r>
+            <w:r>
+              <w:rPr>
+                <w:rStyle w:val="Hyperlink"/>
+                <w:noProof/>
+              </w:rPr>
+              <w:t>Expected Deliverables</w:t>
+            </w:r>
+            <w:r>
+              <w:rPr>
+                <w:noProof/>
+                <w:webHidden/>
+              </w:rPr>
+              <w:tab/>
+            </w:r>
+            <w:r>
+              <w:rPr>
+                <w:noProof/>
+                <w:webHidden/>
+              </w:rPr>
+              <w:fldChar w:fldCharType="begin"/>
+            </w:r>
+            <w:r>
+              <w:rPr>
+                <w:noProof/>
+                <w:webHidden/>
+              </w:rPr>
+              <w:instrText xml:space="preserve"> PAGEREF _Toc243658843 \h </w:instrText>
+            </w:r>
+            <w:r>
+              <w:rPr>
+                <w:noProof/>
+                <w:webHidden/>
+              </w:rPr>
+            </w:r>
+            <w:r>
+              <w:rPr>
+                <w:noProof/>
+                <w:webHidden/>
+              </w:rPr>
+              <w:fldChar w:fldCharType="separate"/>
+            </w:r>
+            <w:r>
+              <w:rPr>
+                <w:noProof/>
+                <w:webHidden/>
+              </w:rPr>
+              <w:t>6</w:t>
+            </w:r>
+            <w:r>
+              <w:rPr>
+                <w:noProof/>
+                <w:webHidden/>
+              </w:rPr>
+              <w:fldChar w:fldCharType="end"/>
+            </w:r>
+          </w:hyperlink>
+        </w:p>
+        <w:p>
+          <w:pPr>
+            <w:pStyle w:val="TOC1"/>
+            <w:tabs>
+              <w:tab w:val="left" w:pos="480"/>
+            </w:tabs>
+            <w:rPr>
+              <w:rFonts w:asciiTheme="minorHAnsi" w:eastAsiaTheme="minorEastAsia" w:hAnsiTheme="minorHAnsi" w:cstheme="minorBidi"/>
+              <w:noProof/>
+              <w:kern w:val="2"/>
+              <w:lang w:val="en-GB" w:eastAsia="en-GB"/>
+              <w14:ligatures w14:val="standardContextual"/>
+            </w:rPr>
+          </w:pPr>
+          <w:hyperlink w:anchor="_Toc243658844" w:history="1">
+            <w:r>
+              <w:rPr>
+                <w:rStyle w:val="Hyperlink"/>
+                <w:noProof/>
+              </w:rPr>
+              <w:t>8.</w:t>
+            </w:r>
+            <w:r>
+              <w:rPr>
+                <w:rFonts w:asciiTheme="minorHAnsi" w:eastAsiaTheme="minorEastAsia" w:hAnsiTheme="minorHAnsi" w:cstheme="minorBidi"/>
+                <w:noProof/>
+                <w:kern w:val="2"/>
+                <w:lang w:val="en-GB" w:eastAsia="en-GB"/>
+                <w14:ligatures w14:val="standardContextual"/>
+              </w:rPr>
+              <w:tab/>
+            </w:r>
+            <w:r>
+              <w:rPr>
+                <w:rStyle w:val="Hyperlink"/>
+                <w:noProof/>
+              </w:rPr>
+              <w:t>Project Timeline</w:t>
+            </w:r>
+            <w:r>
+              <w:rPr>
+                <w:noProof/>
+                <w:webHidden/>
+              </w:rPr>
+              <w:tab/>
+            </w:r>
+            <w:r>
+              <w:rPr>
+                <w:noProof/>
+                <w:webHidden/>
+              </w:rPr>
+              <w:fldChar w:fldCharType="begin"/>
+            </w:r>
+            <w:r>
+              <w:rPr>
+                <w:noProof/>
+                <w:webHidden/>
+              </w:rPr>
+              <w:instrText xml:space="preserve"> PAGEREF _Toc243658844 \h </w:instrText>
+            </w:r>
+            <w:r>
+              <w:rPr>
+                <w:noProof/>
+                <w:webHidden/>
+              </w:rPr>
+            </w:r>
+            <w:r>
+              <w:rPr>
+                <w:noProof/>
+                <w:webHidden/>
+              </w:rPr>
+              <w:fldChar w:fldCharType="separate"/>
+            </w:r>
+            <w:r>
+              <w:rPr>
+                <w:noProof/>
+                <w:webHidden/>
+              </w:rPr>
+              <w:t>7</w:t>
+            </w:r>
+            <w:r>
+              <w:rPr>
+                <w:noProof/>
+                <w:webHidden/>
+              </w:rPr>
+              <w:fldChar w:fldCharType="end"/>
+            </w:r>
+          </w:hyperlink>
+        </w:p>
+        <w:p>
+          <w:pPr>
+            <w:pStyle w:val="TOC1"/>
+            <w:tabs>
+              <w:tab w:val="left" w:pos="480"/>
+            </w:tabs>
+            <w:rPr>
+              <w:rFonts w:asciiTheme="minorHAnsi" w:eastAsiaTheme="minorEastAsia" w:hAnsiTheme="minorHAnsi" w:cstheme="minorBidi"/>
+              <w:noProof/>
+              <w:kern w:val="2"/>
+              <w:lang w:val="en-GB" w:eastAsia="en-GB"/>
+              <w14:ligatures w14:val="standardContextual"/>
+            </w:rPr>
+          </w:pPr>
+          <w:hyperlink w:anchor="_Toc243658845" w:history="1">
+            <w:r>
+              <w:rPr>
+                <w:rStyle w:val="Hyperlink"/>
+                <w:noProof/>
+              </w:rPr>
+              <w:t>9.</w:t>
+            </w:r>
+            <w:r>
+              <w:rPr>
+                <w:rFonts w:asciiTheme="minorHAnsi" w:eastAsiaTheme="minorEastAsia" w:hAnsiTheme="minorHAnsi" w:cstheme="minorBidi"/>
+                <w:noProof/>
+                <w:kern w:val="2"/>
+                <w:lang w:val="en-GB" w:eastAsia="en-GB"/>
+                <w14:ligatures w14:val="standardContextual"/>
+              </w:rPr>
+              <w:tab/>
+            </w:r>
+            <w:r>
+              <w:rPr>
+                <w:rStyle w:val="Hyperlink"/>
+                <w:noProof/>
+              </w:rPr>
+              <w:t>Ethical and Legal Considerations</w:t>
+            </w:r>
+            <w:r>
+              <w:rPr>
+                <w:noProof/>
+                <w:webHidden/>
+              </w:rPr>
+              <w:tab/>
+            </w:r>
+            <w:r>
+              <w:rPr>
+                <w:noProof/>
+                <w:webHidden/>
+              </w:rPr>
+              <w:fldChar w:fldCharType="begin"/>
+            </w:r>
+            <w:r>
+              <w:rPr>
+                <w:noProof/>
+                <w:webHidden/>
+              </w:rPr>
+              <w:instrText xml:space="preserve"> PAGEREF _Toc243658845 \h </w:instrText>
+            </w:r>
+            <w:r>
+              <w:rPr>
+                <w:noProof/>
+                <w:webHidden/>
+              </w:rPr>
+            </w:r>
+            <w:r>
+              <w:rPr>
+                <w:noProof/>
+                <w:webHidden/>
+              </w:rPr>
+              <w:fldChar w:fldCharType="separate"/>
+            </w:r>
+            <w:r>
+              <w:rPr>
+                <w:noProof/>
+                <w:webHidden/>
+              </w:rPr>
+              <w:t>7</w:t>
             </w:r>
             <w:r>
               <w:rPr>
@@ -1658,13 +2122,13 @@
               <w14:ligatures w14:val="standardContextual"/>
             </w:rPr>
           </w:pPr>
-          <w:hyperlink w:anchor="_Toc242906218" w:history="1">
+          <w:hyperlink w:anchor="_Toc243658846" w:history="1">
             <w:r>
               <w:rPr>
                 <w:rStyle w:val="Hyperlink"/>
                 <w:noProof/>
               </w:rPr>
-              <w:t>Data Sources</w:t>
+              <w:t>References</w:t>
             </w:r>
             <w:r>
               <w:rPr>
@@ -1685,7 +2149,7 @@
                 <w:noProof/>
                 <w:webHidden/>
               </w:rPr>
-              <w:instrText xml:space="preserve"> PAGEREF _Toc242906218 \h </w:instrText>
+              <w:instrText xml:space="preserve"> PAGEREF _Toc243658846 \h </w:instrText>
             </w:r>
             <w:r>
               <w:rPr>
@@ -1705,7 +2169,7 @@
                 <w:noProof/>
                 <w:webHidden/>
               </w:rPr>
-              <w:t>6</w:t>
+              <w:t>9</w:t>
             </w:r>
             <w:r>
               <w:rPr>
@@ -1727,13 +2191,13 @@
               <w14:ligatures w14:val="standardContextual"/>
             </w:rPr>
           </w:pPr>
-          <w:hyperlink w:anchor="_Toc242906219" w:history="1">
+          <w:hyperlink w:anchor="_Toc243658847" w:history="1">
             <w:r>
               <w:rPr>
                 <w:rStyle w:val="Hyperlink"/>
                 <w:noProof/>
               </w:rPr>
-              <w:t>Expected Deliverables</w:t>
+              <w:t>Appendix</w:t>
             </w:r>
             <w:r>
               <w:rPr>
@@ -1754,7 +2218,7 @@
                 <w:noProof/>
                 <w:webHidden/>
               </w:rPr>
-              <w:instrText xml:space="preserve"> PAGEREF _Toc242906219 \h </w:instrText>
+              <w:instrText xml:space="preserve"> PAGEREF _Toc243658847 \h </w:instrText>
             </w:r>
             <w:r>
               <w:rPr>
@@ -1774,214 +2238,7 @@
                 <w:noProof/>
                 <w:webHidden/>
               </w:rPr>
-              <w:t>6</w:t>
-            </w:r>
-            <w:r>
-              <w:rPr>
-                <w:noProof/>
-                <w:webHidden/>
-              </w:rPr>
-              <w:fldChar w:fldCharType="end"/>
-            </w:r>
-          </w:hyperlink>
-        </w:p>
-        <w:p>
-          <w:pPr>
-            <w:pStyle w:val="TOC1"/>
-            <w:rPr>
-              <w:rFonts w:asciiTheme="minorHAnsi" w:eastAsiaTheme="minorEastAsia" w:hAnsiTheme="minorHAnsi" w:cstheme="minorBidi"/>
-              <w:noProof/>
-              <w:kern w:val="2"/>
-              <w:lang w:val="en-GB" w:eastAsia="en-GB"/>
-              <w14:ligatures w14:val="standardContextual"/>
-            </w:rPr>
-          </w:pPr>
-          <w:hyperlink w:anchor="_Toc242906220" w:history="1">
-            <w:r>
-              <w:rPr>
-                <w:rStyle w:val="Hyperlink"/>
-                <w:noProof/>
-              </w:rPr>
-              <w:t>Project Timeline</w:t>
-            </w:r>
-            <w:r>
-              <w:rPr>
-                <w:noProof/>
-                <w:webHidden/>
-              </w:rPr>
-              <w:tab/>
-            </w:r>
-            <w:r>
-              <w:rPr>
-                <w:noProof/>
-                <w:webHidden/>
-              </w:rPr>
-              <w:fldChar w:fldCharType="begin"/>
-            </w:r>
-            <w:r>
-              <w:rPr>
-                <w:noProof/>
-                <w:webHidden/>
-              </w:rPr>
-              <w:instrText xml:space="preserve"> PAGEREF _Toc242906220 \h </w:instrText>
-            </w:r>
-            <w:r>
-              <w:rPr>
-                <w:noProof/>
-                <w:webHidden/>
-              </w:rPr>
-            </w:r>
-            <w:r>
-              <w:rPr>
-                <w:noProof/>
-                <w:webHidden/>
-              </w:rPr>
-              <w:fldChar w:fldCharType="separate"/>
-            </w:r>
-            <w:r>
-              <w:rPr>
-                <w:noProof/>
-                <w:webHidden/>
-              </w:rPr>
-              <w:t>7</w:t>
-            </w:r>
-            <w:r>
-              <w:rPr>
-                <w:noProof/>
-                <w:webHidden/>
-              </w:rPr>
-              <w:fldChar w:fldCharType="end"/>
-            </w:r>
-          </w:hyperlink>
-        </w:p>
-        <w:p>
-          <w:pPr>
-            <w:pStyle w:val="TOC1"/>
-            <w:rPr>
-              <w:rFonts w:asciiTheme="minorHAnsi" w:eastAsiaTheme="minorEastAsia" w:hAnsiTheme="minorHAnsi" w:cstheme="minorBidi"/>
-              <w:noProof/>
-              <w:kern w:val="2"/>
-              <w:lang w:val="en-GB" w:eastAsia="en-GB"/>
-              <w14:ligatures w14:val="standardContextual"/>
-            </w:rPr>
-          </w:pPr>
-          <w:hyperlink w:anchor="_Toc242906221" w:history="1">
-            <w:r>
-              <w:rPr>
-                <w:rStyle w:val="Hyperlink"/>
-                <w:noProof/>
-              </w:rPr>
-              <w:t>References</w:t>
-            </w:r>
-            <w:r>
-              <w:rPr>
-                <w:noProof/>
-                <w:webHidden/>
-              </w:rPr>
-              <w:tab/>
-            </w:r>
-            <w:r>
-              <w:rPr>
-                <w:noProof/>
-                <w:webHidden/>
-              </w:rPr>
-              <w:fldChar w:fldCharType="begin"/>
-            </w:r>
-            <w:r>
-              <w:rPr>
-                <w:noProof/>
-                <w:webHidden/>
-              </w:rPr>
-              <w:instrText xml:space="preserve"> PAGEREF _Toc242906221 \h </w:instrText>
-            </w:r>
-            <w:r>
-              <w:rPr>
-                <w:noProof/>
-                <w:webHidden/>
-              </w:rPr>
-            </w:r>
-            <w:r>
-              <w:rPr>
-                <w:noProof/>
-                <w:webHidden/>
-              </w:rPr>
-              <w:fldChar w:fldCharType="separate"/>
-            </w:r>
-            <w:r>
-              <w:rPr>
-                <w:noProof/>
-                <w:webHidden/>
-              </w:rPr>
-              <w:t>8</w:t>
-            </w:r>
-            <w:r>
-              <w:rPr>
-                <w:noProof/>
-                <w:webHidden/>
-              </w:rPr>
-              <w:fldChar w:fldCharType="end"/>
-            </w:r>
-          </w:hyperlink>
-        </w:p>
-        <w:p>
-          <w:pPr>
-            <w:pStyle w:val="TOC1"/>
-            <w:rPr>
-              <w:rFonts w:asciiTheme="minorHAnsi" w:eastAsiaTheme="minorEastAsia" w:hAnsiTheme="minorHAnsi" w:cstheme="minorBidi"/>
-              <w:noProof/>
-              <w:kern w:val="2"/>
-              <w:lang w:val="en-GB" w:eastAsia="en-GB"/>
-              <w14:ligatures w14:val="standardContextual"/>
-            </w:rPr>
-          </w:pPr>
-          <w:hyperlink w:anchor="_Toc242906222" w:history="1">
-            <w:r>
-              <w:rPr>
-                <w:rStyle w:val="Hyperlink"/>
-                <w:noProof/>
-              </w:rPr>
-              <w:t>Appendix</w:t>
-            </w:r>
-            <w:r>
-              <w:rPr>
-                <w:noProof/>
-                <w:webHidden/>
-              </w:rPr>
-              <w:tab/>
-            </w:r>
-            <w:r>
-              <w:rPr>
-                <w:noProof/>
-                <w:webHidden/>
-              </w:rPr>
-              <w:fldChar w:fldCharType="begin"/>
-            </w:r>
-            <w:r>
-              <w:rPr>
-                <w:noProof/>
-                <w:webHidden/>
-              </w:rPr>
-              <w:instrText xml:space="preserve"> PAGEREF _Toc242906222 \h </w:instrText>
-            </w:r>
-            <w:r>
-              <w:rPr>
-                <w:noProof/>
-                <w:webHidden/>
-              </w:rPr>
-            </w:r>
-            <w:r>
-              <w:rPr>
-                <w:noProof/>
-                <w:webHidden/>
-              </w:rPr>
-              <w:fldChar w:fldCharType="separate"/>
-            </w:r>
-            <w:r>
-              <w:rPr>
-                <w:noProof/>
-                <w:webHidden/>
-              </w:rPr>
-              <w:t>9</w:t>
+              <w:t>10</w:t>
             </w:r>
             <w:r>
               <w:rPr>
@@ -2015,8 +2272,12 @@
     <w:p>
       <w:pPr>
         <w:pStyle w:val="Heading1"/>
-      </w:pPr>
-      <w:bookmarkStart w:id="1" w:name="_Toc242906210"/>
+        <w:numPr>
+          <w:ilvl w:val="0"/>
+          <w:numId w:val="11"/>
+        </w:numPr>
+      </w:pPr>
+      <w:bookmarkStart w:id="1" w:name="_Toc243658834"/>
       <w:r>
         <w:lastRenderedPageBreak/>
         <w:t>Introduction</w:t>
@@ -2025,7 +2286,22 @@
     </w:p>
     <w:p>
       <w:r>
-        <w:t>Flight delays can sometimes cause problems for airlines, airports and passengers. When flights depart later than scheduled, airlines may need to adjust their operations, which can affect other flights and make planning more difficult. For this reason, identifying flights that are more likely to be delayed could be useful for airlines, especially for operational planning.</w:t>
+        <w:t>For a person that already experienced a f</w:t>
+      </w:r>
+      <w:r>
+        <w:t xml:space="preserve">light </w:t>
+      </w:r>
+      <w:r>
+        <w:t xml:space="preserve">being delayed knows how dealing with it can be stressful. Also it </w:t>
+      </w:r>
+      <w:r>
+        <w:t>cause problems for airlines</w:t>
+      </w:r>
+      <w:r>
+        <w:t xml:space="preserve"> and </w:t>
+      </w:r>
+      <w:r>
+        <w:t>airports. When flights depart later than scheduled, airlines may need to adjust their operations, which can affect other flights and make planning more difficult. For this reason, identifying flights that are more likely to be delayed could be useful for airlines, especially for operational planning.</w:t>
       </w:r>
     </w:p>
     <w:p>
@@ -2039,20 +2315,42 @@
         <w:t xml:space="preserve">(Bts.gov, 2018) </w:t>
       </w:r>
       <w:r>
-        <w:t>and contains over 1.2 million flight records. Using this dataset, the project will investigate whether machine learning models can predict departure delays of 15 minutes or more based on information available before departure.</w:t>
-      </w:r>
-    </w:p>
-    <w:p>
-      <w:r>
-        <w:t>The goal is to compare different machine learning models and assess whether their predictions could help airlines identify flights at higher risk of delay.</w:t>
+        <w:t xml:space="preserve">and contains over 1.2 million flight records. Using this dataset, the project will investigate </w:t>
+      </w:r>
+      <w:r>
+        <w:t>if</w:t>
+      </w:r>
+      <w:r>
+        <w:t xml:space="preserve"> machine learning models can predict departure delays of 15 minutes or more based on information available before departure.</w:t>
+      </w:r>
+    </w:p>
+    <w:p>
+      <w:r>
+        <w:t xml:space="preserve">The goal is to compare different machine learning models and </w:t>
+      </w:r>
+      <w:r>
+        <w:t>evaluate</w:t>
+      </w:r>
+      <w:r>
+        <w:t xml:space="preserve"> </w:t>
+      </w:r>
+      <w:r>
+        <w:t>if</w:t>
+      </w:r>
+      <w:r>
+        <w:t xml:space="preserve"> their predictions could help airlines identify flights at higher risk of delay.</w:t>
       </w:r>
     </w:p>
     <w:p/>
     <w:p>
       <w:pPr>
         <w:pStyle w:val="Heading1"/>
-      </w:pPr>
-      <w:bookmarkStart w:id="2" w:name="_Toc242906211"/>
+        <w:numPr>
+          <w:ilvl w:val="0"/>
+          <w:numId w:val="11"/>
+        </w:numPr>
+      </w:pPr>
+      <w:bookmarkStart w:id="2" w:name="_Toc243658835"/>
       <w:r>
         <w:t>Problem Definition</w:t>
       </w:r>
@@ -2075,11 +2373,11 @@
     </w:p>
     <w:p>
       <w:r>
-        <w:t xml:space="preserve">By comparing different machine learning models, this project will investigate how accurately flight delays can be predicted. The results could help airlines identify flights that may need more attention before departure. It could help them organise their operations better and </w:t>
+        <w:t xml:space="preserve">By comparing different machine learning models, this project will investigate how accurately flight delays can be predicted. The results could help airlines identify flights that may need </w:t>
       </w:r>
       <w:r>
         <w:lastRenderedPageBreak/>
-        <w:t>prepare for possible problems. This may also help airlines maintain customer trust and protect their reputation, reducing the risk of losing customers and revenue.</w:t>
+        <w:t>more attention before departure. It could help them organise their operations better and prepare for possible problems. This may also help airlines maintain customer trust and protect their reputation, reducing the risk of losing customers and revenue.</w:t>
       </w:r>
     </w:p>
     <w:p>
@@ -2100,8 +2398,12 @@
     <w:p>
       <w:pPr>
         <w:pStyle w:val="Heading1"/>
-      </w:pPr>
-      <w:bookmarkStart w:id="3" w:name="_Toc242906212"/>
+        <w:numPr>
+          <w:ilvl w:val="0"/>
+          <w:numId w:val="11"/>
+        </w:numPr>
+      </w:pPr>
+      <w:bookmarkStart w:id="3" w:name="_Toc243658836"/>
       <w:r>
         <w:t>Aim and Objectives</w:t>
       </w:r>
@@ -2112,13 +2414,17 @@
         <w:pStyle w:val="Heading3"/>
         <w:rPr>
           <w:rFonts w:ascii="Times New Roman" w:eastAsia="Times New Roman" w:hAnsi="Times New Roman" w:cs="Times New Roman"/>
+          <w:b/>
+          <w:bCs/>
           <w:lang w:val="en-GB" w:eastAsia="en-GB"/>
         </w:rPr>
       </w:pPr>
-      <w:bookmarkStart w:id="4" w:name="_Toc242906213"/>
+      <w:bookmarkStart w:id="4" w:name="_Toc243658837"/>
       <w:r>
         <w:rPr>
           <w:rStyle w:val="Strong"/>
+          <w:b w:val="0"/>
+          <w:bCs w:val="0"/>
           <w:color w:val="156082" w:themeColor="accent1"/>
         </w:rPr>
         <w:t>Aim</w:t>
@@ -2133,11 +2439,17 @@
     <w:p>
       <w:pPr>
         <w:pStyle w:val="Heading3"/>
-      </w:pPr>
-      <w:bookmarkStart w:id="5" w:name="_Toc242906214"/>
+        <w:rPr>
+          <w:b/>
+          <w:bCs/>
+        </w:rPr>
+      </w:pPr>
+      <w:bookmarkStart w:id="5" w:name="_Toc243658838"/>
       <w:r>
         <w:rPr>
           <w:rStyle w:val="Strong"/>
+          <w:b w:val="0"/>
+          <w:bCs w:val="0"/>
           <w:color w:val="156082" w:themeColor="accent1"/>
         </w:rPr>
         <w:t>Objectives</w:t>
@@ -2212,9 +2524,13 @@
     <w:p>
       <w:pPr>
         <w:pStyle w:val="Heading1"/>
+        <w:numPr>
+          <w:ilvl w:val="0"/>
+          <w:numId w:val="11"/>
+        </w:numPr>
       </w:pPr>
       <w:bookmarkStart w:id="6" w:name="_Toc242631585"/>
-      <w:bookmarkStart w:id="7" w:name="_Toc242906215"/>
+      <w:bookmarkStart w:id="7" w:name="_Toc243658839"/>
       <w:r>
         <w:lastRenderedPageBreak/>
         <w:t>Scope</w:t>
@@ -2224,7 +2540,19 @@
     </w:p>
     <w:p>
       <w:r>
-        <w:t xml:space="preserve">For this project, we will use flight data from California airports between January and December 2024. We will look at flights departing from California, even if their destination is in another state. The data comes from the US Bureau of Transportation Statistics </w:t>
+        <w:t xml:space="preserve">For this project, </w:t>
+      </w:r>
+      <w:r>
+        <w:t>I</w:t>
+      </w:r>
+      <w:r>
+        <w:t xml:space="preserve"> will use flight data from California airports between January and December 2024. </w:t>
+      </w:r>
+      <w:r>
+        <w:t>I</w:t>
+      </w:r>
+      <w:r>
+        <w:t xml:space="preserve"> will look at flights departing from California, even if their destination is in another state. The data comes from the US Bureau of Transportation Statistics </w:t>
       </w:r>
       <w:r>
         <w:rPr>
@@ -2249,61 +2577,71 @@
     </w:p>
     <w:p>
       <w:r>
-        <w:t>We will not include cancelled flights when training the models, as these flights do not have an actual departure time. However, we will still check how many flights were cancelled during the year. We will also avoid using information that would only be known after the flight has departed, because the idea is to make predictions before departure.</w:t>
-      </w:r>
-    </w:p>
-    <w:p>
-      <w:r>
-        <w:t>There are also some things that this project will not cover. We will not try to predict exactly how many minutes a flight will be delayed or whether it will arrive late. We will not use live weather data or real-time flight information. Our results will only represent the flights included in the California dataset from 2024.</w:t>
+        <w:t>I</w:t>
+      </w:r>
+      <w:r>
+        <w:t xml:space="preserve"> will not include cancelled flights when training the models, as these flights do not have an actual departure time. However, </w:t>
+      </w:r>
+      <w:r>
+        <w:t>I</w:t>
+      </w:r>
+      <w:r>
+        <w:t xml:space="preserve"> will still check how many flights were cancelled during the year.</w:t>
+      </w:r>
+      <w:r>
+        <w:t xml:space="preserve"> I</w:t>
+      </w:r>
+      <w:r>
+        <w:t xml:space="preserve"> will also</w:t>
+      </w:r>
+      <w:r>
+        <w:t>,</w:t>
+      </w:r>
+      <w:r>
+        <w:t xml:space="preserve"> avoid using information that would only be known after the flight has departed, because the idea is to make predictions before departure.</w:t>
+      </w:r>
+    </w:p>
+    <w:p>
+      <w:r>
+        <w:t>There are also some things that this project will not cover</w:t>
+      </w:r>
+      <w:r>
+        <w:t>, I</w:t>
+      </w:r>
+      <w:r>
+        <w:t xml:space="preserve"> will not try to predict exactly how many minutes a flight will be delayed or whether it will arrive late. </w:t>
+      </w:r>
+      <w:r>
+        <w:t>I</w:t>
+      </w:r>
+      <w:r>
+        <w:t xml:space="preserve"> will not use live weather data or real-time flight information</w:t>
+      </w:r>
+      <w:r>
+        <w:t>, the</w:t>
+      </w:r>
+      <w:r>
+        <w:t xml:space="preserve"> results will only represent the flights included in the California dataset from 2024.</w:t>
       </w:r>
     </w:p>
     <w:p/>
     <w:p>
       <w:pPr>
         <w:pStyle w:val="Heading1"/>
+        <w:numPr>
+          <w:ilvl w:val="0"/>
+          <w:numId w:val="11"/>
+        </w:numPr>
         <w:rPr>
           <w:rFonts w:ascii="Times New Roman" w:eastAsia="Times New Roman" w:hAnsi="Times New Roman" w:cs="Times New Roman"/>
           <w:lang w:val="en-GB" w:eastAsia="en-GB"/>
         </w:rPr>
       </w:pPr>
-      <w:bookmarkStart w:id="8" w:name="_Toc242906216"/>
+      <w:bookmarkStart w:id="8" w:name="_Toc243658840"/>
       <w:r>
         <w:t>Methodology</w:t>
       </w:r>
       <w:bookmarkEnd w:id="8"/>
-    </w:p>
-    <w:p>
-      <w:r>
-        <w:t>I plan to use the CRISP-DM methodology to guide my project, as it covers the main stages of a data analytics project, including understanding the problem, preparing the data, building models and evaluating the results.</w:t>
-      </w:r>
-    </w:p>
-    <w:p>
-      <w:r>
-        <w:t xml:space="preserve">I have already downloaded the 12 monthly CSV files from the BTS website, with a total </w:t>
-      </w:r>
-      <w:r>
-        <w:t>over</w:t>
-      </w:r>
-      <w:r>
-        <w:t xml:space="preserve"> 1</w:t>
-      </w:r>
-      <w:r>
-        <w:t xml:space="preserve"> million</w:t>
-      </w:r>
-      <w:r>
-        <w:t xml:space="preserve"> records. I will use Python and Pandas to combine them into one dataset and check for missing values, duplicates and other possible problems. Cancelled flights will be excluded from the modelling data, as the aim is to predict whether a flight departs at least 15 minutes late.</w:t>
-      </w:r>
-    </w:p>
-    <w:p>
-      <w:r>
-        <w:lastRenderedPageBreak/>
-        <w:t>I also want to explore the data before training any models. For example, I would like to see whether some airports, airlines or times of the day have more delayed flights. I will use graphs to help understand these patterns and decide which variables could be useful for prediction.</w:t>
-      </w:r>
-    </w:p>
-    <w:p>
-      <w:r>
-        <w:t>For the machine learning part, I plan to compare Logistic Regression, Decision Tree and Random Forest to see which performs better. I will randomly divide the dataset into training and testing sets, keeping a similar proportion of delayed and non-delayed flights in both groups. I will only include information available before departure, because the aim is to predict a possible delay rather than explain one that has already happened.</w:t>
-      </w:r>
     </w:p>
     <w:p>
       <w:pPr>
@@ -2313,51 +2651,65 @@
         </w:rPr>
       </w:pPr>
       <w:r>
-        <w:t>I will also try different hyperparameter settings to see if I can improve the models' performance without overfitting.</w:t>
-      </w:r>
-    </w:p>
-    <w:p>
-      <w:r>
-        <w:t>I will compare the models against a simple baseline prediction and evaluate them using Precision, Recall, F1-score and a Confusion Matrix. I will also check whether the number of delayed and non-delayed flights is balanced, as this could affect the results. The final step will be to discuss which model performs best and whether its predictions could be useful for airline operational planning.</w:t>
+        <w:t>I plan to use the CRISP-DM methodology to guide my project, from understanding the problem and preparing the data to building and evaluating the models.</w:t>
+      </w:r>
+    </w:p>
+    <w:p>
+      <w:r>
+        <w:t>I have downloaded 12 monthly CSV files from the BTS website, containing over 1 million flight records. I will use Python and Pandas to combine and clean the data, checking for missing values, duplicates and other issues. Cancelled flights will be excluded, as the aim is to predict whether a flight departs at least 15 minutes late.</w:t>
+      </w:r>
+    </w:p>
+    <w:p>
+      <w:r>
+        <w:t>Before training the models, I will explore patterns in delays across airports, airlines and times of the day using graphs. This will also help me identify useful variables for prediction.</w:t>
+      </w:r>
+    </w:p>
+    <w:p>
+      <w:r>
+        <w:t xml:space="preserve">I plan to compare Logistic Regression, Decision Tree and Random Forest. The dataset will be randomly divided into training and testing sets, keeping a similar proportion of delayed and </w:t>
+      </w:r>
+      <w:r>
+        <w:lastRenderedPageBreak/>
+        <w:t>non-delayed flights in both. To avoid data leakage, I will only use information available before departure.</w:t>
+      </w:r>
+    </w:p>
+    <w:p>
+      <w:r>
+        <w:t>I will test different hyperparameter settings and compare the models with a simple baseline. Their performance will be evaluated using Precision, Recall, F1-score and Confusion Matrix, considering possible class imbalance. Finally, I will discuss which model performs best and how the results could support airline operational planning.</w:t>
       </w:r>
     </w:p>
     <w:p/>
     <w:p>
       <w:pPr>
         <w:pStyle w:val="Heading3"/>
-      </w:pPr>
-      <w:bookmarkStart w:id="9" w:name="_Toc242906217"/>
-      <w:r>
         <w:rPr>
           <w:rStyle w:val="Strong"/>
+          <w:b w:val="0"/>
+          <w:bCs w:val="0"/>
           <w:color w:val="156082" w:themeColor="accent1"/>
         </w:rPr>
-        <w:t>High-Level Architecture</w:t>
-      </w:r>
+      </w:pPr>
       <w:r>
         <w:rPr>
           <w:rStyle w:val="Strong"/>
+          <w:b w:val="0"/>
+          <w:bCs w:val="0"/>
           <w:color w:val="156082" w:themeColor="accent1"/>
         </w:rPr>
-        <w:t xml:space="preserve"> Diagram</w:t>
-      </w:r>
-      <w:bookmarkEnd w:id="9"/>
-    </w:p>
-    <w:p>
-      <w:r>
-        <w:t>The project will follow a workflow that starts with the BTS flight data and ends with the evaluation of the machine learning models. I will use Python to combine and clean the CSV files before exploring the data to understand the patterns in flight delays.</w:t>
-      </w:r>
-    </w:p>
-    <w:p>
-      <w:r>
-        <w:t>The dataset will then be divided into training and testing sets. The training data will be used to build the classification models, while the testing data will be used to check their performance. I will compare the models with a simple baseline and discuss whether the results could help airlines with their operational planning.</w:t>
-      </w:r>
-    </w:p>
-    <w:p>
-      <w:r>
-        <w:t>Figure 1 shows the proposed workflow and how the different stages are connected.</w:t>
-      </w:r>
-    </w:p>
+        <w:t>High-Level Architecture Diagram</w:t>
+      </w:r>
+    </w:p>
+    <w:p>
+      <w:r>
+        <w:t>The project workflow starts with the BTS flight data, followed by data cleaning, exploration and preparation in Python. The data will then be divided into training and testing sets to build and evaluate the classification models.</w:t>
+      </w:r>
+    </w:p>
+    <w:p>
+      <w:r>
+        <w:t>Figure 1 shows the proposed workflow, from data collection to model evaluation and comparison.</w:t>
+      </w:r>
+    </w:p>
+    <w:p/>
     <w:p>
       <w:pPr>
         <w:keepNext/>
@@ -2531,17 +2883,21 @@
     <w:p>
       <w:pPr>
         <w:pStyle w:val="Heading1"/>
+        <w:numPr>
+          <w:ilvl w:val="0"/>
+          <w:numId w:val="11"/>
+        </w:numPr>
         <w:rPr>
           <w:rFonts w:ascii="Times New Roman" w:eastAsia="Times New Roman" w:hAnsi="Times New Roman" w:cs="Times New Roman"/>
           <w:lang w:val="en-GB" w:eastAsia="en-GB"/>
         </w:rPr>
       </w:pPr>
-      <w:bookmarkStart w:id="10" w:name="_Toc242906218"/>
+      <w:bookmarkStart w:id="9" w:name="_Toc243658842"/>
       <w:r>
         <w:lastRenderedPageBreak/>
         <w:t>Data Sources</w:t>
       </w:r>
-      <w:bookmarkEnd w:id="10"/>
+      <w:bookmarkEnd w:id="9"/>
     </w:p>
     <w:p>
       <w:r>
@@ -2570,28 +2926,44 @@
         <w:t xml:space="preserve"> the column</w:t>
       </w:r>
       <w:r>
-        <w:t xml:space="preserve"> DEP_DEL15, which indicates whether a flight departed 15 minutes or more after its scheduled time. These variables are relevant because they allow me to investigate whether information available before departure can help predict flight delays.</w:t>
-      </w:r>
-    </w:p>
-    <w:p>
-      <w:r>
-        <w:t>The data is available through BTS, an official US government source. I will document the source, access date and applicable conditions for using the dataset in my final report. The dataset contains flight-level operational records rather than individual passenger information, and I will keep the original files separately from the cleaned data.</w:t>
+        <w:t xml:space="preserve"> DEP_DEL15, which indicates whether a flight departed 15 minutes or more after its scheduled time. These variables are relevant because they allow me to investigate </w:t>
+      </w:r>
+      <w:r>
+        <w:t>if the</w:t>
+      </w:r>
+      <w:r>
+        <w:t xml:space="preserve"> information available before departure can help predict flight delays.</w:t>
+      </w:r>
+    </w:p>
+    <w:p>
+      <w:r>
+        <w:t xml:space="preserve">The data is available through BTS, an official US government source. I will document the source, access date and applicable conditions for using the dataset in my final report. The dataset contains flight-level operational records </w:t>
+      </w:r>
+      <w:r>
+        <w:t>only, no</w:t>
+      </w:r>
+      <w:r>
+        <w:t xml:space="preserve"> individual passenger information, and I will keep the original files separately from the cleaned data.</w:t>
       </w:r>
     </w:p>
     <w:p/>
     <w:p>
       <w:pPr>
         <w:pStyle w:val="Heading1"/>
+        <w:numPr>
+          <w:ilvl w:val="0"/>
+          <w:numId w:val="11"/>
+        </w:numPr>
         <w:rPr>
           <w:rFonts w:ascii="Times New Roman" w:eastAsia="Times New Roman" w:hAnsi="Times New Roman" w:cs="Times New Roman"/>
           <w:lang w:val="en-GB" w:eastAsia="en-GB"/>
         </w:rPr>
       </w:pPr>
-      <w:bookmarkStart w:id="11" w:name="_Toc242906219"/>
+      <w:bookmarkStart w:id="10" w:name="_Toc243658843"/>
       <w:r>
         <w:t>Expected Deliverables</w:t>
       </w:r>
-      <w:bookmarkEnd w:id="11"/>
+      <w:bookmarkEnd w:id="10"/>
     </w:p>
     <w:p>
       <w:pPr>
@@ -2617,19 +2989,29 @@
     </w:p>
     <w:p>
       <w:r>
-        <w:t>The project code, notebooks and documentation will be available in my GitHub repository described in the cover page.</w:t>
+        <w:t xml:space="preserve">The project code, notebooks and documentation will be available in my GitHub repository described </w:t>
+      </w:r>
+      <w:r>
+        <w:t>o</w:t>
+      </w:r>
+      <w:r>
+        <w:t>n the cover page.</w:t>
       </w:r>
     </w:p>
     <w:p/>
     <w:p>
       <w:pPr>
         <w:pStyle w:val="Heading1"/>
-      </w:pPr>
-      <w:bookmarkStart w:id="12" w:name="_Toc242906220"/>
+        <w:numPr>
+          <w:ilvl w:val="0"/>
+          <w:numId w:val="11"/>
+        </w:numPr>
+      </w:pPr>
+      <w:bookmarkStart w:id="11" w:name="_Toc243658844"/>
       <w:r>
         <w:t>Project Timeline</w:t>
       </w:r>
-      <w:bookmarkEnd w:id="12"/>
+      <w:bookmarkEnd w:id="11"/>
     </w:p>
     <w:p>
       <w:pPr>
@@ -2662,6 +3044,9 @@
         <w:keepNext/>
       </w:pPr>
       <w:r>
+        <w:rPr>
+          <w:noProof/>
+        </w:rPr>
         <w:drawing>
           <wp:inline distT="0" distB="0" distL="0" distR="0" wp14:anchorId="47D36DB3" wp14:editId="7E14FD0D">
             <wp:extent cx="6164580" cy="2605570"/>
@@ -2740,18 +3125,110 @@
     </w:p>
     <w:p>
       <w:pPr>
+        <w:pStyle w:val="Heading1"/>
+        <w:numPr>
+          <w:ilvl w:val="0"/>
+          <w:numId w:val="11"/>
+        </w:numPr>
+      </w:pPr>
+      <w:bookmarkStart w:id="12" w:name="_Toc243658845"/>
+      <w:r>
+        <w:t>Ethical and Legal Considerations</w:t>
+      </w:r>
+      <w:bookmarkEnd w:id="12"/>
+    </w:p>
+    <w:p>
+      <w:pPr>
         <w:pStyle w:val="Caption"/>
         <w:jc w:val="center"/>
+      </w:pPr>
+    </w:p>
+    <w:p>
+      <w:pPr>
+        <w:rPr>
+          <w:rFonts w:ascii="Times New Roman" w:eastAsia="Times New Roman" w:hAnsi="Times New Roman" w:cs="Times New Roman"/>
+          <w:lang w:val="en-GB" w:eastAsia="en-GB"/>
+        </w:rPr>
+      </w:pPr>
+      <w:r>
+        <w:t xml:space="preserve">This project uses publicly available flight data from the US Bureau of Transportation Statistics (BTS), including flight dates, airports, airlines and scheduled departure times. Although the </w:t>
+      </w:r>
+      <w:r>
+        <w:lastRenderedPageBreak/>
+        <w:t>data comes from the United States and the project is being developed in Ireland, the selected dataset does not contain personal data. Therefore, GDPR is not expected to apply directly to this analysis. I will check the BTS data reuse conditions and reference the original source.</w:t>
+      </w:r>
+    </w:p>
+    <w:p>
+      <w:r>
+        <w:t>I will also consider the EU AI Act and the importance of using machine learning responsibly. The predictions may not always be accurate, so I will explain the models' limitations and evaluate their performance carefully. As the dataset covers flights departing from California, the findings may not apply to European airports or other regions.</w:t>
+      </w:r>
+    </w:p>
+    <w:p>
+      <w:r>
+        <w:t>Another important consideration is data leakage. I will only use information available before departure to predict flight delays. Data preprocessing and model tuning will be carried out using the training data, keeping the test set separate for the final evaluation. This will help avoid misleading results.</w:t>
+      </w:r>
+    </w:p>
+    <w:p>
+      <w:r>
+        <w:t xml:space="preserve">I will store the project files securely, report the models' limitations and any differences in performance across airlines and airports, and complete the required CCT ethics form, which will be submitted separately as a signed </w:t>
+      </w:r>
+      <w:r>
+        <w:t>file</w:t>
+      </w:r>
+      <w:r>
+        <w:t>.</w:t>
+      </w:r>
+    </w:p>
+    <w:p/>
+    <w:p>
+      <w:pPr>
+        <w:pStyle w:val="Heading1"/>
       </w:pPr>
     </w:p>
     <w:p/>
     <w:p/>
     <w:p/>
+    <w:p/>
+    <w:p/>
+    <w:p/>
+    <w:p/>
+    <w:p>
+      <w:pPr>
+        <w:rPr>
+          <w:u w:val="single"/>
+        </w:rPr>
+      </w:pPr>
+      <w:r>
+        <w:rPr>
+          <w:u w:val="single"/>
+        </w:rPr>
+        <w:t>Word Count : 16</w:t>
+      </w:r>
+      <w:r>
+        <w:rPr>
+          <w:u w:val="single"/>
+        </w:rPr>
+        <w:t>43</w:t>
+      </w:r>
+    </w:p>
+    <w:p>
+      <w:pPr>
+        <w:rPr>
+          <w:u w:val="single"/>
+        </w:rPr>
+      </w:pPr>
+      <w:r>
+        <w:rPr>
+          <w:u w:val="single"/>
+        </w:rPr>
+        <w:t>Word count required: 1500 +/- 10% (maximum = 1650)</w:t>
+      </w:r>
+    </w:p>
     <w:p>
       <w:pPr>
         <w:pStyle w:val="Heading1"/>
       </w:pPr>
-      <w:bookmarkStart w:id="13" w:name="_Toc242906221"/>
+      <w:bookmarkStart w:id="13" w:name="_Toc243658846"/>
       <w:r>
         <w:lastRenderedPageBreak/>
         <w:t>References</w:t>
@@ -2822,8 +3299,7 @@
     <w:p>
       <w:pPr>
         <w:rPr>
-          <w:rFonts w:eastAsia="Times New Roman"/>
-          <w:lang w:val="en-GB" w:eastAsia="en-GB"/>
+          <w:color w:val="000000"/>
         </w:rPr>
       </w:pPr>
       <w:r>
@@ -2955,7 +3431,13 @@
         <w:rPr>
           <w:color w:val="000000"/>
         </w:rPr>
-        <w:t>(Accessed:</w:t>
+        <w:t>[</w:t>
+      </w:r>
+      <w:r>
+        <w:rPr>
+          <w:color w:val="000000"/>
+        </w:rPr>
+        <w:t>Accessed:</w:t>
       </w:r>
       <w:r>
         <w:rPr>
@@ -2994,8 +3476,110 @@
         <w:rPr>
           <w:color w:val="000000"/>
         </w:rPr>
-        <w:t>2026).</w:t>
-      </w:r>
+        <w:t>2026</w:t>
+      </w:r>
+      <w:r>
+        <w:rPr>
+          <w:color w:val="000000"/>
+        </w:rPr>
+        <w:t>]</w:t>
+      </w:r>
+      <w:r>
+        <w:rPr>
+          <w:color w:val="000000"/>
+        </w:rPr>
+        <w:t>.</w:t>
+      </w:r>
+    </w:p>
+    <w:p>
+      <w:pPr>
+        <w:pStyle w:val="NormalWeb"/>
+        <w:spacing w:before="0" w:beforeAutospacing="0" w:after="240" w:afterAutospacing="0" w:line="360" w:lineRule="atLeast"/>
+        <w:rPr>
+          <w:rFonts w:ascii="Calibri" w:hAnsi="Calibri" w:cs="Calibri"/>
+          <w:color w:val="000000"/>
+        </w:rPr>
+      </w:pPr>
+      <w:r>
+        <w:rPr>
+          <w:rFonts w:ascii="Calibri" w:hAnsi="Calibri" w:cs="Calibri"/>
+          <w:color w:val="000000"/>
+        </w:rPr>
+        <w:t>Europa.eu. (2016).</w:t>
+      </w:r>
+      <w:r>
+        <w:rPr>
+          <w:rStyle w:val="apple-converted-space"/>
+          <w:rFonts w:ascii="Calibri" w:hAnsi="Calibri" w:cs="Calibri"/>
+          <w:color w:val="000000"/>
+        </w:rPr>
+        <w:t> </w:t>
+      </w:r>
+      <w:r>
+        <w:rPr>
+          <w:rFonts w:ascii="Calibri" w:hAnsi="Calibri" w:cs="Calibri"/>
+          <w:i/>
+          <w:iCs/>
+          <w:color w:val="000000"/>
+        </w:rPr>
+        <w:t>Regulation - 2016/679 - EN - GDPR - EUR-Lex</w:t>
+      </w:r>
+      <w:r>
+        <w:rPr>
+          <w:rFonts w:ascii="Calibri" w:hAnsi="Calibri" w:cs="Calibri"/>
+          <w:color w:val="000000"/>
+        </w:rPr>
+        <w:t>. [online] Available at: https://eur-lex.europa.eu/eli/reg/2016/679/oj/eng/ [Accessed 19 Oct. 2026].</w:t>
+      </w:r>
+    </w:p>
+    <w:p>
+      <w:pPr>
+        <w:pStyle w:val="NormalWeb"/>
+        <w:spacing w:before="0" w:beforeAutospacing="0" w:after="240" w:afterAutospacing="0" w:line="360" w:lineRule="atLeast"/>
+        <w:rPr>
+          <w:rFonts w:ascii="Calibri" w:hAnsi="Calibri" w:cs="Calibri"/>
+          <w:color w:val="000000"/>
+        </w:rPr>
+      </w:pPr>
+      <w:r>
+        <w:rPr>
+          <w:rFonts w:ascii="Calibri" w:hAnsi="Calibri" w:cs="Calibri"/>
+          <w:color w:val="000000"/>
+        </w:rPr>
+        <w:t>European Union (2024).</w:t>
+      </w:r>
+      <w:r>
+        <w:rPr>
+          <w:rStyle w:val="apple-converted-space"/>
+          <w:rFonts w:ascii="Calibri" w:hAnsi="Calibri" w:cs="Calibri"/>
+          <w:color w:val="000000"/>
+        </w:rPr>
+        <w:t> </w:t>
+      </w:r>
+      <w:r>
+        <w:rPr>
+          <w:rFonts w:ascii="Calibri" w:hAnsi="Calibri" w:cs="Calibri"/>
+          <w:i/>
+          <w:iCs/>
+          <w:color w:val="000000"/>
+        </w:rPr>
+        <w:t>Regulation - EU - 2024/1689 - EN - EUR-Lex</w:t>
+      </w:r>
+      <w:r>
+        <w:rPr>
+          <w:rFonts w:ascii="Calibri" w:hAnsi="Calibri" w:cs="Calibri"/>
+          <w:color w:val="000000"/>
+        </w:rPr>
+        <w:t>. [online] Europa.eu. Available at: https://eur-lex.europa.eu/eli/reg/2024/1689/oj/eng [Accessed 19 Oct. 2026].</w:t>
+      </w:r>
+    </w:p>
+    <w:p>
+      <w:pPr>
+        <w:rPr>
+          <w:rFonts w:eastAsia="Times New Roman"/>
+          <w:lang w:val="en-GB" w:eastAsia="en-GB"/>
+        </w:rPr>
+      </w:pPr>
     </w:p>
     <w:p>
       <w:pPr>
@@ -3019,17 +3603,12 @@
     <w:p/>
     <w:p/>
     <w:p/>
-    <w:p/>
-    <w:p/>
-    <w:p/>
-    <w:p/>
-    <w:p/>
     <w:p>
       <w:pPr>
         <w:pStyle w:val="Heading1"/>
       </w:pPr>
       <w:bookmarkStart w:id="14" w:name="_heading=h.kfkjs3rwl2c1" w:colFirst="0" w:colLast="0"/>
-      <w:bookmarkStart w:id="15" w:name="_Toc242906222"/>
+      <w:bookmarkStart w:id="15" w:name="_Toc243658847"/>
       <w:bookmarkEnd w:id="14"/>
       <w:r>
         <w:lastRenderedPageBreak/>
@@ -4192,6 +4771,92 @@
     </w:lvl>
   </w:abstractNum>
   <w:abstractNum w:abstractNumId="9" w15:restartNumberingAfterBreak="0">
+    <w:nsid w:val="71494A12"/>
+    <w:multiLevelType w:val="hybridMultilevel"/>
+    <w:tmpl w:val="8FD216D6"/>
+    <w:lvl w:ilvl="0" w:tplc="0809000F">
+      <w:start w:val="1"/>
+      <w:numFmt w:val="decimal"/>
+      <w:lvlText w:val="%1."/>
+      <w:lvlJc w:val="left"/>
+      <w:pPr>
+        <w:ind w:left="720" w:hanging="360"/>
+      </w:pPr>
+    </w:lvl>
+    <w:lvl w:ilvl="1" w:tplc="08090019" w:tentative="1">
+      <w:start w:val="1"/>
+      <w:numFmt w:val="lowerLetter"/>
+      <w:lvlText w:val="%2."/>
+      <w:lvlJc w:val="left"/>
+      <w:pPr>
+        <w:ind w:left="1440" w:hanging="360"/>
+      </w:pPr>
+    </w:lvl>
+    <w:lvl w:ilvl="2" w:tplc="0809001B" w:tentative="1">
+      <w:start w:val="1"/>
+      <w:numFmt w:val="lowerRoman"/>
+      <w:lvlText w:val="%3."/>
+      <w:lvlJc w:val="right"/>
+      <w:pPr>
+        <w:ind w:left="2160" w:hanging="180"/>
+      </w:pPr>
+    </w:lvl>
+    <w:lvl w:ilvl="3" w:tplc="0809000F" w:tentative="1">
+      <w:start w:val="1"/>
+      <w:numFmt w:val="decimal"/>
+      <w:lvlText w:val="%4."/>
+      <w:lvlJc w:val="left"/>
+      <w:pPr>
+        <w:ind w:left="2880" w:hanging="360"/>
+      </w:pPr>
+    </w:lvl>
+    <w:lvl w:ilvl="4" w:tplc="08090019" w:tentative="1">
+      <w:start w:val="1"/>
+      <w:numFmt w:val="lowerLetter"/>
+      <w:lvlText w:val="%5."/>
+      <w:lvlJc w:val="left"/>
+      <w:pPr>
+        <w:ind w:left="3600" w:hanging="360"/>
+      </w:pPr>
+    </w:lvl>
+    <w:lvl w:ilvl="5" w:tplc="0809001B" w:tentative="1">
+      <w:start w:val="1"/>
+      <w:numFmt w:val="lowerRoman"/>
+      <w:lvlText w:val="%6."/>
+      <w:lvlJc w:val="right"/>
+      <w:pPr>
+        <w:ind w:left="4320" w:hanging="180"/>
+      </w:pPr>
+    </w:lvl>
+    <w:lvl w:ilvl="6" w:tplc="0809000F" w:tentative="1">
+      <w:start w:val="1"/>
+      <w:numFmt w:val="decimal"/>
+      <w:lvlText w:val="%7."/>
+      <w:lvlJc w:val="left"/>
+      <w:pPr>
+        <w:ind w:left="5040" w:hanging="360"/>
+      </w:pPr>
+    </w:lvl>
+    <w:lvl w:ilvl="7" w:tplc="08090019" w:tentative="1">
+      <w:start w:val="1"/>
+      <w:numFmt w:val="lowerLetter"/>
+      <w:lvlText w:val="%8."/>
+      <w:lvlJc w:val="left"/>
+      <w:pPr>
+        <w:ind w:left="5760" w:hanging="360"/>
+      </w:pPr>
+    </w:lvl>
+    <w:lvl w:ilvl="8" w:tplc="0809001B" w:tentative="1">
+      <w:start w:val="1"/>
+      <w:numFmt w:val="lowerRoman"/>
+      <w:lvlText w:val="%9."/>
+      <w:lvlJc w:val="right"/>
+      <w:pPr>
+        <w:ind w:left="6480" w:hanging="180"/>
+      </w:pPr>
+    </w:lvl>
+  </w:abstractNum>
+  <w:abstractNum w:abstractNumId="10" w15:restartNumberingAfterBreak="0">
     <w:nsid w:val="7A490A53"/>
     <w:multiLevelType w:val="multilevel"/>
     <w:tmpl w:val="9EA23756"/>
@@ -4353,7 +5018,7 @@
     <w:abstractNumId w:val="1"/>
   </w:num>
   <w:num w:numId="5" w16cid:durableId="716047706">
-    <w:abstractNumId w:val="9"/>
+    <w:abstractNumId w:val="10"/>
   </w:num>
   <w:num w:numId="6" w16cid:durableId="720325003">
     <w:abstractNumId w:val="4"/>
@@ -4369,6 +5034,9 @@
   </w:num>
   <w:num w:numId="10" w16cid:durableId="227885826">
     <w:abstractNumId w:val="6"/>
+  </w:num>
+  <w:num w:numId="11" w16cid:durableId="1209995237">
+    <w:abstractNumId w:val="9"/>
   </w:num>
 </w:numbering>
 </file>
@@ -4800,7 +5468,7 @@
     <w:link w:val="Heading1Char"/>
     <w:uiPriority w:val="9"/>
     <w:qFormat/>
-    <w:rsid w:val="00E970D4"/>
+    <w:rsid w:val="00872558"/>
     <w:pPr>
       <w:keepNext/>
       <w:keepLines/>
@@ -4808,7 +5476,7 @@
       <w:outlineLvl w:val="0"/>
     </w:pPr>
     <w:rPr>
-      <w:rFonts w:asciiTheme="majorHAnsi" w:eastAsiaTheme="majorEastAsia" w:hAnsiTheme="majorHAnsi" w:cstheme="majorBidi"/>
+      <w:rFonts w:eastAsiaTheme="majorEastAsia"/>
       <w:b/>
       <w:bCs/>
       <w:color w:val="0F4761" w:themeColor="accent1" w:themeShade="BF"/>
@@ -5024,9 +5692,9 @@
     <w:basedOn w:val="DefaultParagraphFont"/>
     <w:link w:val="Heading1"/>
     <w:uiPriority w:val="9"/>
-    <w:rsid w:val="00E970D4"/>
+    <w:rsid w:val="00872558"/>
     <w:rPr>
-      <w:rFonts w:asciiTheme="majorHAnsi" w:eastAsiaTheme="majorEastAsia" w:hAnsiTheme="majorHAnsi" w:cstheme="majorBidi"/>
+      <w:rFonts w:ascii="Calibri" w:eastAsiaTheme="majorEastAsia" w:hAnsi="Calibri" w:cs="Calibri"/>
       <w:b/>
       <w:bCs/>
       <w:color w:val="0F4761" w:themeColor="accent1" w:themeShade="BF"/>

</xml_diff>